<commit_message>
Resolve R1-5 and R2-4/R2-5, retitle manuscript, expand BN methods citations
Restructure the belief-systems literature review to interleave hierarchical
and network perspectives (R1-5), move the pairwise centrality difference
tests into the main results discussion and soften "most central" language
throughout to match (R2-4/R2-5), and mark R1-6/R2-3 as user-confirmed.
Retitle the manuscript per the user's edit and add supporting citations for
the Bayesian-network methods paragraph, retargeted to the canonical Zotero
entries after resolving a duplicate-item mixup. Update the response letter
and log to match, and refresh the rendered HTML/PDF/DOCX outputs.

Co-Authored-By: Claude Sonnet 5 <noreply@anthropic.com>
</commit_message>
<xml_diff>
--- a/manuscript/_output/climate-beliefs.docx
+++ b/manuscript/_output/climate-beliefs.docx
@@ -7,7 +7,7 @@
         <w:pStyle w:val="Title"/>
       </w:pPr>
       <w:r>
-        <w:t xml:space="preserve">The Centrality of Cultural Worldviews in the Climate Change Belief System Network</w:t>
+        <w:t xml:space="preserve">What Beliefs are Central in the Climate Change Belief System Network?</w:t>
       </w:r>
     </w:p>
     <w:bookmarkStart w:id="9" w:name="introduction"/>
@@ -97,7 +97,16 @@
         <w:t xml:space="preserve"> </w:t>
       </w:r>
       <w:r>
-        <w:t xml:space="preserve">(e.g., support for a carbon tax). A second way of understanding belief systems is that of a network of connected beliefs</w:t>
+        <w:t xml:space="preserve">(e.g., support for a carbon tax)</w:t>
+      </w:r>
+      <w:r>
+        <w:t xml:space="preserve"> </w:t>
+      </w:r>
+      <w:r>
+        <w:t xml:space="preserve">(Sabatier and Jenkins-Smith 1993)</w:t>
+      </w:r>
+      <w:r>
+        <w:t xml:space="preserve">. A second way of understanding belief systems is that of a network of connected beliefs</w:t>
       </w:r>
       <w:r>
         <w:t xml:space="preserve"> </w:t>
@@ -132,7 +141,7 @@
         <w:t xml:space="preserve">edges</w:t>
       </w:r>
       <w:r>
-        <w:t xml:space="preserve">, which are the connections, or relationships, between beliefs. Belief system networks can be analyzed using centrality measures to understand the importance and influence of the various beliefs (i.e., nodes).</w:t>
+        <w:t xml:space="preserve">, which are the connections, or relationships, between beliefs. Belief system networks can be analyzed using centrality measures to understand the importance of the various beliefs (i.e., nodes).</w:t>
       </w:r>
     </w:p>
     <w:p>
@@ -184,7 +193,7 @@
         <w:t xml:space="preserve"> </w:t>
       </w:r>
       <w:r>
-        <w:t xml:space="preserve">(Van Der Linden 2021)</w:t>
+        <w:t xml:space="preserve">(e.g., Van Der Linden 2021)</w:t>
       </w:r>
       <w:r>
         <w:t xml:space="preserve">.</w:t>
@@ -195,7 +204,7 @@
         <w:pStyle w:val="BodyText"/>
       </w:pPr>
       <w:r>
-        <w:t xml:space="preserve">Rather than adjudicating between competing hypotheses about which single type of belief – deep core, policy core, or secondary – should be most central, this paper takes an exploratory approach to mapping the structure of the climate change belief network. Prior theoretical traditions offer distinct expectations about where structural importance should concentrate. Hierarchical accounts point to deep core beliefs such as cultural worldviews and political identity. The gateway belief model points instead to perceived scientific consensus, and solution-aversion accounts point to policy preferences. I use these three traditions as theoretical anchors for interpreting which beliefs occupy structurally important positions in the network, rather than as mutually exclusive predictions to be confirmed or disconfirmed. This approach is likely better suited to revealing how different kinds of beliefs are organized relative to one another.</w:t>
+        <w:t xml:space="preserve">Rather than testing competing hypotheses about which type of belief – deep core, policy core, or secondary – is most central, this paper takes an exploratory approach to mapping the structure of the climate change belief network. Prior research offers some expectations about which beliefs may take on structural importance. Hierarchical accounts point to deep core beliefs such as cultural worldviews and political identity. The gateway belief model points instead to perceived scientific consensus, and solution-aversion accounts point to policy preferences. I use these three findings as theoretical anchors for interpreting which beliefs occupy structurally important positions in the network, rather than as mutually exclusive predictions to be tested. This allows the analysis to show how different kinds of beliefs are organized relative to one another.</w:t>
       </w:r>
     </w:p>
     <w:p>
@@ -203,11 +212,23 @@
         <w:pStyle w:val="BodyText"/>
       </w:pPr>
       <w:r>
-        <w:t xml:space="preserve">Using common measures of network centrality, including strength, closeness, and betweenness, I find that cultural worldviews, specifically egalitarianism (a deep core belief), support for EPA regulations (a secondary belief), and perceptions of climate change risk (a policy core belief) are the most central beliefs in the network. However, the centrality of beliefs varied across the different centrality measures, indicating that different types of beliefs serve different functions within a belief system network. For example, egalitarianism had the highest betweenness and closeness centrality among all respondents, indicating that it served as a bridge connecting other beliefs in the network. Yet, support for EPA regulations, a policy preference, had the highest strength centrality, meaning that it had the strongest connections (i.e., highest partial corrections with other nodes) in the network.</w:t>
+        <w:t xml:space="preserve">Using common measures of network centrality, including strength, closeness, and betweenness, I find that cultural worldviews, specifically egalitarianism (a deep core belief), support for EPA regulations (a secondary belief), and perceptions of climate change risk (a policy core belief) have the highest point estimates for centrality in the network, though pairwise comparisons show these ranks are not always statistically distinguishable from several other beliefs. The centrality of beliefs also varied across the different centrality measures, indicating that different types of beliefs serve different functions within a belief system network. For example, egalitarianism had the highest betweenness and closeness centrality among all respondents, indicating that it served as a bridge connecting other beliefs in the network. Yet, support for EPA regulations, a policy preference, had the highest strength centrality, meaning that it had the strongest connections (i.e., highest partial correlations with other nodes) in the network. A companion Bayesian network, which estimates a directed structure over the same beliefs, complicates this picture: egalitarianism does not occupy an upstream,</w:t>
+      </w:r>
+      <w:r>
+        <w:t xml:space="preserve"> </w:t>
+      </w:r>
+      <w:r>
+        <w:t xml:space="preserve">“parent”</w:t>
+      </w:r>
+      <w:r>
+        <w:t xml:space="preserve"> </w:t>
+      </w:r>
+      <w:r>
+        <w:t xml:space="preserve">position in the directed network, whereas support for an international climate agreement – a secondary/policy belief – has the highest out-degree of any node, and individualism and perceived climate risk rank highly by both approaches. Whether beliefs are better understood as organized hierarchically or as a network therefore appears to depend on the specific belief and on the choice between an undirected and a directed model.</w:t>
       </w:r>
     </w:p>
     <w:bookmarkEnd w:id="9"/>
-    <w:bookmarkStart w:id="11" w:name="Xe66ed05cf6e134c4051ddab198561da35b522a7"/>
+    <w:bookmarkStart w:id="10" w:name="Xe66ed05cf6e134c4051ddab198561da35b522a7"/>
     <w:p>
       <w:pPr>
         <w:pStyle w:val="Heading1"/>
@@ -289,7 +310,7 @@
         <w:pStyle w:val="BodyText"/>
       </w:pPr>
       <w:r>
-        <w:t xml:space="preserve">An early approach to understanding belief systems posited that belief systems have a hierarchical structure where higher-order beliefs, which are abstract beliefs and values, connect to and constrain lower-order beliefs about specific issues</w:t>
+        <w:t xml:space="preserve">Two traditions have developed to characterize how these connections are structured and how a belief’s importance, or centrality, should be understood. The first holds that belief systems have a hierarchical structure, where higher-order beliefs, which are abstract beliefs and values, connect to and constrain lower-order beliefs about specific issues</w:t>
       </w:r>
       <w:r>
         <w:t xml:space="preserve"> </w:t>
@@ -307,7 +328,16 @@
         <w:t xml:space="preserve">(Nohrstedt et al. 2023; Sabatier and Jenkins-Smith 1993)</w:t>
       </w:r>
       <w:r>
-        <w:t xml:space="preserve">. Using ACF terminology, beliefs at the top of the hierarchy are known as deep core beliefs and can include political ideology, cultural worldviews, and environmental values, among others.</w:t>
+        <w:t xml:space="preserve">. Using ACF terminology, beliefs at the top of the hierarchy are known as deep core beliefs and can include political ideology, cultural worldviews, and environmental values, among others. The second tradition instead holds that belief systems are networks of interconnected beliefs, in which a belief’s importance is a function of its structural position among its horizontal connections to other beliefs rather than its place in a hierarchy</w:t>
+      </w:r>
+      <w:r>
+        <w:t xml:space="preserve"> </w:t>
+      </w:r>
+      <w:r>
+        <w:t xml:space="preserve">(Boutyline and Vaisey 2017; Brandt, Sibley, and Osborne 2019; Brandt and Sleegers 2021)</w:t>
+      </w:r>
+      <w:r>
+        <w:t xml:space="preserve">. The two traditions largely agree on what types of beliefs exist but disagree on what makes a belief important – a disagreement this paper is designed to adjudicate empirically.</w:t>
       </w:r>
     </w:p>
     <w:p>
@@ -352,7 +382,7 @@
         <w:t xml:space="preserve"> </w:t>
       </w:r>
       <w:r>
-        <w:t xml:space="preserve">sense and are, therefore, resistant to change. Finally, they act as filters for how information about policy issues is processed</w:t>
+        <w:t xml:space="preserve">sense and are, therefore, resistant to change, and they act as filters for how information about policy issues is processed</w:t>
       </w:r>
       <w:r>
         <w:t xml:space="preserve"> </w:t>
@@ -361,6 +391,39 @@
         <w:t xml:space="preserve">(Kahan 2012; Nowlin 2021)</w:t>
       </w:r>
       <w:r>
+        <w:t xml:space="preserve">. A network approach treats this same claim as a testable, empirical question rather than an assumption built into the model: deep core beliefs are important not because of their position atop a hierarchy but only if they are, in fact, highly central – that is, if they occupy structurally important positions among a network’s nodes. Several studies have found that they typically are: using the American National Election Study (ANES),</w:t>
+      </w:r>
+      <w:r>
+        <w:t xml:space="preserve"> </w:t>
+      </w:r>
+      <w:r>
+        <w:t xml:space="preserve">Boutyline and Vaisey (2017)</w:t>
+      </w:r>
+      <w:r>
+        <w:t xml:space="preserve"> </w:t>
+      </w:r>
+      <w:r>
+        <w:t xml:space="preserve">found that self-reported political ideology occupies a central role in a network of beliefs about various policy issues (abortion, environment, guns, death penalty, immigration, inequality, welfare spending), and</w:t>
+      </w:r>
+      <w:r>
+        <w:t xml:space="preserve"> </w:t>
+      </w:r>
+      <w:r>
+        <w:t xml:space="preserve">Brandt, Sibley, and Osborne (2019)</w:t>
+      </w:r>
+      <w:r>
+        <w:t xml:space="preserve"> </w:t>
+      </w:r>
+      <w:r>
+        <w:t xml:space="preserve">similarly find that symbolic beliefs based on identities (political ideology and partisanship) are more central within belief system networks than operational (issues-based) beliefs</w:t>
+      </w:r>
+      <w:r>
+        <w:t xml:space="preserve"> </w:t>
+      </w:r>
+      <w:r>
+        <w:t xml:space="preserve">(see also Fishman and Davis 2022)</w:t>
+      </w:r>
+      <w:r>
         <w:t xml:space="preserve">.</w:t>
       </w:r>
     </w:p>
@@ -505,10 +568,7 @@
         <w:t xml:space="preserve">policy core beliefs</w:t>
       </w:r>
       <w:r>
-        <w:t xml:space="preserve"> </w:t>
-      </w:r>
-      <w:r>
-        <w:t xml:space="preserve">that involve beliefs about particular policy issues such as immigration, national security, or climate change. Policy core beliefs are influenced by deep core beliefs. Finally,</w:t>
+        <w:t xml:space="preserve">, which involve beliefs about particular policy issues such as immigration, national security, or climate change and which the hierarchical view holds are influenced by deep core beliefs. Finally,</w:t>
       </w:r>
       <w:r>
         <w:t xml:space="preserve"> </w:t>
@@ -524,7 +584,7 @@
         <w:t xml:space="preserve"> </w:t>
       </w:r>
       <w:r>
-        <w:t xml:space="preserve">are beliefs regarding policy approaches such as a carbon tax or Environmental Protection Agency (EPA) regulations. Secondary beliefs are influenced by both deep core and policy core beliefs.</w:t>
+        <w:t xml:space="preserve">are beliefs regarding policy approaches, such as a carbon tax or Environmental Protection Agency (EPA) regulations, and are influenced by both deep core and policy core beliefs. A network approach retains this same vocabulary – deep core, policy core, and secondary beliefs remain useful descriptive categories for types of nodes – but drops the assumption that centrality follows this ordering. Instead, a belief’s centrality is a function of its connections to other nodes regardless of whether it is conventionally understood as deep core, policy core, or secondary; several studies, described below, have found that secondary and policy core beliefs can occupy structurally important positions that a strict hierarchical account would not predict.</w:t>
       </w:r>
     </w:p>
     <w:p>
@@ -541,7 +601,7 @@
         <w:t xml:space="preserve">Brandt and Sleegers (2021)</w:t>
       </w:r>
       <w:r>
-        <w:t xml:space="preserve">, as the belief system components are connected and causality runs from higher-order (deep core) to lower-order (secondary) beliefs. Yet, one issue with the hierarchical structure conceptualization is that the boundaries between different types of beliefs are fuzzy. In addition, each type of belief has been measured in different ways, leading to different conclusions among scholars about belief systems</w:t>
+        <w:t xml:space="preserve">, as the belief system components are connected and causality runs from higher-order (deep core) to lower-order (secondary) beliefs. Yet, one issue with the hierarchical conceptualization is that the boundaries between different types of beliefs are fuzzy, and each type of belief has been measured in different ways, leading to different conclusions among scholars about belief systems</w:t>
       </w:r>
       <w:r>
         <w:t xml:space="preserve"> </w:t>
@@ -550,21 +610,12 @@
         <w:t xml:space="preserve">(Henry et al. 2022; Ripberger et al. 2014)</w:t>
       </w:r>
       <w:r>
-        <w:t xml:space="preserve">. Conceptualizing belief systems as a network provides another way to understand their structure and organization that doesn’t rely on hierarchical, vertical relationships among different types of beliefs. A network approach emphasizes the horizontal connections between different beliefs, and the influence of a belief on other beliefs is based on measures of centrality rather than their place in a hierarchy.</w:t>
-      </w:r>
-    </w:p>
-    <w:bookmarkStart w:id="10" w:name="belief-system-networks"/>
-    <w:p>
-      <w:pPr>
-        <w:pStyle w:val="Heading2"/>
-      </w:pPr>
-      <w:r>
-        <w:t xml:space="preserve">Belief System Networks</w:t>
-      </w:r>
-    </w:p>
-    <w:p>
-      <w:pPr>
-        <w:pStyle w:val="FirstParagraph"/>
+        <w:t xml:space="preserve">. A network approach avoids this problem by dropping the vertical, hierarchical relationship among types of beliefs altogether: it instead emphasizes the horizontal connections between beliefs, and a belief’s influence on other beliefs is based on measures of centrality rather than its place in a hierarchy.</w:t>
+      </w:r>
+    </w:p>
+    <w:p>
+      <w:pPr>
+        <w:pStyle w:val="BodyText"/>
       </w:pPr>
       <w:r>
         <w:t xml:space="preserve">Within a belief system network, the components of the belief system – beliefs – are understood as</w:t>
@@ -609,7 +660,7 @@
         <w:t xml:space="preserve">ties</w:t>
       </w:r>
       <w:r>
-        <w:t xml:space="preserve">. Understanding belief systems as networks provides a way to operationalize belief systems consistent with how they are commonly defined and understood, and belief system networks can be analyzed using network centrality measures to determine which beliefs are prominent and influential in the network</w:t>
+        <w:t xml:space="preserve">. This operationalizes belief systems consistent with how they are commonly defined, and belief system networks can be analyzed using centrality measures to determine which beliefs are prominent and influential in the network</w:t>
       </w:r>
       <w:r>
         <w:t xml:space="preserve"> </w:t>
@@ -626,64 +677,7 @@
         <w:pStyle w:val="BodyText"/>
       </w:pPr>
       <w:r>
-        <w:t xml:space="preserve">A network approach can retain the notion of various</w:t>
-      </w:r>
-      <w:r>
-        <w:t xml:space="preserve"> </w:t>
-      </w:r>
-      <w:r>
-        <w:t xml:space="preserve">“types”</w:t>
-      </w:r>
-      <w:r>
-        <w:t xml:space="preserve"> </w:t>
-      </w:r>
-      <w:r>
-        <w:t xml:space="preserve">of beliefs (i.e., deep core, policy core, secondary) but shift the focus from their location in the hierarchy to their centrality in a belief system network. The centrality of the various types of beliefs highlights their importance and the function they perform in connecting other beliefs. Several studies have illustrated the usefulness of conceptualizing belief systems as networks, and many have found that</w:t>
-      </w:r>
-      <w:r>
-        <w:t xml:space="preserve"> </w:t>
-      </w:r>
-      <w:r>
-        <w:t xml:space="preserve">“symbolic”</w:t>
-      </w:r>
-      <w:r>
-        <w:t xml:space="preserve"> </w:t>
-      </w:r>
-      <w:r>
-        <w:t xml:space="preserve">beliefs (e.g., deep core beliefs such as political ideology) have high centrality values in belief system networks</w:t>
-      </w:r>
-      <w:r>
-        <w:t xml:space="preserve"> </w:t>
-      </w:r>
-      <w:r>
-        <w:t xml:space="preserve">(Fishman and Davis 2022)</w:t>
-      </w:r>
-      <w:r>
-        <w:t xml:space="preserve">. For example, using the American National Election Study (ANES),</w:t>
-      </w:r>
-      <w:r>
-        <w:t xml:space="preserve"> </w:t>
-      </w:r>
-      <w:r>
-        <w:t xml:space="preserve">Boutyline and Vaisey (2017)</w:t>
-      </w:r>
-      <w:r>
-        <w:t xml:space="preserve"> </w:t>
-      </w:r>
-      <w:r>
-        <w:t xml:space="preserve">found that self-reported political ideology occupies a central role in a network of other beliefs about various policy issues (abortion, environment, guns, death penalty, immigration, inequality, welfare spending). Additionally, using common measures of network centrality,</w:t>
-      </w:r>
-      <w:r>
-        <w:t xml:space="preserve"> </w:t>
-      </w:r>
-      <w:r>
-        <w:t xml:space="preserve">Brandt, Sibley, and Osborne (2019)</w:t>
-      </w:r>
-      <w:r>
-        <w:t xml:space="preserve"> </w:t>
-      </w:r>
-      <w:r>
-        <w:t xml:space="preserve">find that symbolic beliefs based on identities (political ideology and partisanship) are more central within belief system networks than operational (issues-based) beliefs.</w:t>
+        <w:t xml:space="preserve">Having established what beliefs constitute a network’s nodes, the network approach’s remaining task is to formalize how a belief’s centrality is determined – that is, what makes some nodes more structurally important than others.</w:t>
       </w:r>
     </w:p>
     <w:p>
@@ -723,7 +717,7 @@
         <w:pStyle w:val="FirstParagraph"/>
       </w:pPr>
       <w:r>
-        <w:t xml:space="preserve">As the belief system forms a center-periphery structure, some beliefs can begin to act as bridges, connecting beliefs in the periphery to other beliefs in the network. Specifically,</w:t>
+        <w:t xml:space="preserve">As the belief system forms a center-periphery structure, some beliefs can begin to act as bridges, connecting beliefs in the periphery to other beliefs in the network – a structural echo of the filtering role a hierarchical account attributes to deep core beliefs, but defined here by a belief’s position among its connections rather than its place in a hierarchy. Specifically,</w:t>
       </w:r>
       <w:r>
         <w:t xml:space="preserve"> </w:t>
@@ -1397,14 +1391,319 @@
       </w:r>
     </w:p>
     <w:bookmarkEnd w:id="10"/>
+    <w:bookmarkStart w:id="12" w:name="climate-change-beliefs"/>
+    <w:p>
+      <w:pPr>
+        <w:pStyle w:val="Heading1"/>
+      </w:pPr>
+      <w:r>
+        <w:t xml:space="preserve">Climate Change Beliefs</w:t>
+      </w:r>
+    </w:p>
+    <w:p>
+      <w:pPr>
+        <w:pStyle w:val="FirstParagraph"/>
+      </w:pPr>
+      <w:r>
+        <w:t xml:space="preserve">Even as climate scientists agree that climate change is happening, is anthropogenic, and poses significant risks, opinions are divided on each of those questions among some elites and some of the public. Several factors have been shown to influence beliefs about climate change among the public, including deep core beliefs such as partisanship, ideology, cultural worldviews, environmental attitudes, as well as policy core beliefs, including views about the scientific consensus, and secondary beliefs associated with aversions to the solutions presented to address climate change.</w:t>
+      </w:r>
+    </w:p>
+    <w:p>
+      <w:pPr>
+        <w:pStyle w:val="BodyText"/>
+      </w:pPr>
+      <w:r>
+        <w:t xml:space="preserve">Perhaps the clearest divides regarding climate change are connected to political beliefs. Several studies have shown that, among the mass public in the US, conservatives and Republicans are less likely than liberals and Democrats to believe that climate change is happening or poses a risk</w:t>
+      </w:r>
+      <w:r>
+        <w:t xml:space="preserve"> </w:t>
+      </w:r>
+      <w:r>
+        <w:t xml:space="preserve">(Bugden 2022; McCright and Dunlap 2011)</w:t>
+      </w:r>
+      <w:r>
+        <w:t xml:space="preserve">. Evidence suggests that polarization among the public is driven by elite polarization, as the public takes cues about policy and political issues from the political figures and news sources that they trust</w:t>
+      </w:r>
+      <w:r>
+        <w:t xml:space="preserve"> </w:t>
+      </w:r>
+      <w:r>
+        <w:t xml:space="preserve">(Brulle, Carmichael, and Jenkins 2012; Carmichael and Brulle 2017; Krosnick et al. 2006; Merkley and Stecula 2018, 2021; Tesler 2018)</w:t>
+      </w:r>
+      <w:r>
+        <w:t xml:space="preserve">.</w:t>
+      </w:r>
+    </w:p>
+    <w:p>
+      <w:pPr>
+        <w:pStyle w:val="BodyText"/>
+      </w:pPr>
+      <w:r>
+        <w:t xml:space="preserve">Apart from political beliefs, cultural worldviews derived from cultural theory have also been associated with climate beliefs. Early theorizing of cultural theory noted that the various cultural worldviews hold different</w:t>
+      </w:r>
+      <w:r>
+        <w:t xml:space="preserve"> </w:t>
+      </w:r>
+      <w:r>
+        <w:t xml:space="preserve">“myths of nature”</w:t>
+      </w:r>
+      <w:r>
+        <w:t xml:space="preserve">, which shape how they view the natural environment and the risks posed to it</w:t>
+      </w:r>
+      <w:r>
+        <w:t xml:space="preserve"> </w:t>
+      </w:r>
+      <w:r>
+        <w:t xml:space="preserve">(Thompson, Ellis, and Wildavsky 1990)</w:t>
+      </w:r>
+      <w:r>
+        <w:t xml:space="preserve">. In brief, egalitarians tend to view nature as fragile and ephemeral, whereas individualists see nature as robust. Hierarchs tend to see nature as tolerant within limits that need to be carefully and expertly managed. Finally, fatalists see nature as random and unpredictable and therefore impossible for humans to manage</w:t>
+      </w:r>
+      <w:r>
+        <w:t xml:space="preserve"> </w:t>
+      </w:r>
+      <w:r>
+        <w:t xml:space="preserve">(Grendstad and Selle 2000)</w:t>
+      </w:r>
+      <w:r>
+        <w:t xml:space="preserve">. The various myths of nature associated with cultural worldviews likely drive climate beliefs. Research has found that egalitarians are the most concerned about climate change, and individualists are the least concerned among the cultural types</w:t>
+      </w:r>
+      <w:r>
+        <w:t xml:space="preserve"> </w:t>
+      </w:r>
+      <w:r>
+        <w:t xml:space="preserve">(Jones 2011; Kahan et al. 2012; Kahan, Jenkins-Smith, and Braman 2011; Verweij et al. 2006)</w:t>
+      </w:r>
+      <w:r>
+        <w:t xml:space="preserve">. Hierarchs tend to occupy a</w:t>
+      </w:r>
+      <w:r>
+        <w:t xml:space="preserve"> </w:t>
+      </w:r>
+      <w:r>
+        <w:t xml:space="preserve">“middle”</w:t>
+      </w:r>
+      <w:r>
+        <w:t xml:space="preserve"> </w:t>
+      </w:r>
+      <w:r>
+        <w:t xml:space="preserve">space between egalitarians and individualists on environmental issues broadly</w:t>
+      </w:r>
+      <w:r>
+        <w:t xml:space="preserve"> </w:t>
+      </w:r>
+      <w:r>
+        <w:t xml:space="preserve">(Ripberger et al. 2014)</w:t>
+      </w:r>
+      <w:r>
+        <w:t xml:space="preserve"> </w:t>
+      </w:r>
+      <w:r>
+        <w:t xml:space="preserve">and climate change specifically</w:t>
+      </w:r>
+      <w:r>
+        <w:t xml:space="preserve"> </w:t>
+      </w:r>
+      <w:r>
+        <w:t xml:space="preserve">(Nowlin and Rabovsky 2020)</w:t>
+      </w:r>
+      <w:r>
+        <w:t xml:space="preserve">. Finally, given their views on the capriciousness of nature, fatalists tend not to have clearly defined beliefs about climate change</w:t>
+      </w:r>
+      <w:r>
+        <w:t xml:space="preserve"> </w:t>
+      </w:r>
+      <w:r>
+        <w:t xml:space="preserve">(Jones 2011; Nowlin and Rabovsky 2020)</w:t>
+      </w:r>
+      <w:r>
+        <w:t xml:space="preserve">.</w:t>
+      </w:r>
+    </w:p>
+    <w:p>
+      <w:pPr>
+        <w:pStyle w:val="BodyText"/>
+      </w:pPr>
+      <w:r>
+        <w:t xml:space="preserve">Broader environmental values and attitudes also shape views on climate change. One of the most commonly used measures of environmental orientation is the New Ecological Paradigm (NEP) scale</w:t>
+      </w:r>
+      <w:r>
+        <w:t xml:space="preserve"> </w:t>
+      </w:r>
+      <w:r>
+        <w:t xml:space="preserve">(Dunlap 2008; Sparks et al. 2021; Stern, Dietz, and Guagnano 1995)</w:t>
+      </w:r>
+      <w:r>
+        <w:t xml:space="preserve">. In brief, the NEP scale measures</w:t>
+      </w:r>
+      <w:r>
+        <w:t xml:space="preserve"> </w:t>
+      </w:r>
+      <w:r>
+        <w:t xml:space="preserve">“beliefs about humanity’s ability to upset the balance of nature, the existence of limits to growth for human societies, and humanity’s right to rule over the rest of nature”</w:t>
+      </w:r>
+      <w:r>
+        <w:t xml:space="preserve"> </w:t>
+      </w:r>
+      <w:r>
+        <w:t xml:space="preserve">(Dunlap et al. 2000, 427)</w:t>
+      </w:r>
+      <w:r>
+        <w:t xml:space="preserve">. Using the NEP scale, a pro-environmental orientation is associated with concerns about the robustness of nature and the impacts of human activities on the natural world. Previous research has found that a pro-environmental orientation, as measured by the NEP scale, is associated with views about climate change</w:t>
+      </w:r>
+      <w:r>
+        <w:t xml:space="preserve"> </w:t>
+      </w:r>
+      <w:r>
+        <w:t xml:space="preserve">(Nowlin 2019; Ziegler 2017)</w:t>
+      </w:r>
+      <w:r>
+        <w:t xml:space="preserve">.</w:t>
+      </w:r>
+    </w:p>
+    <w:p>
+      <w:pPr>
+        <w:pStyle w:val="BodyText"/>
+      </w:pPr>
+      <w:r>
+        <w:t xml:space="preserve">As noted, opinions differ on climate change despite the clear scientific consensus. A series of studies have found that acceptance of the scientific consensus around climate change acts as a</w:t>
+      </w:r>
+      <w:r>
+        <w:t xml:space="preserve"> </w:t>
+      </w:r>
+      <w:r>
+        <w:t xml:space="preserve">“gateway belief”</w:t>
+      </w:r>
+      <w:r>
+        <w:t xml:space="preserve"> </w:t>
+      </w:r>
+      <w:r>
+        <w:t xml:space="preserve">that connects to beliefs that climate change is happening and also connects to support for actions to address climate change</w:t>
+      </w:r>
+      <w:r>
+        <w:t xml:space="preserve"> </w:t>
+      </w:r>
+      <w:r>
+        <w:t xml:space="preserve">(Goldberg et al. 2019; S. L. van der Linden et al. 2015; S. van der Linden, Leiserowitz, and Maibach 2019)</w:t>
+      </w:r>
+      <w:r>
+        <w:t xml:space="preserve">. Using experimental research designs, scholars have found that those exposed to a message about the scientific consensus were more likely than those not exposed to a consensus message to change their beliefs regarding climate change (i.e., it’s happening, it’s anthropogenic, and it’s a risk) as well as increase their support for public action</w:t>
+      </w:r>
+      <w:r>
+        <w:t xml:space="preserve"> </w:t>
+      </w:r>
+      <w:r>
+        <w:t xml:space="preserve">(Van Der Linden 2021)</w:t>
+      </w:r>
+      <w:r>
+        <w:t xml:space="preserve">.</w:t>
+      </w:r>
+    </w:p>
+    <w:p>
+      <w:pPr>
+        <w:pStyle w:val="BodyText"/>
+      </w:pPr>
+      <w:r>
+        <w:t xml:space="preserve">Political beliefs are a leading source of division over climate change, and one explanation for their influence on both elites and the mass public is solution aversion</w:t>
+      </w:r>
+      <w:r>
+        <w:t xml:space="preserve"> </w:t>
+      </w:r>
+      <w:r>
+        <w:t xml:space="preserve">(Campbell and Kay 2014)</w:t>
+      </w:r>
+      <w:r>
+        <w:t xml:space="preserve">. One of the underlying differences between Republicans/conservatives and Democrats/liberals is how they see the role of government, particularly the federal government, in addressing societal problems. Generally speaking, Republicans/conservatives are more skeptical of the government’s ability to address problems than Democrats/liberals. Much of the discussion around climate change centers on government action to address it, and when government action is presented as a solution, it is likely to trigger skepticism among Republicans/conservatives, which in turn broadens skepticism about the problem. In essence, the solution aversion hypothesis posits that secondary beliefs and/or policy preferences drive broader views of policy issues. This is evidenced by the finding that the debate over the Kyoto Protocol polarized views about climate change</w:t>
+      </w:r>
+      <w:r>
+        <w:t xml:space="preserve"> </w:t>
+      </w:r>
+      <w:r>
+        <w:t xml:space="preserve">(Krosnick, Holbrook, and Visser 2000)</w:t>
+      </w:r>
+      <w:r>
+        <w:t xml:space="preserve">.</w:t>
+      </w:r>
+    </w:p>
+    <w:p>
+      <w:pPr>
+        <w:pStyle w:val="BodyText"/>
+      </w:pPr>
+      <w:r>
+        <w:t xml:space="preserve">Recent research using a network approach to examine climate change beliefs found that how worried respondents are about climate change, a policy core belief, was the most central belief in the climate change belief network</w:t>
+      </w:r>
+      <w:r>
+        <w:t xml:space="preserve"> </w:t>
+      </w:r>
+      <w:r>
+        <w:t xml:space="preserve">(Lee et al. 2024)</w:t>
+      </w:r>
+      <w:r>
+        <w:t xml:space="preserve">. Additionally, support for regulating greenhouse gas emissions (secondary belief/policy preference) and beliefs about potential harm resulting from climate change (policy core belief) also scored high on measures of network centrality. Other studies found differences in the structure of climate change belief networks across groups, including those in global south who tended to have less density connected networks than those in the north</w:t>
+      </w:r>
+      <w:r>
+        <w:t xml:space="preserve"> </w:t>
+      </w:r>
+      <w:r>
+        <w:t xml:space="preserve">(Lee et al. 2025)</w:t>
+      </w:r>
+      <w:r>
+        <w:t xml:space="preserve">, White, Black, and Hispanic respondents</w:t>
+      </w:r>
+      <w:r>
+        <w:t xml:space="preserve"> </w:t>
+      </w:r>
+      <w:r>
+        <w:t xml:space="preserve">(Stewart, Rivera-Kientz, and Dacey 2024)</w:t>
+      </w:r>
+      <w:r>
+        <w:t xml:space="preserve">, Republicans and Democrats</w:t>
+      </w:r>
+      <w:r>
+        <w:t xml:space="preserve"> </w:t>
+      </w:r>
+      <w:r>
+        <w:t xml:space="preserve">(Lee et al. 2024)</w:t>
+      </w:r>
+      <w:r>
+        <w:t xml:space="preserve">, and those on the political left vs the right in Denmark</w:t>
+      </w:r>
+      <w:r>
+        <w:t xml:space="preserve"> </w:t>
+      </w:r>
+      <w:r>
+        <w:t xml:space="preserve">(Lind, Morton, and Dalege 2024)</w:t>
+      </w:r>
+      <w:r>
+        <w:t xml:space="preserve">. While these studies provide important insights into the climate change belief system of various publics, they did not include measures of many deep core beliefs shown to be important influences of climate change beliefs, including cultural worldviews and environmental orientation.</w:t>
+      </w:r>
+    </w:p>
+    <w:bookmarkStart w:id="11" w:name="theoretical-expectations"/>
+    <w:p>
+      <w:pPr>
+        <w:pStyle w:val="Heading2"/>
+      </w:pPr>
+      <w:r>
+        <w:t xml:space="preserve">Theoretical Expectations</w:t>
+      </w:r>
+    </w:p>
+    <w:p>
+      <w:pPr>
+        <w:pStyle w:val="FirstParagraph"/>
+      </w:pPr>
+      <w:r>
+        <w:t xml:space="preserve">Previous research points to several distinct expectations about which types of beliefs should be most structurally central in a climate change belief network, though, to my knowledge, these expectations have not been tested against one another using measures of cultural worldviews, environmental orientation, and climate policy preferences within a single network. A hierarchical view of belief systems holds that deep core beliefs – cultural worldviews, political ideology, and pro-environmental orientation – shape and constrain other beliefs, and so should likely occupy the most central positions in the network. Work on the gateway belief model instead points to perceived scientific consensus, which is theorized to serve as a causal entry point that shifts downstream climate beliefs. A third possibility, grounded in solution aversion, is that beliefs about specific policy approaches are most central, because resistance to a policy solution can influence how the underlying problem itself is perceived. The following analysis examines centrality across all three types of beliefs simultaneously, asking which beliefs, and which types of beliefs, occupy the most structurally important positions in the network, and whether that varies depending on how centrality is measured. Beliefs will likely vary in their importance in the network depending on the measurement of centrality. For example, betweenness and closeness centrality, which capture a belief’s role in bridging and quickly reaching other beliefs in the network, most directly reflect the kind of constraining, foundational role a hierarchical account attributes to deep core beliefs. Strength centrality, which reflects the number and magnitude of a belief’s direct connections, more directly reflects the pattern a solution-aversion account would predict for policy preferences as both deep core and policy core are likely to be connected to preferences. In the next section, I discuss the data and measurements used to explore the climate change belief network.</w:t>
+      </w:r>
+    </w:p>
     <w:bookmarkEnd w:id="11"/>
-    <w:bookmarkStart w:id="13" w:name="climate-change-beliefs"/>
+    <w:bookmarkEnd w:id="12"/>
+    <w:bookmarkStart w:id="19" w:name="data-and-analysis"/>
     <w:p>
       <w:pPr>
         <w:pStyle w:val="Heading1"/>
       </w:pPr>
       <w:r>
-        <w:t xml:space="preserve">Climate Change Beliefs</w:t>
+        <w:t xml:space="preserve">Data and Analysis</w:t>
       </w:r>
     </w:p>
     <w:p>
@@ -1412,7 +1711,13 @@
         <w:pStyle w:val="FirstParagraph"/>
       </w:pPr>
       <w:r>
-        <w:t xml:space="preserve">Even as climate scientists agree that climate change is happening, is anthropogenic, and poses significant risks, opinions are divided on each of those questions among some elites and some of the public. Several factors have been shown to influence beliefs about climate change among the public, including deep core beliefs such as partisanship, ideology, cultural worldviews, environmental attitudes, as well as policy core beliefs, including views about the scientific consensus, and secondary beliefs associated with aversions to the solutions presented to address climate change.</w:t>
+        <w:t xml:space="preserve">To examine the belief system network around climate change, I use original public survey data collected in October 2017. The data comes from a representative sample, based on quotas for age, gender, and race/ethnicity drawn from the US Census, of about 1200 US residents obtained through Survey Sampling International (SSI). The survey was administered online through Qualtrics. Respondents were asked questions regarding their views on climate change, support for policy approaches to address climate change, agreement with statements from the New Ecological Paradigm (NEP), questions to determine their cultural worldview based on cultural theory, and their ideological and partisan attachments.</w:t>
+      </w:r>
+      <w:r>
+        <w:rPr>
+          <w:rStyle w:val="FootnoteReference"/>
+        </w:rPr>
+        <w:footnoteReference w:id="13"/>
       </w:r>
     </w:p>
     <w:p>
@@ -1420,320 +1725,6 @@
         <w:pStyle w:val="BodyText"/>
       </w:pPr>
       <w:r>
-        <w:t xml:space="preserve">Perhaps the clearest divides regarding climate change are connected to political beliefs. Several studies have shown that, among the mass public in the US, conservatives and Republicans are less likely than liberals and Democrats to believe that climate change is happening or poses a risk</w:t>
-      </w:r>
-      <w:r>
-        <w:t xml:space="preserve"> </w:t>
-      </w:r>
-      <w:r>
-        <w:t xml:space="preserve">(Bugden 2022; McCright and Dunlap 2011)</w:t>
-      </w:r>
-      <w:r>
-        <w:t xml:space="preserve">. Evidence suggests that polarization among the public is driven by elite polarization, as the public takes cues about policy and political issues from the political figures and news sources that they trust</w:t>
-      </w:r>
-      <w:r>
-        <w:t xml:space="preserve"> </w:t>
-      </w:r>
-      <w:r>
-        <w:t xml:space="preserve">(Brulle, Carmichael, and Jenkins 2012; Carmichael and Brulle 2017; Krosnick et al. 2006; Merkley and Stecula 2018, 2021; Tesler 2018)</w:t>
-      </w:r>
-      <w:r>
-        <w:t xml:space="preserve">.</w:t>
-      </w:r>
-    </w:p>
-    <w:p>
-      <w:pPr>
-        <w:pStyle w:val="BodyText"/>
-      </w:pPr>
-      <w:r>
-        <w:t xml:space="preserve">Apart from political beliefs, cultural worldviews derived from cultural theory have also been associated with climate beliefs. Early theorizing of cultural theory noted that the various cultural worldviews hold different</w:t>
-      </w:r>
-      <w:r>
-        <w:t xml:space="preserve"> </w:t>
-      </w:r>
-      <w:r>
-        <w:t xml:space="preserve">“myths of nature”</w:t>
-      </w:r>
-      <w:r>
-        <w:t xml:space="preserve">, which shape how they view the natural environment and the risks posed to it</w:t>
-      </w:r>
-      <w:r>
-        <w:t xml:space="preserve"> </w:t>
-      </w:r>
-      <w:r>
-        <w:t xml:space="preserve">(Thompson, Ellis, and Wildavsky 1990)</w:t>
-      </w:r>
-      <w:r>
-        <w:t xml:space="preserve">. In brief, egalitarians tend to view nature as fragile and ephemeral, whereas individualists see nature as robust. Hierarchs tend to see nature as tolerant within limits that need to be carefully and expertly managed. Finally, fatalists see nature as random and unpredictable and therefore impossible for humans to manage</w:t>
-      </w:r>
-      <w:r>
-        <w:t xml:space="preserve"> </w:t>
-      </w:r>
-      <w:r>
-        <w:t xml:space="preserve">(Grendstad and Selle 2000)</w:t>
-      </w:r>
-      <w:r>
-        <w:t xml:space="preserve">. The various myths of nature associated with cultural worldviews likely drive climate beliefs. Research has found that egalitarians are the most concerned about climate change, and individualists are the least concerned among the cultural types</w:t>
-      </w:r>
-      <w:r>
-        <w:t xml:space="preserve"> </w:t>
-      </w:r>
-      <w:r>
-        <w:t xml:space="preserve">(Jones 2011; Kahan et al. 2012; Kahan, Jenkins-Smith, and Braman 2011; Verweij et al. 2006)</w:t>
-      </w:r>
-      <w:r>
-        <w:t xml:space="preserve">. Hierarchs tend to occupy a</w:t>
-      </w:r>
-      <w:r>
-        <w:t xml:space="preserve"> </w:t>
-      </w:r>
-      <w:r>
-        <w:t xml:space="preserve">“middle”</w:t>
-      </w:r>
-      <w:r>
-        <w:t xml:space="preserve"> </w:t>
-      </w:r>
-      <w:r>
-        <w:t xml:space="preserve">space between egalitarians and individualists on environmental issues broadly</w:t>
-      </w:r>
-      <w:r>
-        <w:t xml:space="preserve"> </w:t>
-      </w:r>
-      <w:r>
-        <w:t xml:space="preserve">(Ripberger et al. 2014)</w:t>
-      </w:r>
-      <w:r>
-        <w:t xml:space="preserve"> </w:t>
-      </w:r>
-      <w:r>
-        <w:t xml:space="preserve">and climate change specifically</w:t>
-      </w:r>
-      <w:r>
-        <w:t xml:space="preserve"> </w:t>
-      </w:r>
-      <w:r>
-        <w:t xml:space="preserve">(Nowlin and Rabovsky 2020)</w:t>
-      </w:r>
-      <w:r>
-        <w:t xml:space="preserve">. Finally, given their views on the capriciousness of nature, fatalists tend not to have clearly defined beliefs about climate change</w:t>
-      </w:r>
-      <w:r>
-        <w:t xml:space="preserve"> </w:t>
-      </w:r>
-      <w:r>
-        <w:t xml:space="preserve">(Jones 2011; Nowlin and Rabovsky 2020)</w:t>
-      </w:r>
-      <w:r>
-        <w:t xml:space="preserve">.</w:t>
-      </w:r>
-    </w:p>
-    <w:p>
-      <w:pPr>
-        <w:pStyle w:val="BodyText"/>
-      </w:pPr>
-      <w:r>
-        <w:t xml:space="preserve">Broader environmental values and attitudes also shape views on climate change. One of the most commonly used measures of environmental orientation is the New Ecological Paradigm (NEP) scale</w:t>
-      </w:r>
-      <w:r>
-        <w:t xml:space="preserve"> </w:t>
-      </w:r>
-      <w:r>
-        <w:t xml:space="preserve">(Dunlap 2008; Sparks et al. 2021; Stern, Dietz, and Guagnano 1995)</w:t>
-      </w:r>
-      <w:r>
-        <w:t xml:space="preserve">. In brief, the NEP scale measures</w:t>
-      </w:r>
-      <w:r>
-        <w:t xml:space="preserve"> </w:t>
-      </w:r>
-      <w:r>
-        <w:t xml:space="preserve">“beliefs about humanity’s ability to upset the balance of nature, the existence of limits to growth for human societies, and humanity’s right to rule over the rest of nature”</w:t>
-      </w:r>
-      <w:r>
-        <w:t xml:space="preserve"> </w:t>
-      </w:r>
-      <w:r>
-        <w:t xml:space="preserve">(Dunlap et al. 2000, 427)</w:t>
-      </w:r>
-      <w:r>
-        <w:t xml:space="preserve">. Using the NEP scale, a pro-environmental orientation is associated with concerns about the robustness of nature and the impacts of human activities on the natural world. Previous research has found that a pro-environmental orientation, as measured by the NEP scale, is associated with views about climate change</w:t>
-      </w:r>
-      <w:r>
-        <w:t xml:space="preserve"> </w:t>
-      </w:r>
-      <w:r>
-        <w:t xml:space="preserve">(Nowlin 2019; Ziegler 2017)</w:t>
-      </w:r>
-      <w:r>
-        <w:t xml:space="preserve">.</w:t>
-      </w:r>
-    </w:p>
-    <w:p>
-      <w:pPr>
-        <w:pStyle w:val="BodyText"/>
-      </w:pPr>
-      <w:r>
-        <w:t xml:space="preserve">As noted, opinions differ on climate change despite the clear scientific consensus. A series of studies have found that acceptance of the scientific consensus around climate change acts as a</w:t>
-      </w:r>
-      <w:r>
-        <w:t xml:space="preserve"> </w:t>
-      </w:r>
-      <w:r>
-        <w:t xml:space="preserve">“gateway belief”</w:t>
-      </w:r>
-      <w:r>
-        <w:t xml:space="preserve"> </w:t>
-      </w:r>
-      <w:r>
-        <w:t xml:space="preserve">that connects to beliefs that climate change is happening and also connects to support for actions to address climate change</w:t>
-      </w:r>
-      <w:r>
-        <w:t xml:space="preserve"> </w:t>
-      </w:r>
-      <w:r>
-        <w:t xml:space="preserve">(Goldberg et al. 2019; S. L. van der Linden et al. 2015; S. van der Linden, Leiserowitz, and Maibach 2019)</w:t>
-      </w:r>
-      <w:r>
-        <w:t xml:space="preserve">. Using experimental research designs, scholars have found that those exposed to a message about the scientific consensus were more likely than those not exposed to a consensus message to change their beliefs regarding climate change (i.e., it’s happening, it’s anthropogenic, and it’s a risk) as well as increase their support for public action</w:t>
-      </w:r>
-      <w:r>
-        <w:t xml:space="preserve"> </w:t>
-      </w:r>
-      <w:r>
-        <w:t xml:space="preserve">(Van Der Linden 2021)</w:t>
-      </w:r>
-      <w:r>
-        <w:t xml:space="preserve">.</w:t>
-      </w:r>
-    </w:p>
-    <w:p>
-      <w:pPr>
-        <w:pStyle w:val="BodyText"/>
-      </w:pPr>
-      <w:r>
-        <w:t xml:space="preserve">Political beliefs are a leading source of division over climate change, and one explanation for their influence on both elites and the mass public is solution aversion</w:t>
-      </w:r>
-      <w:r>
-        <w:t xml:space="preserve"> </w:t>
-      </w:r>
-      <w:r>
-        <w:t xml:space="preserve">(Campbell and Kay 2014)</w:t>
-      </w:r>
-      <w:r>
-        <w:t xml:space="preserve">. One of the underlying differences between Republicans/conservatives and Democrats/liberals is how they see the role of government, particularly the federal government, in addressing societal problems. Generally speaking, Republicans/conservatives are more skeptical of the government’s ability to address problems than Democrats/liberals. Much of the discussion around climate change centers on government action to address it, and when government action is presented as a solution, it is likely to trigger skepticism among Republicans/conservatives, which in turn broadens skepticism about the problem. In essence, the solution aversion hypothesis posits that secondary beliefs and/or policy preferences drive broader views of policy issues. This is evidenced by the finding that the debate over the Kyoto Protocol polarized views about climate change</w:t>
-      </w:r>
-      <w:r>
-        <w:t xml:space="preserve"> </w:t>
-      </w:r>
-      <w:r>
-        <w:t xml:space="preserve">(Krosnick, Holbrook, and Visser 2000)</w:t>
-      </w:r>
-      <w:r>
-        <w:t xml:space="preserve">.</w:t>
-      </w:r>
-    </w:p>
-    <w:p>
-      <w:pPr>
-        <w:pStyle w:val="BodyText"/>
-      </w:pPr>
-      <w:r>
-        <w:t xml:space="preserve">Recent research using a network approach to examine climate change beliefs found that how worried respondents are about climate change, a policy core belief, was the most central belief in the climate change belief network</w:t>
-      </w:r>
-      <w:r>
-        <w:t xml:space="preserve"> </w:t>
-      </w:r>
-      <w:r>
-        <w:t xml:space="preserve">(Lee et al. 2024)</w:t>
-      </w:r>
-      <w:r>
-        <w:t xml:space="preserve">. Additionally, support for regulating greenhouse gas emissions (secondary belief/policy preference) and beliefs about potential harm resulting from climate change (policy core belief) also scored high on measures of network centrality. Other studies found differences in the structure of climate change belief networks across groups, including those in global south who tended to have less density connected networks than those in the north</w:t>
-      </w:r>
-      <w:r>
-        <w:t xml:space="preserve"> </w:t>
-      </w:r>
-      <w:r>
-        <w:t xml:space="preserve">(Lee et al. 2025)</w:t>
-      </w:r>
-      <w:r>
-        <w:t xml:space="preserve">, White, Black, and Hispanic respondents</w:t>
-      </w:r>
-      <w:r>
-        <w:t xml:space="preserve"> </w:t>
-      </w:r>
-      <w:r>
-        <w:t xml:space="preserve">(Stewart, Rivera-Kientz, and Dacey 2024)</w:t>
-      </w:r>
-      <w:r>
-        <w:t xml:space="preserve">, Republicans and Democrats</w:t>
-      </w:r>
-      <w:r>
-        <w:t xml:space="preserve"> </w:t>
-      </w:r>
-      <w:r>
-        <w:t xml:space="preserve">(Lee et al. 2024)</w:t>
-      </w:r>
-      <w:r>
-        <w:t xml:space="preserve">, and those on the political left vs the right in Denmark</w:t>
-      </w:r>
-      <w:r>
-        <w:t xml:space="preserve"> </w:t>
-      </w:r>
-      <w:r>
-        <w:t xml:space="preserve">(Lind, Morton, and Dalege 2024)</w:t>
-      </w:r>
-      <w:r>
-        <w:t xml:space="preserve">. While these studies provide important insights into the climate change belief system of various publics, they did not include measures of many deep core beliefs shown to be important influences of climate change beliefs, including cultural worldviews and environmental orientation.</w:t>
-      </w:r>
-    </w:p>
-    <w:bookmarkStart w:id="12" w:name="theoretical-expectations"/>
-    <w:p>
-      <w:pPr>
-        <w:pStyle w:val="Heading2"/>
-      </w:pPr>
-      <w:r>
-        <w:t xml:space="preserve">Theoretical Expectations</w:t>
-      </w:r>
-    </w:p>
-    <w:p>
-      <w:pPr>
-        <w:pStyle w:val="FirstParagraph"/>
-      </w:pPr>
-      <w:r>
-        <w:t xml:space="preserve">Previous research points to several distinct expectations about which types of beliefs should be most structurally central in a climate change belief network, though these expectations have not been tested against one another using measures of cultural worldviews, environmental orientation, and climate policy preferences within a single network. A hierarchical view of belief systems holds that deep core beliefs – cultural worldviews, political ideology, and pro-environmental orientation – shape and constrain other beliefs, and so should likely occupy the most central positions in the network. Work on the gateway belief model instead points to perceived scientific consensus, which is theorized to serve as a causal entry point that shifts downstream climate beliefs. A third possibility, grounded in solution aversion, is that beliefs about specific policy approaches are most central, because resistance to a policy solution can color how the underlying problem itself is perceived. Rather than adjudicating between these accounts as competing hypotheses, the analysis below examines centrality across all three types of beliefs simultaneously, asking which beliefs – and which types of beliefs – occupy the most structurally important positions in the network, and whether that varies depending on how centrality is measured. Betweenness and closeness centrality, which capture a belief’s role in bridging and quickly reaching other beliefs in the network, most directly reflect the kind of constraining, foundational role a hierarchical account attributes to deep core beliefs. Strength centrality, which reflects the number and magnitude of a belief’s direct connections, more directly reflects the pattern a solution-aversion account would predict for policy-specific beliefs.</w:t>
-      </w:r>
-    </w:p>
-    <w:p>
-      <w:pPr>
-        <w:pStyle w:val="BodyText"/>
-      </w:pPr>
-      <w:r>
-        <w:t xml:space="preserve">In the next section, I discuss the data and measurements used to explore the climate change belief network.</w:t>
-      </w:r>
-    </w:p>
-    <w:bookmarkEnd w:id="12"/>
-    <w:bookmarkEnd w:id="13"/>
-    <w:bookmarkStart w:id="20" w:name="data-and-analysis"/>
-    <w:p>
-      <w:pPr>
-        <w:pStyle w:val="Heading1"/>
-      </w:pPr>
-      <w:r>
-        <w:t xml:space="preserve">Data and Analysis</w:t>
-      </w:r>
-    </w:p>
-    <w:p>
-      <w:pPr>
-        <w:pStyle w:val="FirstParagraph"/>
-      </w:pPr>
-      <w:r>
-        <w:t xml:space="preserve">To examine the belief system network around climate change, I use original public survey data collected in October 2017. The data comes from a representative sample, based on quotas for age, gender, and race/ethnicity drawn from the US Census, of about 1200 US residents obtained through Survey Sampling International (SSI). The survey was administered online through Qualtrics. Respondents were asked questions regarding their views on climate change, support for policy approaches to address climate change, agreement with statements from the New Ecological Paradigm (NEP), questions to determine their cultural worldview based on cultural theory, and their ideological and partisan attachments.</w:t>
-      </w:r>
-    </w:p>
-    <w:p>
-      <w:pPr>
-        <w:pStyle w:val="BodyText"/>
-      </w:pPr>
-      <w:r>
         <w:t xml:space="preserve">Although these data were collected in October 2017, several considerations support their continued relevance to current debates about the structure of climate change beliefs. As noted, deep core beliefs such as cultural worldviews are theorized to be especially resistant to change</w:t>
       </w:r>
       <w:r>
@@ -1743,7 +1734,7 @@
         <w:t xml:space="preserve">(Converse 1964)</w:t>
       </w:r>
       <w:r>
-        <w:t xml:space="preserve">, and the overall organization of the belief network – which beliefs are central and which are peripheral – should therefore likely be comparatively stable even as specific policy debates evolve. The network studies against which the present findings are compared also draw on data from a similar or earlier period</w:t>
+        <w:t xml:space="preserve">, and the overall organization of the belief network, including which beliefs are central and which are peripheral should therefore likely be comparatively stable even as specific policy debates evolve. The network studies against which the present findings are compared also draw on data from a similar or earlier period</w:t>
       </w:r>
       <w:r>
         <w:t xml:space="preserve"> </w:t>
@@ -1764,7 +1755,7 @@
         <w:t xml:space="preserve"> </w:t>
       </w:r>
       <w:r>
-        <w:t xml:space="preserve">find that the structure of the climate change belief network is largely consistent over time, particularly among Republicans and Democrats considered separately. This suggests that partisan belief networks are not highly sensitive to the specific historical moment in which they are measured. Nonetheless, the 2017 data were collected early in the first Trump administration, prior to a number of subsequent developments in climate politics and communication, and it remains an open question whether more recent shifts in polarization and climate discourse have altered the network’s structure. Future research should replicate this analysis with more recent data to establish whether the patterns reported here reflect an enduring feature of the climate change belief system or are specific to this period.</w:t>
+        <w:t xml:space="preserve">find that the structure of the climate change belief network is largely consistent over time, particularly among Republicans and Democrats. This suggests that belief networks are relatively stable and not highly sensitive to the specific time period in which they are measured. However, it remains an open question whether more recent shifts in polarization and climate discourse have altered the network’s structure. Future research should replicate this analysis with more recent data to establish whether the patterns reported here reflect an enduring feature of the climate change belief system or are specific to this period.</w:t>
       </w:r>
     </w:p>
     <w:bookmarkStart w:id="16" w:name="belief-measures"/>
@@ -2822,7 +2813,16 @@
         <w:t xml:space="preserve">(S. van der Linden, Leiserowitz, and Maibach 2019)</w:t>
       </w:r>
       <w:r>
-        <w:t xml:space="preserve">. The sciconsensus measure used here instead asks respondents for their own naturalistic belief about whether such a consensus exists, without providing a specific consensus figure. This is a more conservative measure in the sense that it does not prime respondents with the consensus estimate itself, so it may better capture organically held beliefs about scientific consensus rather than beliefs induced by exposure to a consensus statistic.</w:t>
+        <w:t xml:space="preserve">. The sciconsensus measure used here instead asks respondents for their own belief about whether such a consensus exists, without providing a specific consensus figure. This is a more conservative measure in the sense that it does not prime respondents with the consensus estimate itself, so it may better capture organically held beliefs about scientific consensus rather than beliefs induced by exposure to a consensus statistic. Additionally, the measure is similar to that used by</w:t>
+      </w:r>
+      <w:r>
+        <w:t xml:space="preserve"> </w:t>
+      </w:r>
+      <w:r>
+        <w:t xml:space="preserve">Lee et al. (2024)</w:t>
+      </w:r>
+      <w:r>
+        <w:t xml:space="preserve">.</w:t>
       </w:r>
     </w:p>
     <w:p>
@@ -3410,7 +3410,7 @@
         <w:t xml:space="preserve"> </w:t>
       </w:r>
       <w:r>
-        <w:t xml:space="preserve">(Brandt, Sibley, and Osborne 2019; Friedman, Hastie, and Tibshirani 2008)</w:t>
+        <w:t xml:space="preserve">(Brandt, Sibley, and Osborne 2019; J. Friedman, Hastie, and Tibshirani 2008)</w:t>
       </w:r>
       <w:r>
         <w:t xml:space="preserve">. This approach is common in psychological network analysis because of the small sample size relative to the data needed to estimate network models</w:t>
@@ -3479,180 +3479,229 @@
         <w:t xml:space="preserve">(Epskamp et al. 2012; Epskamp and Fried 2023)</w:t>
       </w:r>
       <w:r>
+        <w:t xml:space="preserve">. The measures of centrality – betweenness, closeness, and strength – in the belief system network were calculated through a bootstrapping procedure using 1000 resamples of the data. The procedure was performed in</w:t>
+      </w:r>
+      <w:r>
+        <w:t xml:space="preserve"> </w:t>
+      </w:r>
+      <w:r>
+        <w:rPr>
+          <w:rStyle w:val="VerbatimChar"/>
+        </w:rPr>
+        <w:t xml:space="preserve">R</w:t>
+      </w:r>
+      <w:r>
+        <w:t xml:space="preserve"> </w:t>
+      </w:r>
+      <w:r>
+        <w:t xml:space="preserve">using the</w:t>
+      </w:r>
+      <w:r>
+        <w:t xml:space="preserve"> </w:t>
+      </w:r>
+      <w:r>
+        <w:rPr>
+          <w:rStyle w:val="VerbatimChar"/>
+        </w:rPr>
+        <w:t xml:space="preserve">bootnet</w:t>
+      </w:r>
+      <w:r>
+        <w:t xml:space="preserve"> </w:t>
+      </w:r>
+      <w:r>
+        <w:t xml:space="preserve">package</w:t>
+      </w:r>
+      <w:r>
+        <w:t xml:space="preserve"> </w:t>
+      </w:r>
+      <w:r>
+        <w:t xml:space="preserve">(see Epskamp and Fried 2023, 2018)</w:t>
+      </w:r>
+      <w:r>
+        <w:t xml:space="preserve">. The bootstrap method results show the estimated centrality and the 95% confidence interval for each estimate.</w:t>
+      </w:r>
+    </w:p>
+    <w:p>
+      <w:pPr>
+        <w:pStyle w:val="BodyText"/>
+      </w:pPr>
+      <w:r>
+        <w:t xml:space="preserve">The GGM is an undirected model. It estimates whether two beliefs are conditionally related but not the direction of that relationship. This is the standard approach in exploratory belief-network research, where strong a priori commitments about which specific beliefs causally precede others are typically unavailable</w:t>
+      </w:r>
+      <w:r>
+        <w:t xml:space="preserve"> </w:t>
+      </w:r>
+      <w:r>
+        <w:t xml:space="preserve">(Epskamp, Borsboom, and Fried 2018)</w:t>
+      </w:r>
+      <w:r>
+        <w:t xml:space="preserve">. However, because a central question in this paper is whether beliefs are better understood as organized hierarchically or as a network, it is useful to assess whether the network’s structure, and in particular, whether a belief is estimated to be highly central depends on this choice of an undirected model. I therefore estimate a companion Bayesian network (BN) using the same 17 belief nodes.</w:t>
+      </w:r>
+      <w:r>
+        <w:rPr>
+          <w:rStyle w:val="FootnoteReference"/>
+        </w:rPr>
+        <w:footnoteReference w:id="17"/>
+      </w:r>
+      <w:r>
+        <w:t xml:space="preserve"> </w:t>
+      </w:r>
+      <w:r>
+        <w:t xml:space="preserve">Unlike the GGM, a BN is a directed acyclic graph, in which edges represent an estimated ordering between beliefs</w:t>
+      </w:r>
+      <w:r>
+        <w:t xml:space="preserve"> </w:t>
+      </w:r>
+      <w:r>
+        <w:t xml:space="preserve">(Koller and Friedman 2010; Pearl 2014)</w:t>
+      </w:r>
+      <w:r>
+        <w:t xml:space="preserve">. This offers a way to assess whether a given belief occupies an upstream,</w:t>
+      </w:r>
+      <w:r>
+        <w:t xml:space="preserve"> </w:t>
+      </w:r>
+      <w:r>
+        <w:t xml:space="preserve">“parent”</w:t>
+      </w:r>
+      <w:r>
+        <w:t xml:space="preserve"> </w:t>
+      </w:r>
+      <w:r>
+        <w:t xml:space="preserve">position relative to others, which is the the pattern a hierarchical account of belief systems would predict for deep core beliefs in particular. I learn the network structure using hill-climbing, tabu search, and constraint-based (PC) algorithms, each optimized via BIC or conditional independence testing</w:t>
+      </w:r>
+      <w:r>
+        <w:t xml:space="preserve"> </w:t>
+      </w:r>
+      <w:r>
+        <w:t xml:space="preserve">(Scutari, Graafland, and Gutiérrez 2019)</w:t>
+      </w:r>
+      <w:r>
+        <w:t xml:space="preserve">, and assess stability with a nonparametric bootstrap (500 resamples), retaining edges and their estimated direction that appear in at least 50% of resamples to construct an averaged network</w:t>
+      </w:r>
+      <w:r>
+        <w:t xml:space="preserve"> </w:t>
+      </w:r>
+      <w:r>
+        <w:t xml:space="preserve">(N. Friedman, Goldszmidt, and Wyner 2013)</w:t>
+      </w:r>
+      <w:r>
+        <w:t xml:space="preserve">. Robustness to missing data is checked via multiple imputation (</w:t>
+      </w:r>
+      <w:r>
+        <w:rPr>
+          <w:i/>
+          <w:iCs/>
+        </w:rPr>
+        <w:t xml:space="preserve">m</w:t>
+      </w:r>
+      <w:r>
+        <w:t xml:space="preserve"> </w:t>
+      </w:r>
+      <w:r>
+        <w:t xml:space="preserve">= 5)</w:t>
+      </w:r>
+      <w:r>
+        <w:t xml:space="preserve"> </w:t>
+      </w:r>
+      <w:r>
+        <w:t xml:space="preserve">(Buuren and Groothuis-Oudshoorn 2011)</w:t>
+      </w:r>
+      <w:r>
+        <w:t xml:space="preserve">. For each node, I calculate its out-degree (the number of other beliefs relative to which it occupies an upstream,</w:t>
+      </w:r>
+      <w:r>
+        <w:t xml:space="preserve"> </w:t>
+      </w:r>
+      <w:r>
+        <w:t xml:space="preserve">“parent”</w:t>
+      </w:r>
+      <w:r>
+        <w:t xml:space="preserve"> </w:t>
+      </w:r>
+      <w:r>
+        <w:t xml:space="preserve">position in the estimated graph) and the size of its Markov blanket (the parents, children, and co-parents needed to fully predict it)</w:t>
+      </w:r>
+      <w:r>
+        <w:t xml:space="preserve"> </w:t>
+      </w:r>
+      <w:r>
+        <w:t xml:space="preserve">(Pearl 2014)</w:t>
+      </w:r>
+      <w:r>
+        <w:t xml:space="preserve"> </w:t>
+      </w:r>
+      <w:r>
+        <w:t xml:space="preserve">as BN analogues to the GGM’s centrality measures.</w:t>
+      </w:r>
+    </w:p>
+    <w:p>
+      <w:pPr>
+        <w:pStyle w:val="BodyText"/>
+      </w:pPr>
+      <w:r>
+        <w:t xml:space="preserve">These algorithms are applied to cross-sectional, purely observational survey data. There is no temporal ordering, experimental manipulation, or causal-identification assumption (e.g., non-Gaussian error structure, as in LiNGAM) built into the analysis, so the estimated edge directions are not causally identified. Score-based algorithms such as hill-climbing and tabu search return a fully directed acyclic graph even when several directed graphs fit the data equally well (i.e., are Markov equivalent)</w:t>
+      </w:r>
+      <w:r>
+        <w:t xml:space="preserve"> </w:t>
+      </w:r>
+      <w:r>
+        <w:t xml:space="preserve">(Chickering 2002)</w:t>
+      </w:r>
+      <w:r>
+        <w:t xml:space="preserve">. The direction chosen is whichever fits the search criterion marginally better, not one the data have distinguished from its reverse. Constraint-based algorithms such as PC can identify some edge directions unambiguously but generally leave others unresolved absent further assumptions</w:t>
+      </w:r>
+      <w:r>
+        <w:t xml:space="preserve"> </w:t>
+      </w:r>
+      <w:r>
+        <w:t xml:space="preserve">(Spirtes, Glymour, and Scheines 2000)</w:t>
+      </w:r>
+      <w:r>
         <w:t xml:space="preserve">.</w:t>
       </w:r>
+      <w:r>
+        <w:t xml:space="preserve"> </w:t>
+      </w:r>
+      <w:r>
+        <w:t xml:space="preserve">“Upstream”</w:t>
+      </w:r>
+      <w:r>
+        <w:t xml:space="preserve"> </w:t>
+      </w:r>
+      <w:r>
+        <w:t xml:space="preserve">and</w:t>
+      </w:r>
+      <w:r>
+        <w:t xml:space="preserve"> </w:t>
+      </w:r>
+      <w:r>
+        <w:t xml:space="preserve">“downstream”</w:t>
+      </w:r>
+      <w:r>
+        <w:t xml:space="preserve"> </w:t>
+      </w:r>
+      <w:r>
+        <w:t xml:space="preserve">positions below should therefore be read as a property of how a belief’s distribution relates to others’ under the model’s search criteria, not as evidence that one belief causes another.</w:t>
+      </w:r>
     </w:p>
     <w:p>
       <w:pPr>
         <w:pStyle w:val="BodyText"/>
       </w:pPr>
       <w:r>
-        <w:t xml:space="preserve">The measures of centrality – betweenness, closeness, and strength – in the belief system network were calculated through a bootstrapping procedure using 1000 resamples of the data. The procedure was performed in</w:t>
-      </w:r>
-      <w:r>
-        <w:t xml:space="preserve"> </w:t>
-      </w:r>
-      <w:r>
-        <w:rPr>
-          <w:rStyle w:val="VerbatimChar"/>
-        </w:rPr>
-        <w:t xml:space="preserve">R</w:t>
-      </w:r>
-      <w:r>
-        <w:t xml:space="preserve"> </w:t>
-      </w:r>
-      <w:r>
-        <w:t xml:space="preserve">using the</w:t>
-      </w:r>
-      <w:r>
-        <w:t xml:space="preserve"> </w:t>
-      </w:r>
-      <w:r>
-        <w:rPr>
-          <w:rStyle w:val="VerbatimChar"/>
-        </w:rPr>
-        <w:t xml:space="preserve">bootnet</w:t>
-      </w:r>
-      <w:r>
-        <w:t xml:space="preserve"> </w:t>
-      </w:r>
-      <w:r>
-        <w:t xml:space="preserve">package</w:t>
-      </w:r>
-      <w:r>
-        <w:t xml:space="preserve"> </w:t>
-      </w:r>
-      <w:r>
-        <w:t xml:space="preserve">(See Epskamp and Fried 2023, 2018)</w:t>
-      </w:r>
-      <w:r>
-        <w:t xml:space="preserve">. The bootstrap method results show the estimated centrality and the 95% confidence interval for each estimate.</w:t>
-      </w:r>
-    </w:p>
-    <w:p>
-      <w:pPr>
-        <w:pStyle w:val="BodyText"/>
-      </w:pPr>
-      <w:r>
-        <w:t xml:space="preserve">The GGM is an undirected model. It estimates whether two beliefs are conditionally related but not the direction of that relationship. This is the standard approach in exploratory belief-network research, where strong a priori commitments about which specific beliefs causally precede others are typically unavailable</w:t>
-      </w:r>
-      <w:r>
-        <w:t xml:space="preserve"> </w:t>
-      </w:r>
-      <w:r>
-        <w:t xml:space="preserve">(Epskamp, Borsboom, and Fried 2018)</w:t>
-      </w:r>
-      <w:r>
-        <w:t xml:space="preserve">. However, because a central question in this paper is whether beliefs are better understood as organized hierarchically or as a network, it is useful to assess whether the network’s structure – and in particular, whether a belief is estimated to be highly central – depends on this choice of an undirected model. I therefore estimate a companion Bayesian network (BN) using the same 17 belief nodes.</w:t>
-      </w:r>
-      <w:r>
-        <w:rPr>
-          <w:rStyle w:val="FootnoteReference"/>
-        </w:rPr>
-        <w:footnoteReference w:id="17"/>
-      </w:r>
-      <w:r>
-        <w:t xml:space="preserve"> </w:t>
-      </w:r>
-      <w:r>
-        <w:t xml:space="preserve">Unlike the GGM, a BN is a directed acyclic graph, in which edges represent an estimated ordering between beliefs. This offers a way to assess whether a given belief occupies an upstream,</w:t>
-      </w:r>
-      <w:r>
-        <w:t xml:space="preserve"> </w:t>
-      </w:r>
-      <w:r>
-        <w:t xml:space="preserve">“parent”</w:t>
-      </w:r>
-      <w:r>
-        <w:t xml:space="preserve"> </w:t>
-      </w:r>
-      <w:r>
-        <w:t xml:space="preserve">position relative to others – the pattern a hierarchical account of belief systems would predict for deep core beliefs in particular. I learn the network structure using hill-climbing, tabu search, and constraint-based (PC) algorithms, each optimized via BIC or conditional independence testing, and assess stability with a nonparametric bootstrap (500 resamples), retaining edges and their estimated direction that appear in at least 50% of resamples to construct an averaged network. Robustness to missing data is checked via multiple imputation (</w:t>
-      </w:r>
-      <w:r>
-        <w:rPr>
-          <w:i/>
-          <w:iCs/>
-        </w:rPr>
-        <w:t xml:space="preserve">m</w:t>
-      </w:r>
-      <w:r>
-        <w:t xml:space="preserve"> </w:t>
-      </w:r>
-      <w:r>
-        <w:t xml:space="preserve">= 5). For each node, I calculate its out-degree (the number of other beliefs relative to which it occupies an upstream,</w:t>
-      </w:r>
-      <w:r>
-        <w:t xml:space="preserve"> </w:t>
-      </w:r>
-      <w:r>
-        <w:t xml:space="preserve">“parent”</w:t>
-      </w:r>
-      <w:r>
-        <w:t xml:space="preserve"> </w:t>
-      </w:r>
-      <w:r>
-        <w:t xml:space="preserve">position in the estimated graph) and the size of its Markov blanket (the parents, children, and co-parents needed to fully predict it) as BN analogues to the GGM’s centrality measures.</w:t>
-      </w:r>
-    </w:p>
-    <w:p>
-      <w:pPr>
-        <w:pStyle w:val="BodyText"/>
-      </w:pPr>
-      <w:r>
-        <w:rPr>
-          <w:b/>
-          <w:bCs/>
-        </w:rPr>
-        <w:t xml:space="preserve">A caveat on directionality.</w:t>
-      </w:r>
-      <w:r>
-        <w:t xml:space="preserve"> </w:t>
-      </w:r>
-      <w:r>
-        <w:t xml:space="preserve">These algorithms are applied to cross-sectional, purely observational survey data. There is no temporal ordering, experimental manipulation, or causal-identification assumption (e.g., non-Gaussian error structure, as in LiNGAM) built into the analysis, so the estimated edge directions are not causally identified. Score-based algorithms such as hill-climbing and tabu search return a fully directed acyclic graph even when several directed graphs fit the data equally well (i.e., are Markov equivalent). The direction chosen is whichever fits the search criterion marginally better, not one the data have distinguished from its reverse. Constraint-based algorithms such as PC can identify some edge directions unambiguously but generally leave others unresolved absent further assumptions.</w:t>
-      </w:r>
-      <w:r>
-        <w:t xml:space="preserve"> </w:t>
-      </w:r>
-      <w:r>
-        <w:t xml:space="preserve">“Upstream”</w:t>
-      </w:r>
-      <w:r>
-        <w:t xml:space="preserve"> </w:t>
-      </w:r>
-      <w:r>
-        <w:t xml:space="preserve">and</w:t>
-      </w:r>
-      <w:r>
-        <w:t xml:space="preserve"> </w:t>
-      </w:r>
-      <w:r>
-        <w:t xml:space="preserve">“downstream”</w:t>
-      </w:r>
-      <w:r>
-        <w:t xml:space="preserve"> </w:t>
-      </w:r>
-      <w:r>
-        <w:t xml:space="preserve">positions below should therefore be read as a property of how a belief’s distribution relates to others’ under the model’s search criteria, not as evidence that one belief causes another.</w:t>
-      </w:r>
-    </w:p>
-    <w:p>
-      <w:pPr>
-        <w:pStyle w:val="BodyText"/>
-      </w:pPr>
-      <w:r>
-        <w:t xml:space="preserve">In the following analysis, I first examine the climate change belief network, which includes deep core beliefs (cultural worldviews, ideology, partisanship, NEP scale), policy core beliefs (climate change is happening, climate change risk, scientific consensus), and secondary beliefs/policy preference (support for various policy measures). Then, I explore the betweenness, closeness, and strength centrality measures of the nodes in the climate change belief network to identify which beliefs are most central.</w:t>
+        <w:t xml:space="preserve">In the following analysis, I first estimate the climate change belief network as a GGM, which includes deep core beliefs (cultural worldviews, ideology, partisanship, NEP scale), policy core beliefs (climate change is happening, climate change risk, scientific consensus), and secondary beliefs/policy preference (support for various policy measures), and examine the betweenness, closeness, and strength centrality measures of its nodes to identify which beliefs are most central. I then compare these results to a companion Bayesian network estimated using the same nodes, to assess whether a belief’s structural importance depends on the choice of an undirected versus directed model.</w:t>
       </w:r>
     </w:p>
     <w:bookmarkEnd w:id="18"/>
-    <w:bookmarkStart w:id="19" w:name="data-and-code-availability"/>
-    <w:p>
-      <w:pPr>
-        <w:pStyle w:val="Heading2"/>
-      </w:pPr>
-      <w:r>
-        <w:t xml:space="preserve">Data and Code Availability</w:t>
+    <w:bookmarkEnd w:id="19"/>
+    <w:bookmarkStart w:id="35" w:name="results"/>
+    <w:p>
+      <w:pPr>
+        <w:pStyle w:val="Heading1"/>
+      </w:pPr>
+      <w:r>
+        <w:t xml:space="preserve">Results</w:t>
       </w:r>
     </w:p>
     <w:p>
@@ -3660,53 +3709,7 @@
         <w:pStyle w:val="FirstParagraph"/>
       </w:pPr>
       <w:r>
-        <w:t xml:space="preserve">This study was not preregistered. No a priori power analysis was conducted; the bootstrap correlation-stability coefficients reported in the Results section, all at or above the 0.50 threshold Epskamp et al.</w:t>
-      </w:r>
-      <w:r>
-        <w:t xml:space="preserve"> </w:t>
-      </w:r>
-      <w:r>
-        <w:t xml:space="preserve">(2018)</w:t>
-      </w:r>
-      <w:r>
-        <w:t xml:space="preserve"> </w:t>
-      </w:r>
-      <w:r>
-        <w:t xml:space="preserve">recommend, serve as a post hoc check that the sample size supports stable centrality estimates. The data and analysis code are organized in a version-controlled repository – including the raw and derived survey data, all analysis scripts, and the manuscript source – with package versions pinned via</w:t>
-      </w:r>
-      <w:r>
-        <w:t xml:space="preserve"> </w:t>
-      </w:r>
-      <w:r>
-        <w:rPr>
-          <w:rStyle w:val="VerbatimChar"/>
-        </w:rPr>
-        <w:t xml:space="preserve">renv</w:t>
-      </w:r>
-      <w:r>
-        <w:t xml:space="preserve"> </w:t>
-      </w:r>
-      <w:r>
-        <w:t xml:space="preserve">to support exact reproducibility.</w:t>
-      </w:r>
-    </w:p>
-    <w:bookmarkEnd w:id="19"/>
-    <w:bookmarkEnd w:id="20"/>
-    <w:bookmarkStart w:id="36" w:name="results"/>
-    <w:p>
-      <w:pPr>
-        <w:pStyle w:val="Heading1"/>
-      </w:pPr>
-      <w:r>
-        <w:t xml:space="preserve">Results</w:t>
-      </w:r>
-    </w:p>
-    <w:p>
-      <w:pPr>
-        <w:pStyle w:val="FirstParagraph"/>
-      </w:pPr>
-      <w:r>
-        <w:t xml:space="preserve">The results for the climate change belief network are shown in</w:t>
+        <w:t xml:space="preserve">The results for the GGM climate change belief network are shown in</w:t>
       </w:r>
       <w:r>
         <w:t xml:space="preserve"> </w:t>
@@ -3753,7 +3756,7 @@
       <w:tr>
         <w:tc>
           <w:tcPr/>
-          <w:bookmarkStart w:id="24" w:name="fig-beliefNetNetwork"/>
+          <w:bookmarkStart w:id="23" w:name="fig-beliefNetNetwork"/>
           <w:p>
             <w:pPr>
               <w:jc w:val="center"/>
@@ -3777,18 +3780,18 @@
                 <wp:inline>
                   <wp:extent cx="5334000" cy="4267200"/>
                   <wp:effectExtent b="0" l="0" r="0" t="0"/>
-                  <wp:docPr descr="" title="" id="22" name="Picture"/>
+                  <wp:docPr descr="" title="" id="21" name="Picture"/>
                   <a:graphic>
                     <a:graphicData uri="http://schemas.openxmlformats.org/drawingml/2006/picture">
                       <pic:pic>
                         <pic:nvPicPr>
-                          <pic:cNvPr descr="climate-beliefs_files/figure-docx/fig-beliefNetNetwork-1.png" id="23" name="Picture"/>
+                          <pic:cNvPr descr="climate-beliefs_files/figure-docx/fig-beliefNetNetwork-1.png" id="22" name="Picture"/>
                           <pic:cNvPicPr>
                             <a:picLocks noChangeArrowheads="1" noChangeAspect="1"/>
                           </pic:cNvPicPr>
                         </pic:nvPicPr>
                         <pic:blipFill>
-                          <a:blip r:embed="rId21"/>
+                          <a:blip r:embed="rId20"/>
                           <a:stretch>
                             <a:fillRect/>
                           </a:stretch>
@@ -3815,7 +3818,7 @@
               </w:drawing>
             </w:r>
           </w:p>
-          <w:bookmarkEnd w:id="24"/>
+          <w:bookmarkEnd w:id="23"/>
         </w:tc>
       </w:tr>
     </w:tbl>
@@ -3854,7 +3857,7 @@
       <w:tr>
         <w:tc>
           <w:tcPr/>
-          <w:bookmarkStart w:id="28" w:name="fig-cent"/>
+          <w:bookmarkStart w:id="27" w:name="fig-cent"/>
           <w:p>
             <w:pPr>
               <w:jc w:val="center"/>
@@ -3878,18 +3881,18 @@
                 <wp:inline>
                   <wp:extent cx="5334000" cy="2133600"/>
                   <wp:effectExtent b="0" l="0" r="0" t="0"/>
-                  <wp:docPr descr="" title="" id="26" name="Picture"/>
+                  <wp:docPr descr="" title="" id="25" name="Picture"/>
                   <a:graphic>
                     <a:graphicData uri="http://schemas.openxmlformats.org/drawingml/2006/picture">
                       <pic:pic>
                         <pic:nvPicPr>
-                          <pic:cNvPr descr="centralPlots.png" id="27" name="Picture"/>
+                          <pic:cNvPr descr="centralPlots.png" id="26" name="Picture"/>
                           <pic:cNvPicPr>
                             <a:picLocks noChangeArrowheads="1" noChangeAspect="1"/>
                           </pic:cNvPicPr>
                         </pic:nvPicPr>
                         <pic:blipFill>
-                          <a:blip r:embed="rId25"/>
+                          <a:blip r:embed="rId24"/>
                           <a:stretch>
                             <a:fillRect/>
                           </a:stretch>
@@ -3916,7 +3919,7 @@
               </w:drawing>
             </w:r>
           </w:p>
-          <w:bookmarkEnd w:id="28"/>
+          <w:bookmarkEnd w:id="27"/>
         </w:tc>
       </w:tr>
     </w:tbl>
@@ -3939,7 +3942,7 @@
         </w:r>
       </w:hyperlink>
       <w:r>
-        <w:t xml:space="preserve">, egalitarianism is the node with the highest betweenness centrality, by a wide margin, with 61.89. Next is climate change risk perceptions at 41.19, followed closely by fatalism at 40.11, and individualism with 35.62. Nodes high in betweenness sit on the shortest path between the other nodes in the network and act as a bridge between other beliefs; therefore, egalitarianism works to connect beliefs in the network.</w:t>
+        <w:t xml:space="preserve">, egalitarianism has the highest point estimate for betweenness centrality, with 61.89. Next is climate change risk perceptions at 41.19, followed closely by fatalism at 40.11, and individualism with 35.62. Nodes high in betweenness sit on the shortest path between the other nodes in the network and act as a bridge between other beliefs; therefore, egalitarianism works to connect beliefs in the network.</w:t>
       </w:r>
     </w:p>
     <w:p>
@@ -4036,7 +4039,24 @@
         <w:t xml:space="preserve">= 0.099. The support for an international agreement had a strength centrality of 1.21 and, similar to EPA regulations its strongest partial correlations were with the other policy support measures including EPA regulations (0.28), a carbon tax (0.216), cap-and-trade (0.172), and geoengineering (0.138) as well as policy domain belief of climate change risk (0.127) and the core belief of egalitarianism (0.104). Finally, the climate change risk node had a strength centrality of 1.2. It was most highly correlated with the other policy core beliefs, including the belief that climate change is happening and that there is a scientific consensus on climate change.</w:t>
       </w:r>
     </w:p>
-    <w:bookmarkStart w:id="29" w:name="ggm-robustness-checks"/>
+    <w:p>
+      <w:pPr>
+        <w:pStyle w:val="BodyText"/>
+      </w:pPr>
+      <w:r>
+        <w:t xml:space="preserve">I also conducted pairwise bootstrap difference tests for all 136 possible node pairs on both betweenness and strength</w:t>
+      </w:r>
+      <w:r>
+        <w:t xml:space="preserve"> </w:t>
+      </w:r>
+      <w:r>
+        <w:t xml:space="preserve">(See Epskamp and Fried 2023)</w:t>
+      </w:r>
+      <w:r>
+        <w:t xml:space="preserve">. 31 of 136 pairwise comparisons were statistically significant for betweenness, and 82 of 136 were significant for strength. Among the five nodes with the highest betweenness centrality, none of the 10 pairwise comparisons reached significance, meaning their betweenness centrality is not statistically distinguishable from one another – so egalitarianism’s rank as most central on betweenness is a point estimate, not a difference from climate change risk, fatalism, or individualism that the data can support. Among the five nodes with the highest strength centrality, only 1 of 10 pairwise comparisons was significant, so the strength ranking of EPA regulations, climate change risk, and support for an international agreement should likewise be read with caution.</w:t>
+      </w:r>
+    </w:p>
+    <w:bookmarkStart w:id="28" w:name="ggm-robustness-checks"/>
     <w:p>
       <w:pPr>
         <w:pStyle w:val="Heading2"/>
@@ -4050,7 +4070,7 @@
         <w:pStyle w:val="FirstParagraph"/>
       </w:pPr>
       <w:r>
-        <w:t xml:space="preserve">To assess the stability of the reported network and its centrality estimates, I conducted four additional checks. First, a case-dropping bootstrap procedure estimated the correlation stability (CS) of each centrality measure – the proportion of cases that can be dropped while maintaining a correlation of at least 0.7 with the full-sample estimates. The CS coefficients for betweenness (0.52), closeness (0.75), and strength (0.75) all meet or exceed the 0.50 threshold Epskamp et al.</w:t>
+        <w:t xml:space="preserve">To assess the stability of the reported network and its centrality estimates, I conducted three additional checks. First, a case-dropping bootstrap procedure estimated the correlation stability (CS) of each centrality measure – the proportion of cases that can be dropped while maintaining a correlation of at least 0.7 with the full-sample estimates. The CS coefficients for betweenness (0.52), closeness (0.75), and strength (0.75) all meet or exceed the 0.50 threshold Epskamp et al.</w:t>
       </w:r>
       <w:r>
         <w:t xml:space="preserve"> </w:t>
@@ -4096,31 +4116,14 @@
         <w:t xml:space="preserve">R package. The cross-validated network has 86 edges, compared to 85 from the EBIC-selected network – a materially similar level of sparsity.</w:t>
       </w:r>
     </w:p>
-    <w:p>
-      <w:pPr>
-        <w:pStyle w:val="BodyText"/>
-      </w:pPr>
-      <w:r>
-        <w:t xml:space="preserve">Finally, I conducted pairwise bootstrap difference tests for all 136 possible node pairs on both betweenness and strength</w:t>
-      </w:r>
-      <w:r>
-        <w:t xml:space="preserve"> </w:t>
-      </w:r>
-      <w:r>
-        <w:t xml:space="preserve">(See Epskamp and Fried 2023)</w:t>
-      </w:r>
-      <w:r>
-        <w:t xml:space="preserve">. 31 of 136 pairwise comparisons were statistically significant for betweenness, and 82 of 136 were significant for strength. Among the five nodes with the highest betweenness centrality, none of the 10 pairwise comparisons reached significance, meaning their betweenness centrality is not statistically distinguishable from one another. Among the five nodes with the highest strength centrality, only 1 of 10 pairwise comparisons was significant.</w:t>
-      </w:r>
-    </w:p>
-    <w:bookmarkEnd w:id="29"/>
-    <w:bookmarkStart w:id="35" w:name="bayesian-network-robustness-check"/>
+    <w:bookmarkEnd w:id="28"/>
+    <w:bookmarkStart w:id="34" w:name="bayesian-network"/>
     <w:p>
       <w:pPr>
         <w:pStyle w:val="Heading2"/>
       </w:pPr>
       <w:r>
-        <w:t xml:space="preserve">Bayesian Network Robustness Check</w:t>
+        <w:t xml:space="preserve">Bayesian Network</w:t>
       </w:r>
     </w:p>
     <w:p>
@@ -4161,7 +4164,7 @@
       <w:tr>
         <w:tc>
           <w:tcPr/>
-          <w:bookmarkStart w:id="33" w:name="fig-bn-dag"/>
+          <w:bookmarkStart w:id="32" w:name="fig-bn-dag"/>
           <w:p>
             <w:pPr>
               <w:jc w:val="center"/>
@@ -4185,18 +4188,18 @@
                 <wp:inline>
                   <wp:extent cx="5334000" cy="4445000"/>
                   <wp:effectExtent b="0" l="0" r="0" t="0"/>
-                  <wp:docPr descr="" title="" id="31" name="Picture"/>
+                  <wp:docPr descr="" title="" id="30" name="Picture"/>
                   <a:graphic>
                     <a:graphicData uri="http://schemas.openxmlformats.org/drawingml/2006/picture">
                       <pic:pic>
                         <pic:nvPicPr>
-                          <pic:cNvPr descr="bn_dag.png" id="32" name="Picture"/>
+                          <pic:cNvPr descr="bn_dag.png" id="31" name="Picture"/>
                           <pic:cNvPicPr>
                             <a:picLocks noChangeArrowheads="1" noChangeAspect="1"/>
                           </pic:cNvPicPr>
                         </pic:nvPicPr>
                         <pic:blipFill>
-                          <a:blip r:embed="rId30"/>
+                          <a:blip r:embed="rId29"/>
                           <a:stretch>
                             <a:fillRect/>
                           </a:stretch>
@@ -4223,7 +4226,7 @@
               </w:drawing>
             </w:r>
           </w:p>
-          <w:bookmarkEnd w:id="33"/>
+          <w:bookmarkEnd w:id="32"/>
         </w:tc>
       </w:tr>
     </w:tbl>
@@ -4310,7 +4313,7 @@
       <w:tr>
         <w:tc>
           <w:tcPr/>
-          <w:bookmarkStart w:id="34" w:name="tbl-bn-comparison"/>
+          <w:bookmarkStart w:id="33" w:name="tbl-bn-comparison"/>
           <w:p>
             <w:pPr>
               <w:jc w:val="center"/>
@@ -6253,14 +6256,14 @@
               </w:tc>
             </w:tr>
           </w:tbl>
-          <w:bookmarkEnd w:id="34"/>
+          <w:bookmarkEnd w:id="33"/>
           <w:p/>
         </w:tc>
       </w:tr>
     </w:tbl>
+    <w:bookmarkEnd w:id="34"/>
     <w:bookmarkEnd w:id="35"/>
-    <w:bookmarkEnd w:id="36"/>
-    <w:bookmarkStart w:id="37" w:name="discussion-and-conclusion"/>
+    <w:bookmarkStart w:id="36" w:name="discussion-and-conclusion"/>
     <w:p>
       <w:pPr>
         <w:pStyle w:val="Heading1"/>
@@ -6348,7 +6351,7 @@
         <w:pStyle w:val="BodyText"/>
       </w:pPr>
       <w:r>
-        <w:t xml:space="preserve">For the measures of closeness and betweenness centrality, egalitarianism was the most central node in the network. Closeness and betweenness centrality both address the lengths of the paths between nodes, with closeness meaning that a node influences other nodes because of its short path, and betweenness meaning that a node is influential because it sits on the path between other nodes. Beliefs high in closeness and betweenness act as gateways to other beliefs. These findings are consistent with the notion that cultural worldviews are deep core beliefs structurally connected to other beliefs. Egalitarianism in particular has been shown to be associated with environmental and climate change views</w:t>
+        <w:t xml:space="preserve">For the measures of closeness and betweenness centrality, egalitarianism had the highest point estimate among the nodes in the network, though, as noted above, this rank is not statistically distinguishable from several other nodes. Closeness and betweenness centrality both address the lengths of the paths between nodes, with closeness meaning that a node influences other nodes because of its short path, and betweenness meaning that a node is influential because it sits on the path between other nodes. Beliefs high in closeness and betweenness act as gateways to other beliefs. These findings are consistent with the notion that cultural worldviews are deep core beliefs structurally connected to other beliefs. Egalitarianism in particular has been shown to be associated with environmental and climate change views</w:t>
       </w:r>
       <w:r>
         <w:t xml:space="preserve"> </w:t>
@@ -6420,7 +6423,7 @@
         </w:r>
       </w:hyperlink>
       <w:r>
-        <w:t xml:space="preserve">, the EPA node has the highest strength centrality, followed closely by the climate change risk node, and finally the international agreement node. The strength centrality of views about EPA regulations and an international agreement to address climate change support the importance of solution aversion – opposition to climate policies – within the climate change belief system.</w:t>
+        <w:t xml:space="preserve">, the EPA node has the highest point estimate for strength centrality, followed closely by the climate change risk node, and finally the international agreement node; as noted above, few of the pairwise differences among these top strength nodes reached significance, so this ranking should also be read with caution. The strength centrality of views about EPA regulations and an international agreement to address climate change support the importance of solution aversion – opposition to climate policies – within the climate change belief system.</w:t>
       </w:r>
     </w:p>
     <w:p>
@@ -6537,8 +6540,8 @@
         <w:br w:type="page"/>
       </w:r>
     </w:p>
-    <w:bookmarkEnd w:id="37"/>
-    <w:bookmarkStart w:id="39" w:name="appendix"/>
+    <w:bookmarkEnd w:id="36"/>
+    <w:bookmarkStart w:id="38" w:name="appendix"/>
     <w:p>
       <w:pPr>
         <w:pStyle w:val="Heading1"/>
@@ -6582,7 +6585,7 @@
       <w:tr>
         <w:tc>
           <w:tcPr/>
-          <w:bookmarkStart w:id="38" w:name="tbl-descript"/>
+          <w:bookmarkStart w:id="37" w:name="tbl-descript"/>
           <w:p>
             <w:pPr>
               <w:jc w:val="center"/>
@@ -7726,7 +7729,7 @@
               </w:tc>
             </w:tr>
           </w:tbl>
-          <w:bookmarkEnd w:id="38"/>
+          <w:bookmarkEnd w:id="37"/>
           <w:p/>
         </w:tc>
       </w:tr>
@@ -7736,45 +7739,122 @@
         <w:br w:type="page"/>
       </w:r>
     </w:p>
+    <w:bookmarkEnd w:id="38"/>
+    <w:bookmarkStart w:id="129" w:name="references"/>
+    <w:p>
+      <w:pPr>
+        <w:pStyle w:val="Heading1"/>
+      </w:pPr>
+      <w:r>
+        <w:t xml:space="preserve">References</w:t>
+      </w:r>
+    </w:p>
+    <w:bookmarkStart w:id="128" w:name="refs"/>
+    <w:bookmarkStart w:id="39" w:name="ref-boutylineBeliefNetworkAnalysis2017"/>
+    <w:p>
+      <w:pPr>
+        <w:pStyle w:val="Bibliography"/>
+      </w:pPr>
+      <w:r>
+        <w:t xml:space="preserve">Boutyline, Andrei, and Stephen Vaisey. 2017.</w:t>
+      </w:r>
+      <w:r>
+        <w:t xml:space="preserve"> </w:t>
+      </w:r>
+      <w:r>
+        <w:t xml:space="preserve">“Belief</w:t>
+      </w:r>
+      <w:r>
+        <w:t xml:space="preserve"> </w:t>
+      </w:r>
+      <w:r>
+        <w:t xml:space="preserve">Network Analysis</w:t>
+      </w:r>
+      <w:r>
+        <w:t xml:space="preserve">:</w:t>
+      </w:r>
+      <w:r>
+        <w:t xml:space="preserve"> </w:t>
+      </w:r>
+      <w:r>
+        <w:t xml:space="preserve">A Relational Approach</w:t>
+      </w:r>
+      <w:r>
+        <w:t xml:space="preserve"> </w:t>
+      </w:r>
+      <w:r>
+        <w:t xml:space="preserve">to</w:t>
+      </w:r>
+      <w:r>
+        <w:t xml:space="preserve"> </w:t>
+      </w:r>
+      <w:r>
+        <w:t xml:space="preserve">Understanding</w:t>
+      </w:r>
+      <w:r>
+        <w:t xml:space="preserve"> </w:t>
+      </w:r>
+      <w:r>
+        <w:t xml:space="preserve">the</w:t>
+      </w:r>
+      <w:r>
+        <w:t xml:space="preserve"> </w:t>
+      </w:r>
+      <w:r>
+        <w:t xml:space="preserve">Structure</w:t>
+      </w:r>
+      <w:r>
+        <w:t xml:space="preserve"> </w:t>
+      </w:r>
+      <w:r>
+        <w:t xml:space="preserve">of</w:t>
+      </w:r>
+      <w:r>
+        <w:t xml:space="preserve"> </w:t>
+      </w:r>
+      <w:r>
+        <w:t xml:space="preserve">Attitudes</w:t>
+      </w:r>
+      <w:r>
+        <w:t xml:space="preserve">.”</w:t>
+      </w:r>
+      <w:r>
+        <w:t xml:space="preserve"> </w:t>
+      </w:r>
+      <w:r>
+        <w:rPr>
+          <w:i/>
+          <w:iCs/>
+        </w:rPr>
+        <w:t xml:space="preserve">American Journal of Sociology</w:t>
+      </w:r>
+      <w:r>
+        <w:t xml:space="preserve"> </w:t>
+      </w:r>
+      <w:r>
+        <w:t xml:space="preserve">122(5): 1371–1447.</w:t>
+      </w:r>
+    </w:p>
     <w:bookmarkEnd w:id="39"/>
-    <w:bookmarkStart w:id="122" w:name="references"/>
-    <w:p>
-      <w:pPr>
-        <w:pStyle w:val="Heading1"/>
-      </w:pPr>
-      <w:r>
-        <w:t xml:space="preserve">References</w:t>
-      </w:r>
-    </w:p>
-    <w:bookmarkStart w:id="121" w:name="refs"/>
-    <w:bookmarkStart w:id="40" w:name="ref-boutylineBeliefNetworkAnalysis2017"/>
+    <w:bookmarkStart w:id="40" w:name="ref-brandtWhatCentralPolitical2019"/>
     <w:p>
       <w:pPr>
         <w:pStyle w:val="Bibliography"/>
       </w:pPr>
       <w:r>
-        <w:t xml:space="preserve">Boutyline, Andrei, and Stephen Vaisey. 2017.</w:t>
-      </w:r>
-      <w:r>
-        <w:t xml:space="preserve"> </w:t>
-      </w:r>
-      <w:r>
-        <w:t xml:space="preserve">“Belief</w:t>
-      </w:r>
-      <w:r>
-        <w:t xml:space="preserve"> </w:t>
-      </w:r>
-      <w:r>
-        <w:t xml:space="preserve">Network Analysis</w:t>
-      </w:r>
-      <w:r>
-        <w:t xml:space="preserve">:</w:t>
-      </w:r>
-      <w:r>
-        <w:t xml:space="preserve"> </w:t>
-      </w:r>
-      <w:r>
-        <w:t xml:space="preserve">A Relational Approach</w:t>
+        <w:t xml:space="preserve">Brandt, Mark J., Chris G. Sibley, and Danny Osborne. 2019.</w:t>
+      </w:r>
+      <w:r>
+        <w:t xml:space="preserve"> </w:t>
+      </w:r>
+      <w:r>
+        <w:t xml:space="preserve">“What</w:t>
+      </w:r>
+      <w:r>
+        <w:t xml:space="preserve"> </w:t>
+      </w:r>
+      <w:r>
+        <w:t xml:space="preserve">Is Central</w:t>
       </w:r>
       <w:r>
         <w:t xml:space="preserve"> </w:t>
@@ -7786,19 +7866,60 @@
         <w:t xml:space="preserve"> </w:t>
       </w:r>
       <w:r>
-        <w:t xml:space="preserve">Understanding</w:t>
-      </w:r>
-      <w:r>
-        <w:t xml:space="preserve"> </w:t>
-      </w:r>
-      <w:r>
-        <w:t xml:space="preserve">the</w:t>
-      </w:r>
-      <w:r>
-        <w:t xml:space="preserve"> </w:t>
-      </w:r>
-      <w:r>
-        <w:t xml:space="preserve">Structure</w:t>
+        <w:t xml:space="preserve">Political Belief System Networks</w:t>
+      </w:r>
+      <w:r>
+        <w:t xml:space="preserve">?”</w:t>
+      </w:r>
+      <w:r>
+        <w:t xml:space="preserve"> </w:t>
+      </w:r>
+      <w:r>
+        <w:rPr>
+          <w:i/>
+          <w:iCs/>
+        </w:rPr>
+        <w:t xml:space="preserve">Personality and Social Psychology Bulletin</w:t>
+      </w:r>
+      <w:r>
+        <w:t xml:space="preserve"> </w:t>
+      </w:r>
+      <w:r>
+        <w:t xml:space="preserve">45(9): 1352–64.</w:t>
+      </w:r>
+    </w:p>
+    <w:bookmarkEnd w:id="40"/>
+    <w:bookmarkStart w:id="41" w:name="ref-brandtEvaluatingBeliefSystem2021"/>
+    <w:p>
+      <w:pPr>
+        <w:pStyle w:val="Bibliography"/>
+      </w:pPr>
+      <w:r>
+        <w:t xml:space="preserve">Brandt, Mark J., and Willem W. A. Sleegers. 2021.</w:t>
+      </w:r>
+      <w:r>
+        <w:t xml:space="preserve"> </w:t>
+      </w:r>
+      <w:r>
+        <w:t xml:space="preserve">“Evaluating</w:t>
+      </w:r>
+      <w:r>
+        <w:t xml:space="preserve"> </w:t>
+      </w:r>
+      <w:r>
+        <w:t xml:space="preserve">Belief System Networks</w:t>
+      </w:r>
+      <w:r>
+        <w:t xml:space="preserve"> </w:t>
+      </w:r>
+      <w:r>
+        <w:t xml:space="preserve">as a</w:t>
+      </w:r>
+      <w:r>
+        <w:t xml:space="preserve"> </w:t>
+      </w:r>
+      <w:r>
+        <w:t xml:space="preserve">Theory</w:t>
       </w:r>
       <w:r>
         <w:t xml:space="preserve"> </w:t>
@@ -7810,7 +7931,7 @@
         <w:t xml:space="preserve"> </w:t>
       </w:r>
       <w:r>
-        <w:t xml:space="preserve">Attitudes</w:t>
+        <w:t xml:space="preserve">Political Belief System Dynamics</w:t>
       </w:r>
       <w:r>
         <w:t xml:space="preserve">.”</w:t>
@@ -7823,112 +7944,59 @@
           <w:i/>
           <w:iCs/>
         </w:rPr>
-        <w:t xml:space="preserve">American Journal of Sociology</w:t>
-      </w:r>
-      <w:r>
-        <w:t xml:space="preserve"> </w:t>
-      </w:r>
-      <w:r>
-        <w:t xml:space="preserve">122(5): 1371–1447.</w:t>
-      </w:r>
-    </w:p>
-    <w:bookmarkEnd w:id="40"/>
-    <w:bookmarkStart w:id="41" w:name="ref-brandtWhatCentralPolitical2019"/>
+        <w:t xml:space="preserve">Personality and Social Psychology Review</w:t>
+      </w:r>
+      <w:r>
+        <w:t xml:space="preserve"> </w:t>
+      </w:r>
+      <w:r>
+        <w:t xml:space="preserve">25(2): 159–85.</w:t>
+      </w:r>
+    </w:p>
+    <w:bookmarkEnd w:id="41"/>
+    <w:bookmarkStart w:id="42" w:name="ref-brigantiTutorialBayesianNetworks2023"/>
     <w:p>
       <w:pPr>
         <w:pStyle w:val="Bibliography"/>
       </w:pPr>
       <w:r>
-        <w:t xml:space="preserve">Brandt, Mark J., Chris G. Sibley, and Danny Osborne. 2019.</w:t>
-      </w:r>
-      <w:r>
-        <w:t xml:space="preserve"> </w:t>
-      </w:r>
-      <w:r>
-        <w:t xml:space="preserve">“What</w:t>
-      </w:r>
-      <w:r>
-        <w:t xml:space="preserve"> </w:t>
-      </w:r>
-      <w:r>
-        <w:t xml:space="preserve">Is Central</w:t>
-      </w:r>
-      <w:r>
-        <w:t xml:space="preserve"> </w:t>
-      </w:r>
-      <w:r>
-        <w:t xml:space="preserve">to</w:t>
-      </w:r>
-      <w:r>
-        <w:t xml:space="preserve"> </w:t>
-      </w:r>
-      <w:r>
-        <w:t xml:space="preserve">Political Belief System Networks</w:t>
-      </w:r>
-      <w:r>
-        <w:t xml:space="preserve">?”</w:t>
-      </w:r>
-      <w:r>
-        <w:t xml:space="preserve"> </w:t>
-      </w:r>
-      <w:r>
-        <w:rPr>
-          <w:i/>
-          <w:iCs/>
-        </w:rPr>
-        <w:t xml:space="preserve">Personality and Social Psychology Bulletin</w:t>
-      </w:r>
-      <w:r>
-        <w:t xml:space="preserve"> </w:t>
-      </w:r>
-      <w:r>
-        <w:t xml:space="preserve">45(9): 1352–64.</w:t>
-      </w:r>
-    </w:p>
-    <w:bookmarkEnd w:id="41"/>
-    <w:bookmarkStart w:id="42" w:name="ref-brandtEvaluatingBeliefSystem2021"/>
-    <w:p>
-      <w:pPr>
-        <w:pStyle w:val="Bibliography"/>
-      </w:pPr>
-      <w:r>
-        <w:t xml:space="preserve">Brandt, Mark J., and Willem W. A. Sleegers. 2021.</w:t>
-      </w:r>
-      <w:r>
-        <w:t xml:space="preserve"> </w:t>
-      </w:r>
-      <w:r>
-        <w:t xml:space="preserve">“Evaluating</w:t>
-      </w:r>
-      <w:r>
-        <w:t xml:space="preserve"> </w:t>
-      </w:r>
-      <w:r>
-        <w:t xml:space="preserve">Belief System Networks</w:t>
-      </w:r>
-      <w:r>
-        <w:t xml:space="preserve"> </w:t>
-      </w:r>
-      <w:r>
-        <w:t xml:space="preserve">as a</w:t>
-      </w:r>
-      <w:r>
-        <w:t xml:space="preserve"> </w:t>
-      </w:r>
-      <w:r>
-        <w:t xml:space="preserve">Theory</w:t>
-      </w:r>
-      <w:r>
-        <w:t xml:space="preserve"> </w:t>
-      </w:r>
-      <w:r>
-        <w:t xml:space="preserve">of</w:t>
-      </w:r>
-      <w:r>
-        <w:t xml:space="preserve"> </w:t>
-      </w:r>
-      <w:r>
-        <w:t xml:space="preserve">Political Belief System Dynamics</w:t>
+        <w:t xml:space="preserve">Briganti, Giovanni, Marco Scutari, and Richard J. McNally. 2023.</w:t>
+      </w:r>
+      <w:r>
+        <w:t xml:space="preserve"> </w:t>
+      </w:r>
+      <w:r>
+        <w:t xml:space="preserve">“A</w:t>
+      </w:r>
+      <w:r>
+        <w:t xml:space="preserve"> </w:t>
+      </w:r>
+      <w:r>
+        <w:t xml:space="preserve">Tutorial</w:t>
+      </w:r>
+      <w:r>
+        <w:t xml:space="preserve"> </w:t>
+      </w:r>
+      <w:r>
+        <w:t xml:space="preserve">on</w:t>
+      </w:r>
+      <w:r>
+        <w:t xml:space="preserve"> </w:t>
+      </w:r>
+      <w:r>
+        <w:t xml:space="preserve">Bayesian Networks</w:t>
+      </w:r>
+      <w:r>
+        <w:t xml:space="preserve"> </w:t>
+      </w:r>
+      <w:r>
+        <w:t xml:space="preserve">for</w:t>
+      </w:r>
+      <w:r>
+        <w:t xml:space="preserve"> </w:t>
+      </w:r>
+      <w:r>
+        <w:t xml:space="preserve">Psychopathology Researchers</w:t>
       </w:r>
       <w:r>
         <w:t xml:space="preserve">.”</w:t>
@@ -7941,13 +8009,13 @@
           <w:i/>
           <w:iCs/>
         </w:rPr>
-        <w:t xml:space="preserve">Personality and Social Psychology Review</w:t>
-      </w:r>
-      <w:r>
-        <w:t xml:space="preserve"> </w:t>
-      </w:r>
-      <w:r>
-        <w:t xml:space="preserve">25(2): 159–85.</w:t>
+        <w:t xml:space="preserve">Psychological Methods</w:t>
+      </w:r>
+      <w:r>
+        <w:t xml:space="preserve"> </w:t>
+      </w:r>
+      <w:r>
+        <w:t xml:space="preserve">28(4): 947–61.</w:t>
       </w:r>
     </w:p>
     <w:bookmarkEnd w:id="42"/>
@@ -8117,12 +8185,77 @@
       </w:r>
     </w:p>
     <w:bookmarkEnd w:id="44"/>
-    <w:bookmarkStart w:id="45" w:name="ref-caminaHubsBeliefNetworks2022"/>
+    <w:bookmarkStart w:id="45" w:name="ref-buurenMiceMultivariateImputation2011"/>
     <w:p>
       <w:pPr>
         <w:pStyle w:val="Bibliography"/>
       </w:pPr>
       <w:r>
+        <w:t xml:space="preserve">Buuren, Stef van, and Karin Groothuis-Oudshoorn. 2011.</w:t>
+      </w:r>
+      <w:r>
+        <w:t xml:space="preserve"> </w:t>
+      </w:r>
+      <w:r>
+        <w:t xml:space="preserve">“Mice:</w:t>
+      </w:r>
+      <w:r>
+        <w:t xml:space="preserve"> </w:t>
+      </w:r>
+      <w:r>
+        <w:t xml:space="preserve">Multivariate Imputation</w:t>
+      </w:r>
+      <w:r>
+        <w:t xml:space="preserve"> </w:t>
+      </w:r>
+      <w:r>
+        <w:t xml:space="preserve">by</w:t>
+      </w:r>
+      <w:r>
+        <w:t xml:space="preserve"> </w:t>
+      </w:r>
+      <w:r>
+        <w:t xml:space="preserve">Chained Equations</w:t>
+      </w:r>
+      <w:r>
+        <w:t xml:space="preserve"> </w:t>
+      </w:r>
+      <w:r>
+        <w:t xml:space="preserve">in</w:t>
+      </w:r>
+      <w:r>
+        <w:t xml:space="preserve"> </w:t>
+      </w:r>
+      <w:r>
+        <w:t xml:space="preserve">R</w:t>
+      </w:r>
+      <w:r>
+        <w:t xml:space="preserve">.”</w:t>
+      </w:r>
+      <w:r>
+        <w:t xml:space="preserve"> </w:t>
+      </w:r>
+      <w:r>
+        <w:rPr>
+          <w:i/>
+          <w:iCs/>
+        </w:rPr>
+        <w:t xml:space="preserve">Journal of Statistical Software</w:t>
+      </w:r>
+      <w:r>
+        <w:t xml:space="preserve"> </w:t>
+      </w:r>
+      <w:r>
+        <w:t xml:space="preserve">45: 1–67.</w:t>
+      </w:r>
+    </w:p>
+    <w:bookmarkEnd w:id="45"/>
+    <w:bookmarkStart w:id="46" w:name="ref-caminaHubsBeliefNetworks2022"/>
+    <w:p>
+      <w:pPr>
+        <w:pStyle w:val="Bibliography"/>
+      </w:pPr>
+      <w:r>
         <w:t xml:space="preserve">Camina, E., F. Guell, J. Sepulcre, and J. Bernacer. 2022.</w:t>
       </w:r>
       <w:r>
@@ -8169,8 +8302,8 @@
         <w:t xml:space="preserve">12(125).</w:t>
       </w:r>
     </w:p>
-    <w:bookmarkEnd w:id="45"/>
-    <w:bookmarkStart w:id="46" w:name="ref-campbellSolutionAversionRelation2014"/>
+    <w:bookmarkEnd w:id="46"/>
+    <w:bookmarkStart w:id="47" w:name="ref-campbellSolutionAversionRelation2014"/>
     <w:p>
       <w:pPr>
         <w:pStyle w:val="Bibliography"/>
@@ -8243,8 +8376,8 @@
         <w:t xml:space="preserve">107(5): 809–24.</w:t>
       </w:r>
     </w:p>
-    <w:bookmarkEnd w:id="46"/>
-    <w:bookmarkStart w:id="47" w:name="ref-carmichaelEliteCuesMedia2017"/>
+    <w:bookmarkEnd w:id="47"/>
+    <w:bookmarkStart w:id="48" w:name="ref-carmichaelEliteCuesMedia2017"/>
     <w:p>
       <w:pPr>
         <w:pStyle w:val="Bibliography"/>
@@ -8335,13 +8468,54 @@
         <w:t xml:space="preserve">26(2): 232–52.</w:t>
       </w:r>
     </w:p>
-    <w:bookmarkEnd w:id="47"/>
-    <w:bookmarkStart w:id="48" w:name="ref-converseNatureBeliefSystems1964a"/>
+    <w:bookmarkEnd w:id="48"/>
+    <w:bookmarkStart w:id="49" w:name="Xa19b0ab6ba206e8aa3d64dd4a8195ee8f41e667"/>
     <w:p>
       <w:pPr>
         <w:pStyle w:val="Bibliography"/>
       </w:pPr>
       <w:r>
+        <w:t xml:space="preserve">Chickering, David Maxwell. 2002.</w:t>
+      </w:r>
+      <w:r>
+        <w:t xml:space="preserve"> </w:t>
+      </w:r>
+      <w:r>
+        <w:t xml:space="preserve">“Optimal</w:t>
+      </w:r>
+      <w:r>
+        <w:t xml:space="preserve"> </w:t>
+      </w:r>
+      <w:r>
+        <w:t xml:space="preserve">Structure Identiﬁcation With Greedy Search</w:t>
+      </w:r>
+      <w:r>
+        <w:t xml:space="preserve">.”</w:t>
+      </w:r>
+      <w:r>
+        <w:t xml:space="preserve"> </w:t>
+      </w:r>
+      <w:r>
+        <w:rPr>
+          <w:i/>
+          <w:iCs/>
+        </w:rPr>
+        <w:t xml:space="preserve">Journal of Machine Learning Research</w:t>
+      </w:r>
+      <w:r>
+        <w:t xml:space="preserve"> </w:t>
+      </w:r>
+      <w:r>
+        <w:t xml:space="preserve">3: 507–54.</w:t>
+      </w:r>
+    </w:p>
+    <w:bookmarkEnd w:id="49"/>
+    <w:bookmarkStart w:id="50" w:name="ref-converseNatureBeliefSystems1964a"/>
+    <w:p>
+      <w:pPr>
+        <w:pStyle w:val="Bibliography"/>
+      </w:pPr>
+      <w:r>
         <w:t xml:space="preserve">Converse, Philip E. 1964.</w:t>
       </w:r>
       <w:r>
@@ -8417,8 +8591,8 @@
         <w:t xml:space="preserve">, ed. David E. Apter. New York, NY: Free Press.</w:t>
       </w:r>
     </w:p>
-    <w:bookmarkEnd w:id="48"/>
-    <w:bookmarkStart w:id="49" w:name="ref-costantiniStateARtPersonality2015"/>
+    <w:bookmarkEnd w:id="50"/>
+    <w:bookmarkStart w:id="51" w:name="ref-costantiniStateARtPersonality2015"/>
     <w:p>
       <w:pPr>
         <w:pStyle w:val="Bibliography"/>
@@ -8503,8 +8677,8 @@
         <w:t xml:space="preserve">54: 13–29.</w:t>
       </w:r>
     </w:p>
-    <w:bookmarkEnd w:id="49"/>
-    <w:bookmarkStart w:id="50" w:name="ref-dunlapNewEnvironmentalParadigm2008"/>
+    <w:bookmarkEnd w:id="51"/>
+    <w:bookmarkStart w:id="52" w:name="ref-dunlapNewEnvironmentalParadigm2008"/>
     <w:p>
       <w:pPr>
         <w:pStyle w:val="Bibliography"/>
@@ -8565,8 +8739,8 @@
         <w:t xml:space="preserve">40(1): 3–18.</w:t>
       </w:r>
     </w:p>
-    <w:bookmarkEnd w:id="50"/>
-    <w:bookmarkStart w:id="51" w:name="ref-dunlapNewTrendsMeasuring2000"/>
+    <w:bookmarkEnd w:id="52"/>
+    <w:bookmarkStart w:id="53" w:name="ref-dunlapNewTrendsMeasuring2000"/>
     <w:p>
       <w:pPr>
         <w:pStyle w:val="Bibliography"/>
@@ -8648,8 +8822,8 @@
         <w:t xml:space="preserve">56(3): 425–42.</w:t>
       </w:r>
     </w:p>
-    <w:bookmarkEnd w:id="51"/>
-    <w:bookmarkStart w:id="52" w:name="ref-ellisSeeingGreenCultural1997"/>
+    <w:bookmarkEnd w:id="53"/>
+    <w:bookmarkStart w:id="54" w:name="ref-ellisSeeingGreenCultural1997"/>
     <w:p>
       <w:pPr>
         <w:pStyle w:val="Bibliography"/>
@@ -8804,8 +8978,8 @@
         <w:t xml:space="preserve">, eds. Richard J. Ellis and Michael Thompson. Boulder, CO: Westview Press.</w:t>
       </w:r>
     </w:p>
-    <w:bookmarkEnd w:id="52"/>
-    <w:bookmarkStart w:id="53" w:name="ref-epskampBriefReportEstimating2017"/>
+    <w:bookmarkEnd w:id="54"/>
+    <w:bookmarkStart w:id="55" w:name="ref-epskampBriefReportEstimating2017"/>
     <w:p>
       <w:pPr>
         <w:pStyle w:val="Bibliography"/>
@@ -8871,8 +9045,8 @@
         <w:t xml:space="preserve">http://arxiv.org/abs/1606.05771 (August 22, 2023).</w:t>
       </w:r>
     </w:p>
-    <w:bookmarkEnd w:id="53"/>
-    <w:bookmarkStart w:id="54" w:name="Xf0a9df688e789b7c4a5fa13897103480f235c0c"/>
+    <w:bookmarkEnd w:id="55"/>
+    <w:bookmarkStart w:id="56" w:name="Xf0a9df688e789b7c4a5fa13897103480f235c0c"/>
     <w:p>
       <w:pPr>
         <w:pStyle w:val="Bibliography"/>
@@ -8933,8 +9107,8 @@
         <w:t xml:space="preserve">50(1): 195–212.</w:t>
       </w:r>
     </w:p>
-    <w:bookmarkEnd w:id="54"/>
-    <w:bookmarkStart w:id="55" w:name="Xb703f0f32add1782002bd429bb7de70c5fb2d31"/>
+    <w:bookmarkEnd w:id="56"/>
+    <w:bookmarkStart w:id="57" w:name="Xb703f0f32add1782002bd429bb7de70c5fb2d31"/>
     <w:p>
       <w:pPr>
         <w:pStyle w:val="Bibliography"/>
@@ -8998,8 +9172,8 @@
         <w:t xml:space="preserve">48: 1–18.</w:t>
       </w:r>
     </w:p>
-    <w:bookmarkEnd w:id="55"/>
-    <w:bookmarkStart w:id="56" w:name="X1778070fe0e7fb3f737f6082868c7fc778162ea"/>
+    <w:bookmarkEnd w:id="57"/>
+    <w:bookmarkStart w:id="58" w:name="X1778070fe0e7fb3f737f6082868c7fc778162ea"/>
     <w:p>
       <w:pPr>
         <w:pStyle w:val="Bibliography"/>
@@ -9051,8 +9225,8 @@
         <w:t xml:space="preserve">23: 617–34.</w:t>
       </w:r>
     </w:p>
-    <w:bookmarkEnd w:id="56"/>
-    <w:bookmarkStart w:id="57" w:name="ref-epskampBootnetBootstrapMethods2023"/>
+    <w:bookmarkEnd w:id="58"/>
+    <w:bookmarkStart w:id="59" w:name="ref-epskampBootnetBootstrapMethods2023"/>
     <w:p>
       <w:pPr>
         <w:pStyle w:val="Bibliography"/>
@@ -9094,8 +9268,8 @@
         <w:t xml:space="preserve">https://cran.r-project.org/web/packages/bootnet/index.html (August 22, 2023).</w:t>
       </w:r>
     </w:p>
-    <w:bookmarkEnd w:id="57"/>
-    <w:bookmarkStart w:id="58" w:name="ref-feldmanClimateChangePolarizing2018"/>
+    <w:bookmarkEnd w:id="59"/>
+    <w:bookmarkStart w:id="60" w:name="ref-feldmanClimateChangePolarizing2018"/>
     <w:p>
       <w:pPr>
         <w:pStyle w:val="Bibliography"/>
@@ -9180,8 +9354,8 @@
         <w:t xml:space="preserve">51: 54–66.</w:t>
       </w:r>
     </w:p>
-    <w:bookmarkEnd w:id="58"/>
-    <w:bookmarkStart w:id="59" w:name="ref-fishmanChangeWeCan2022"/>
+    <w:bookmarkEnd w:id="60"/>
+    <w:bookmarkStart w:id="61" w:name="ref-fishmanChangeWeCan2022"/>
     <w:p>
       <w:pPr>
         <w:pStyle w:val="Bibliography"/>
@@ -9254,8 +9428,8 @@
         <w:t xml:space="preserve">66(3): 648–63.</w:t>
       </w:r>
     </w:p>
-    <w:bookmarkEnd w:id="59"/>
-    <w:bookmarkStart w:id="60" w:name="X1c2a5300cb91241641d835887d4143669439f58"/>
+    <w:bookmarkEnd w:id="61"/>
+    <w:bookmarkStart w:id="62" w:name="X1c2a5300cb91241641d835887d4143669439f58"/>
     <w:p>
       <w:pPr>
         <w:pStyle w:val="Bibliography"/>
@@ -9324,8 +9498,8 @@
         <w:t xml:space="preserve">, 20200–22028.</w:t>
       </w:r>
     </w:p>
-    <w:bookmarkEnd w:id="60"/>
-    <w:bookmarkStart w:id="61" w:name="ref-friedmanSparseInverseCovariance2008"/>
+    <w:bookmarkEnd w:id="62"/>
+    <w:bookmarkStart w:id="63" w:name="ref-friedmanSparseInverseCovariance2008"/>
     <w:p>
       <w:pPr>
         <w:pStyle w:val="Bibliography"/>
@@ -9377,13 +9551,65 @@
         <w:t xml:space="preserve">9(3): 432–41.</w:t>
       </w:r>
     </w:p>
-    <w:bookmarkEnd w:id="61"/>
-    <w:bookmarkStart w:id="62" w:name="X911a57ae78a2392ab397471bfeca5df4a4c6575"/>
+    <w:bookmarkEnd w:id="63"/>
+    <w:bookmarkStart w:id="64" w:name="ref-friedmanDataAnalysisBayesian2013"/>
     <w:p>
       <w:pPr>
         <w:pStyle w:val="Bibliography"/>
       </w:pPr>
       <w:r>
+        <w:t xml:space="preserve">Friedman, Nir, Moises Goldszmidt, and Abraham Wyner. 2013.</w:t>
+      </w:r>
+      <w:r>
+        <w:t xml:space="preserve"> </w:t>
+      </w:r>
+      <w:r>
+        <w:t xml:space="preserve">“Data</w:t>
+      </w:r>
+      <w:r>
+        <w:t xml:space="preserve"> </w:t>
+      </w:r>
+      <w:r>
+        <w:t xml:space="preserve">Analysis</w:t>
+      </w:r>
+      <w:r>
+        <w:t xml:space="preserve"> </w:t>
+      </w:r>
+      <w:r>
+        <w:t xml:space="preserve">with</w:t>
+      </w:r>
+      <w:r>
+        <w:t xml:space="preserve"> </w:t>
+      </w:r>
+      <w:r>
+        <w:t xml:space="preserve">Bayesian Networks</w:t>
+      </w:r>
+      <w:r>
+        <w:t xml:space="preserve">:</w:t>
+      </w:r>
+      <w:r>
+        <w:t xml:space="preserve"> </w:t>
+      </w:r>
+      <w:r>
+        <w:t xml:space="preserve">A Bootstrap Approach</w:t>
+      </w:r>
+      <w:r>
+        <w:t xml:space="preserve">.”</w:t>
+      </w:r>
+      <w:r>
+        <w:t xml:space="preserve"> </w:t>
+      </w:r>
+      <w:r>
+        <w:t xml:space="preserve">http://arxiv.org/abs/1301.6695 (August 12, 2026).</w:t>
+      </w:r>
+    </w:p>
+    <w:bookmarkEnd w:id="64"/>
+    <w:bookmarkStart w:id="65" w:name="X911a57ae78a2392ab397471bfeca5df4a4c6575"/>
+    <w:p>
+      <w:pPr>
+        <w:pStyle w:val="Bibliography"/>
+      </w:pPr>
+      <w:r>
         <w:t xml:space="preserve">Göbel, Jan Pascal, Jürgen Buder, Malik Ogiermann, Matana Burkhardt, Alina Forstner, Helen Fischer, and Markus Huff. 2026.</w:t>
       </w:r>
       <w:r>
@@ -9469,8 +9695,8 @@
         <w:t xml:space="preserve">110: 102913.</w:t>
       </w:r>
     </w:p>
-    <w:bookmarkEnd w:id="62"/>
-    <w:bookmarkStart w:id="63" w:name="ref-goldbergExperienceConsensusVideo2019"/>
+    <w:bookmarkEnd w:id="65"/>
+    <w:bookmarkStart w:id="66" w:name="ref-goldbergExperienceConsensusVideo2019"/>
     <w:p>
       <w:pPr>
         <w:pStyle w:val="Bibliography"/>
@@ -9567,8 +9793,8 @@
         <w:t xml:space="preserve">41(5): 659–73.</w:t>
       </w:r>
     </w:p>
-    <w:bookmarkEnd w:id="63"/>
-    <w:bookmarkStart w:id="64" w:name="X60037522c0eb7731f576681f802832e758e0383"/>
+    <w:bookmarkEnd w:id="66"/>
+    <w:bookmarkStart w:id="67" w:name="X60037522c0eb7731f576681f802832e758e0383"/>
     <w:p>
       <w:pPr>
         <w:pStyle w:val="Bibliography"/>
@@ -9720,8 +9946,8 @@
         <w:t xml:space="preserve">, eds. Richard J. Ellis and Michael Thompson. Boulder, CO: Westview Press, 151–88.</w:t>
       </w:r>
     </w:p>
-    <w:bookmarkEnd w:id="64"/>
-    <w:bookmarkStart w:id="65" w:name="ref-grendstadCulturalMythsHuman2000"/>
+    <w:bookmarkEnd w:id="67"/>
+    <w:bookmarkStart w:id="68" w:name="ref-grendstadCulturalMythsHuman2000"/>
     <w:p>
       <w:pPr>
         <w:pStyle w:val="Bibliography"/>
@@ -9806,8 +10032,8 @@
         <w:t xml:space="preserve">20(1): 27–40.</w:t>
       </w:r>
     </w:p>
-    <w:bookmarkEnd w:id="65"/>
-    <w:bookmarkStart w:id="66" w:name="ref-hawesClimateSciencePolitics2022"/>
+    <w:bookmarkEnd w:id="68"/>
+    <w:bookmarkStart w:id="69" w:name="ref-hawesClimateSciencePolitics2022"/>
     <w:p>
       <w:pPr>
         <w:pStyle w:val="Bibliography"/>
@@ -9928,8 +10154,8 @@
         <w:t xml:space="preserve">85: 102419.</w:t>
       </w:r>
     </w:p>
-    <w:bookmarkEnd w:id="66"/>
-    <w:bookmarkStart w:id="67" w:name="ref-henryAdvocacyCoalitionFramework2022"/>
+    <w:bookmarkEnd w:id="69"/>
+    <w:bookmarkStart w:id="70" w:name="ref-henryAdvocacyCoalitionFramework2022"/>
     <w:p>
       <w:pPr>
         <w:pStyle w:val="Bibliography"/>
@@ -10019,8 +10245,8 @@
         <w:t xml:space="preserve">, eds. Christopher M. Weible and Samuel Workman. New York, NY: Routledge, 105–36. https://www.taylorfrancis.com/books/9781003269083/chapters/10.4324/9781003269083-5 (August 2, 2022).</w:t>
       </w:r>
     </w:p>
-    <w:bookmarkEnd w:id="67"/>
-    <w:bookmarkStart w:id="68" w:name="X0b0c226ff5d89edd99aad3e4f634f39dc8b13d3"/>
+    <w:bookmarkEnd w:id="70"/>
+    <w:bookmarkStart w:id="71" w:name="X0b0c226ff5d89edd99aad3e4f634f39dc8b13d3"/>
     <w:p>
       <w:pPr>
         <w:pStyle w:val="Bibliography"/>
@@ -10102,8 +10328,8 @@
         <w:t xml:space="preserve">: 1–21.</w:t>
       </w:r>
     </w:p>
-    <w:bookmarkEnd w:id="68"/>
-    <w:bookmarkStart w:id="69" w:name="ref-hurwitzHowAreForeign1987"/>
+    <w:bookmarkEnd w:id="71"/>
+    <w:bookmarkStart w:id="72" w:name="ref-hurwitzHowAreForeign1987"/>
     <w:p>
       <w:pPr>
         <w:pStyle w:val="Bibliography"/>
@@ -10152,8 +10378,8 @@
         <w:t xml:space="preserve">81(4): 1099–1120.</w:t>
       </w:r>
     </w:p>
-    <w:bookmarkEnd w:id="69"/>
-    <w:bookmarkStart w:id="70" w:name="ref-hurwitzTraditionalSocialValues1992"/>
+    <w:bookmarkEnd w:id="72"/>
+    <w:bookmarkStart w:id="73" w:name="ref-hurwitzTraditionalSocialValues1992"/>
     <w:p>
       <w:pPr>
         <w:pStyle w:val="Bibliography"/>
@@ -10229,8 +10455,8 @@
         <w:t xml:space="preserve">14(4): 395–421.</w:t>
       </w:r>
     </w:p>
-    <w:bookmarkEnd w:id="70"/>
-    <w:bookmarkStart w:id="71" w:name="ref-jacksonTheoryPreferenceFormation2015"/>
+    <w:bookmarkEnd w:id="73"/>
+    <w:bookmarkStart w:id="74" w:name="ref-jacksonTheoryPreferenceFormation2015"/>
     <w:p>
       <w:pPr>
         <w:pStyle w:val="Bibliography"/>
@@ -10294,8 +10520,8 @@
         <w:t xml:space="preserve">96(1): 1–18.</w:t>
       </w:r>
     </w:p>
-    <w:bookmarkEnd w:id="71"/>
-    <w:bookmarkStart w:id="72" w:name="ref-jenkins-smithRockHardPlace2009"/>
+    <w:bookmarkEnd w:id="74"/>
+    <w:bookmarkStart w:id="75" w:name="ref-jenkins-smithRockHardPlace2009"/>
     <w:p>
       <w:pPr>
         <w:pStyle w:val="Bibliography"/>
@@ -10380,8 +10606,8 @@
         <w:t xml:space="preserve">37(5): 1095–1129.</w:t>
       </w:r>
     </w:p>
-    <w:bookmarkEnd w:id="72"/>
-    <w:bookmarkStart w:id="73" w:name="Xed27ba9cab4878368b76122bd8add1eb914ea06"/>
+    <w:bookmarkEnd w:id="75"/>
+    <w:bookmarkStart w:id="76" w:name="Xed27ba9cab4878368b76122bd8add1eb914ea06"/>
     <w:p>
       <w:pPr>
         <w:pStyle w:val="Bibliography"/>
@@ -10496,8 +10722,8 @@
         <w:t xml:space="preserve">42(4): 484–508.</w:t>
       </w:r>
     </w:p>
-    <w:bookmarkEnd w:id="73"/>
-    <w:bookmarkStart w:id="74" w:name="ref-jonesLeadingWayCompromise2011"/>
+    <w:bookmarkEnd w:id="76"/>
+    <w:bookmarkStart w:id="77" w:name="ref-jonesLeadingWayCompromise2011"/>
     <w:p>
       <w:pPr>
         <w:pStyle w:val="Bibliography"/>
@@ -10570,8 +10796,8 @@
         <w:t xml:space="preserve">44(04): 720–25.</w:t>
       </w:r>
     </w:p>
-    <w:bookmarkEnd w:id="74"/>
-    <w:bookmarkStart w:id="75" w:name="ref-kahanCulturalCognitionConception2012"/>
+    <w:bookmarkEnd w:id="77"/>
+    <w:bookmarkStart w:id="78" w:name="ref-kahanCulturalCognitionConception2012"/>
     <w:p>
       <w:pPr>
         <w:pStyle w:val="Bibliography"/>
@@ -10776,8 +11002,8 @@
         <w:t xml:space="preserve">, eds. Sabine Roeser, Rafaela Hillerbrand, Per Sandin, and Martin Peterson. Springer, 725–59.</w:t>
       </w:r>
     </w:p>
-    <w:bookmarkEnd w:id="75"/>
-    <w:bookmarkStart w:id="76" w:name="ref-kahanMoreStatisticsLess2003"/>
+    <w:bookmarkEnd w:id="78"/>
+    <w:bookmarkStart w:id="79" w:name="ref-kahanMoreStatisticsLess2003"/>
     <w:p>
       <w:pPr>
         <w:pStyle w:val="Bibliography"/>
@@ -10847,8 +11073,8 @@
         <w:t xml:space="preserve">151(4): 1291–1327.</w:t>
       </w:r>
     </w:p>
-    <w:bookmarkEnd w:id="76"/>
-    <w:bookmarkStart w:id="77" w:name="ref-kahanCulturalCognitionScientific2011"/>
+    <w:bookmarkEnd w:id="79"/>
+    <w:bookmarkStart w:id="80" w:name="ref-kahanCulturalCognitionScientific2011"/>
     <w:p>
       <w:pPr>
         <w:pStyle w:val="Bibliography"/>
@@ -10900,8 +11126,8 @@
         <w:t xml:space="preserve">14(2): 147–74.</w:t>
       </w:r>
     </w:p>
-    <w:bookmarkEnd w:id="77"/>
-    <w:bookmarkStart w:id="78" w:name="ref-kahanPolarizingImpactScience2012"/>
+    <w:bookmarkEnd w:id="80"/>
+    <w:bookmarkStart w:id="81" w:name="ref-kahanPolarizingImpactScience2012"/>
     <w:p>
       <w:pPr>
         <w:pStyle w:val="Bibliography"/>
@@ -10977,8 +11203,8 @@
         <w:t xml:space="preserve">2(10): 732–35.</w:t>
       </w:r>
     </w:p>
-    <w:bookmarkEnd w:id="78"/>
-    <w:bookmarkStart w:id="79" w:name="Xff38e0c6c8198d26ee281abd913b04b1e75a9d7"/>
+    <w:bookmarkEnd w:id="81"/>
+    <w:bookmarkStart w:id="82" w:name="Xff38e0c6c8198d26ee281abd913b04b1e75a9d7"/>
     <w:p>
       <w:pPr>
         <w:pStyle w:val="Bibliography"/>
@@ -11039,13 +11265,99 @@
         <w:t xml:space="preserve">107: 102742.</w:t>
       </w:r>
     </w:p>
-    <w:bookmarkEnd w:id="79"/>
-    <w:bookmarkStart w:id="80" w:name="X3db43f01a747ad62efb2f5ab3326d0c81d729f7"/>
+    <w:bookmarkEnd w:id="82"/>
+    <w:bookmarkStart w:id="83" w:name="Xb629cc1c1fc42969c347fcfeb1a01cc2125547d"/>
     <w:p>
       <w:pPr>
         <w:pStyle w:val="Bibliography"/>
       </w:pPr>
       <w:r>
+        <w:t xml:space="preserve">Koller, Daphne, and Nir Friedman. 2010.</w:t>
+      </w:r>
+      <w:r>
+        <w:t xml:space="preserve"> </w:t>
+      </w:r>
+      <w:r>
+        <w:rPr>
+          <w:i/>
+          <w:iCs/>
+        </w:rPr>
+        <w:t xml:space="preserve">Probabilistic</w:t>
+      </w:r>
+      <w:r>
+        <w:rPr>
+          <w:i/>
+          <w:iCs/>
+        </w:rPr>
+        <w:t xml:space="preserve"> </w:t>
+      </w:r>
+      <w:r>
+        <w:rPr>
+          <w:i/>
+          <w:iCs/>
+        </w:rPr>
+        <w:t xml:space="preserve">Graphical Models</w:t>
+      </w:r>
+      <w:r>
+        <w:rPr>
+          <w:i/>
+          <w:iCs/>
+        </w:rPr>
+        <w:t xml:space="preserve">:</w:t>
+      </w:r>
+      <w:r>
+        <w:rPr>
+          <w:i/>
+          <w:iCs/>
+        </w:rPr>
+        <w:t xml:space="preserve"> </w:t>
+      </w:r>
+      <w:r>
+        <w:rPr>
+          <w:i/>
+          <w:iCs/>
+        </w:rPr>
+        <w:t xml:space="preserve">Principles</w:t>
+      </w:r>
+      <w:r>
+        <w:rPr>
+          <w:i/>
+          <w:iCs/>
+        </w:rPr>
+        <w:t xml:space="preserve"> </w:t>
+      </w:r>
+      <w:r>
+        <w:rPr>
+          <w:i/>
+          <w:iCs/>
+        </w:rPr>
+        <w:t xml:space="preserve">and</w:t>
+      </w:r>
+      <w:r>
+        <w:rPr>
+          <w:i/>
+          <w:iCs/>
+        </w:rPr>
+        <w:t xml:space="preserve"> </w:t>
+      </w:r>
+      <w:r>
+        <w:rPr>
+          <w:i/>
+          <w:iCs/>
+        </w:rPr>
+        <w:t xml:space="preserve">Techniques</w:t>
+      </w:r>
+      <w:r>
+        <w:t xml:space="preserve">. Cambridge, Mass.: MIT Press.</w:t>
+      </w:r>
+    </w:p>
+    <w:bookmarkEnd w:id="83"/>
+    <w:bookmarkStart w:id="84" w:name="X3db43f01a747ad62efb2f5ab3326d0c81d729f7"/>
+    <w:p>
+      <w:pPr>
+        <w:pStyle w:val="Bibliography"/>
+      </w:pPr>
+      <w:r>
         <w:t xml:space="preserve">Krosnick, Jon A., Allyson L. Holbrook, Laura Lowe, and Penny S. Visser. 2006.</w:t>
       </w:r>
       <w:r>
@@ -11146,8 +11458,8 @@
         <w:t xml:space="preserve">77(1–2): 7–43.</w:t>
       </w:r>
     </w:p>
-    <w:bookmarkEnd w:id="80"/>
-    <w:bookmarkStart w:id="81" w:name="ref-krosnickImpactFall19972000"/>
+    <w:bookmarkEnd w:id="84"/>
+    <w:bookmarkStart w:id="85" w:name="ref-krosnickImpactFall19972000"/>
     <w:p>
       <w:pPr>
         <w:pStyle w:val="Bibliography"/>
@@ -11223,8 +11535,8 @@
         <w:t xml:space="preserve">9(3): 239–60.</w:t>
       </w:r>
     </w:p>
-    <w:bookmarkEnd w:id="81"/>
-    <w:bookmarkStart w:id="82" w:name="ref-leeClimateChangeBelief2024"/>
+    <w:bookmarkEnd w:id="85"/>
+    <w:bookmarkStart w:id="86" w:name="ref-leeClimateChangeBelief2024"/>
     <w:p>
       <w:pPr>
         <w:pStyle w:val="Bibliography"/>
@@ -11276,8 +11588,8 @@
         <w:t xml:space="preserve">19(3): e0300048.</w:t>
       </w:r>
     </w:p>
-    <w:bookmarkEnd w:id="82"/>
-    <w:bookmarkStart w:id="83" w:name="ref-leeVariationsClimateChange2025"/>
+    <w:bookmarkEnd w:id="86"/>
+    <w:bookmarkStart w:id="87" w:name="ref-leeVariationsClimateChange2025"/>
     <w:p>
       <w:pPr>
         <w:pStyle w:val="Bibliography"/>
@@ -11329,8 +11641,8 @@
         <w:t xml:space="preserve">15(9): 947–53.</w:t>
       </w:r>
     </w:p>
-    <w:bookmarkEnd w:id="83"/>
-    <w:bookmarkStart w:id="84" w:name="X45949f46a0095101234c973adb15efcc1e6e7c4"/>
+    <w:bookmarkEnd w:id="87"/>
+    <w:bookmarkStart w:id="88" w:name="X45949f46a0095101234c973adb15efcc1e6e7c4"/>
     <w:p>
       <w:pPr>
         <w:pStyle w:val="Bibliography"/>
@@ -11391,8 +11703,8 @@
         <w:t xml:space="preserve">97: 102370.</w:t>
       </w:r>
     </w:p>
-    <w:bookmarkEnd w:id="84"/>
-    <w:bookmarkStart w:id="85" w:name="Xb79075255f3ccdb76d686483b25b180ac6e20ca"/>
+    <w:bookmarkEnd w:id="88"/>
+    <w:bookmarkStart w:id="89" w:name="Xb79075255f3ccdb76d686483b25b180ac6e20ca"/>
     <w:p>
       <w:pPr>
         <w:pStyle w:val="Bibliography"/>
@@ -11465,8 +11777,8 @@
         <w:t xml:space="preserve">10(2).</w:t>
       </w:r>
     </w:p>
-    <w:bookmarkEnd w:id="85"/>
-    <w:bookmarkStart w:id="86" w:name="ref-vanderlindenGatewayBeliefModel2019"/>
+    <w:bookmarkEnd w:id="89"/>
+    <w:bookmarkStart w:id="90" w:name="ref-vanderlindenGatewayBeliefModel2019"/>
     <w:p>
       <w:pPr>
         <w:pStyle w:val="Bibliography"/>
@@ -11515,8 +11827,8 @@
         <w:t xml:space="preserve">62: 49–58.</w:t>
       </w:r>
     </w:p>
-    <w:bookmarkEnd w:id="86"/>
-    <w:bookmarkStart w:id="87" w:name="ref-lukeUserGuideNetwork2015"/>
+    <w:bookmarkEnd w:id="90"/>
+    <w:bookmarkStart w:id="91" w:name="ref-lukeUserGuideNetwork2015"/>
     <w:p>
       <w:pPr>
         <w:pStyle w:val="Bibliography"/>
@@ -11629,8 +11941,8 @@
         <w:t xml:space="preserve">. Cham: Springer International Publishing. http://link.springer.com/10.1007/978-3-319-23883-8 (January 11, 2022).</w:t>
       </w:r>
     </w:p>
-    <w:bookmarkEnd w:id="87"/>
-    <w:bookmarkStart w:id="88" w:name="Xfaeef3ee7dea4a33ed34a32a7472cd4613d38dd"/>
+    <w:bookmarkEnd w:id="91"/>
+    <w:bookmarkStart w:id="92" w:name="Xfaeef3ee7dea4a33ed34a32a7472cd4613d38dd"/>
     <w:p>
       <w:pPr>
         <w:pStyle w:val="Bibliography"/>
@@ -11727,8 +12039,8 @@
         <w:t xml:space="preserve">52(2): 155–94.</w:t>
       </w:r>
     </w:p>
-    <w:bookmarkEnd w:id="88"/>
-    <w:bookmarkStart w:id="89" w:name="ref-merkleyPartyElitesManufactured2018"/>
+    <w:bookmarkEnd w:id="92"/>
+    <w:bookmarkStart w:id="93" w:name="ref-merkleyPartyElitesManufactured2018"/>
     <w:p>
       <w:pPr>
         <w:pStyle w:val="Bibliography"/>
@@ -11801,8 +12113,8 @@
         <w:t xml:space="preserve">40(2): 258–74.</w:t>
       </w:r>
     </w:p>
-    <w:bookmarkEnd w:id="89"/>
-    <w:bookmarkStart w:id="90" w:name="ref-merkleyPartyCuesNews2021"/>
+    <w:bookmarkEnd w:id="93"/>
+    <w:bookmarkStart w:id="94" w:name="ref-merkleyPartyCuesNews2021"/>
     <w:p>
       <w:pPr>
         <w:pStyle w:val="Bibliography"/>
@@ -11893,8 +12205,8 @@
         <w:t xml:space="preserve">51(4): 1439–56.</w:t>
       </w:r>
     </w:p>
-    <w:bookmarkEnd w:id="90"/>
-    <w:bookmarkStart w:id="91" w:name="Xc43ec768c008176b9f89abb4f6bf691741c435f"/>
+    <w:bookmarkEnd w:id="94"/>
+    <w:bookmarkStart w:id="95" w:name="Xc43ec768c008176b9f89abb4f6bf691741c435f"/>
     <w:p>
       <w:pPr>
         <w:pStyle w:val="Bibliography"/>
@@ -11988,8 +12300,8 @@
         <w:t xml:space="preserve">22(4): 416–31.</w:t>
       </w:r>
     </w:p>
-    <w:bookmarkEnd w:id="91"/>
-    <w:bookmarkStart w:id="92" w:name="X3b158972cbdaa45d56667a7f2c1f74a2ffefad4"/>
+    <w:bookmarkEnd w:id="95"/>
+    <w:bookmarkStart w:id="96" w:name="X3b158972cbdaa45d56667a7f2c1f74a2ffefad4"/>
     <w:p>
       <w:pPr>
         <w:pStyle w:val="Bibliography"/>
@@ -12067,8 +12379,8 @@
         <w:t xml:space="preserve">, ed. Christopher M. Weible. New York, NY: Routledge, 130–60.</w:t>
       </w:r>
     </w:p>
-    <w:bookmarkEnd w:id="92"/>
-    <w:bookmarkStart w:id="93" w:name="Xb4c99a0be57d39ff98fa8a07a8fe8d8503fbbac"/>
+    <w:bookmarkEnd w:id="96"/>
+    <w:bookmarkStart w:id="97" w:name="Xb4c99a0be57d39ff98fa8a07a8fe8d8503fbbac"/>
     <w:p>
       <w:pPr>
         <w:pStyle w:val="Bibliography"/>
@@ -12160,8 +12472,8 @@
         <w:t xml:space="preserve">. New York, NY: Routledge.</w:t>
       </w:r>
     </w:p>
-    <w:bookmarkEnd w:id="93"/>
-    <w:bookmarkStart w:id="94" w:name="ref-nowlinPolicyLearningInformation2021"/>
+    <w:bookmarkEnd w:id="97"/>
+    <w:bookmarkStart w:id="98" w:name="ref-nowlinPolicyLearningInformation2021"/>
     <w:p>
       <w:pPr>
         <w:pStyle w:val="Bibliography"/>
@@ -12213,8 +12525,8 @@
         <w:t xml:space="preserve">49(4): 1019–39.</w:t>
       </w:r>
     </w:p>
-    <w:bookmarkEnd w:id="94"/>
-    <w:bookmarkStart w:id="95" w:name="ref-nowlinWhoShouldMore2022"/>
+    <w:bookmarkEnd w:id="98"/>
+    <w:bookmarkStart w:id="99" w:name="ref-nowlinWhoShouldMore2022"/>
     <w:p>
       <w:pPr>
         <w:pStyle w:val="Bibliography"/>
@@ -12323,8 +12635,8 @@
         <w:t xml:space="preserve">39(4): 468–85.</w:t>
       </w:r>
     </w:p>
-    <w:bookmarkEnd w:id="95"/>
-    <w:bookmarkStart w:id="96" w:name="ref-nowlinCulturalTheoryPartisanship2020"/>
+    <w:bookmarkEnd w:id="99"/>
+    <w:bookmarkStart w:id="100" w:name="ref-nowlinCulturalTheoryPartisanship2020"/>
     <w:p>
       <w:pPr>
         <w:pStyle w:val="Bibliography"/>
@@ -12388,13 +12700,127 @@
         <w:t xml:space="preserve">101(2): 878–92.</w:t>
       </w:r>
     </w:p>
-    <w:bookmarkEnd w:id="96"/>
-    <w:bookmarkStart w:id="97" w:name="ref-peffleyHierarchicalModelAttitude1985"/>
+    <w:bookmarkEnd w:id="100"/>
+    <w:bookmarkStart w:id="101" w:name="X0c345326008a3626a636a3c1a992b65914802d4"/>
     <w:p>
       <w:pPr>
         <w:pStyle w:val="Bibliography"/>
       </w:pPr>
       <w:r>
+        <w:t xml:space="preserve">Pearl, Judea. 2014.</w:t>
+      </w:r>
+      <w:r>
+        <w:t xml:space="preserve"> </w:t>
+      </w:r>
+      <w:r>
+        <w:rPr>
+          <w:i/>
+          <w:iCs/>
+        </w:rPr>
+        <w:t xml:space="preserve">Probabilistic</w:t>
+      </w:r>
+      <w:r>
+        <w:rPr>
+          <w:i/>
+          <w:iCs/>
+        </w:rPr>
+        <w:t xml:space="preserve"> </w:t>
+      </w:r>
+      <w:r>
+        <w:rPr>
+          <w:i/>
+          <w:iCs/>
+        </w:rPr>
+        <w:t xml:space="preserve">Reasoning</w:t>
+      </w:r>
+      <w:r>
+        <w:rPr>
+          <w:i/>
+          <w:iCs/>
+        </w:rPr>
+        <w:t xml:space="preserve"> </w:t>
+      </w:r>
+      <w:r>
+        <w:rPr>
+          <w:i/>
+          <w:iCs/>
+        </w:rPr>
+        <w:t xml:space="preserve">in</w:t>
+      </w:r>
+      <w:r>
+        <w:rPr>
+          <w:i/>
+          <w:iCs/>
+        </w:rPr>
+        <w:t xml:space="preserve"> </w:t>
+      </w:r>
+      <w:r>
+        <w:rPr>
+          <w:i/>
+          <w:iCs/>
+        </w:rPr>
+        <w:t xml:space="preserve">Intelligent Systems</w:t>
+      </w:r>
+      <w:r>
+        <w:rPr>
+          <w:i/>
+          <w:iCs/>
+        </w:rPr>
+        <w:t xml:space="preserve">:</w:t>
+      </w:r>
+      <w:r>
+        <w:rPr>
+          <w:i/>
+          <w:iCs/>
+        </w:rPr>
+        <w:t xml:space="preserve"> </w:t>
+      </w:r>
+      <w:r>
+        <w:rPr>
+          <w:i/>
+          <w:iCs/>
+        </w:rPr>
+        <w:t xml:space="preserve">Networks</w:t>
+      </w:r>
+      <w:r>
+        <w:rPr>
+          <w:i/>
+          <w:iCs/>
+        </w:rPr>
+        <w:t xml:space="preserve"> </w:t>
+      </w:r>
+      <w:r>
+        <w:rPr>
+          <w:i/>
+          <w:iCs/>
+        </w:rPr>
+        <w:t xml:space="preserve">of</w:t>
+      </w:r>
+      <w:r>
+        <w:rPr>
+          <w:i/>
+          <w:iCs/>
+        </w:rPr>
+        <w:t xml:space="preserve"> </w:t>
+      </w:r>
+      <w:r>
+        <w:rPr>
+          <w:i/>
+          <w:iCs/>
+        </w:rPr>
+        <w:t xml:space="preserve">Plausible Inference</w:t>
+      </w:r>
+      <w:r>
+        <w:t xml:space="preserve">. Morgan Kaufmann.</w:t>
+      </w:r>
+    </w:p>
+    <w:bookmarkEnd w:id="101"/>
+    <w:bookmarkStart w:id="102" w:name="ref-peffleyHierarchicalModelAttitude1985"/>
+    <w:p>
+      <w:pPr>
+        <w:pStyle w:val="Bibliography"/>
+      </w:pPr>
+      <w:r>
         <w:t xml:space="preserve">Peffley, Mark A., and Jon Hurwitz. 1985.</w:t>
       </w:r>
       <w:r>
@@ -12441,8 +12867,8 @@
         <w:t xml:space="preserve">29(4): 871–90.</w:t>
       </w:r>
     </w:p>
-    <w:bookmarkEnd w:id="97"/>
-    <w:bookmarkStart w:id="98" w:name="ref-quintanaSingleAttitudesBelief2023"/>
+    <w:bookmarkEnd w:id="102"/>
+    <w:bookmarkStart w:id="103" w:name="ref-quintanaSingleAttitudesBelief2023"/>
     <w:p>
       <w:pPr>
         <w:pStyle w:val="Bibliography"/>
@@ -12527,8 +12953,8 @@
         <w:t xml:space="preserve">119: 102179.</w:t>
       </w:r>
     </w:p>
-    <w:bookmarkEnd w:id="98"/>
-    <w:bookmarkStart w:id="99" w:name="X5ac8eb1d1356972d917d5777697e9a83fe58bbc"/>
+    <w:bookmarkEnd w:id="103"/>
+    <w:bookmarkStart w:id="104" w:name="X5ac8eb1d1356972d917d5777697e9a83fe58bbc"/>
     <w:p>
       <w:pPr>
         <w:pStyle w:val="Bibliography"/>
@@ -12604,8 +13030,8 @@
         <w:t xml:space="preserve">42(4): 509–27.</w:t>
       </w:r>
     </w:p>
-    <w:bookmarkEnd w:id="99"/>
-    <w:bookmarkStart w:id="100" w:name="ref-ripbergerHowCulturalOrientations2011"/>
+    <w:bookmarkEnd w:id="104"/>
+    <w:bookmarkStart w:id="105" w:name="ref-ripbergerHowCulturalOrientations2011"/>
     <w:p>
       <w:pPr>
         <w:pStyle w:val="Bibliography"/>
@@ -12681,8 +13107,8 @@
         <w:t xml:space="preserve">44(04): 715–19.</w:t>
       </w:r>
     </w:p>
-    <w:bookmarkEnd w:id="100"/>
-    <w:bookmarkStart w:id="101" w:name="ref-sabatierPolicyChangeLearning1993"/>
+    <w:bookmarkEnd w:id="105"/>
+    <w:bookmarkStart w:id="106" w:name="ref-sabatierPolicyChangeLearning1993"/>
     <w:p>
       <w:pPr>
         <w:pStyle w:val="Bibliography"/>
@@ -12767,8 +13193,8 @@
         <w:t xml:space="preserve">. Boulder, CO: Westview Press.</w:t>
       </w:r>
     </w:p>
-    <w:bookmarkEnd w:id="101"/>
-    <w:bookmarkStart w:id="102" w:name="Xa3e2ed301063e56a8d6d4d7a2eaf1dc5979b1c7"/>
+    <w:bookmarkEnd w:id="106"/>
+    <w:bookmarkStart w:id="107" w:name="Xa3e2ed301063e56a8d6d4d7a2eaf1dc5979b1c7"/>
     <w:p>
       <w:pPr>
         <w:pStyle w:val="Bibliography"/>
@@ -12841,8 +13267,8 @@
         <w:t xml:space="preserve">84: 101910.</w:t>
       </w:r>
     </w:p>
-    <w:bookmarkEnd w:id="102"/>
-    <w:bookmarkStart w:id="103" w:name="ref-saidConsensusMessagingClimate2023"/>
+    <w:bookmarkEnd w:id="107"/>
+    <w:bookmarkStart w:id="108" w:name="ref-saidConsensusMessagingClimate2023"/>
     <w:p>
       <w:pPr>
         <w:pStyle w:val="Bibliography"/>
@@ -12927,8 +13353,8 @@
         <w:t xml:space="preserve">91: 102128.</w:t>
       </w:r>
     </w:p>
-    <w:bookmarkEnd w:id="103"/>
-    <w:bookmarkStart w:id="104" w:name="ref-scutariLearningBayesianNetworks2010"/>
+    <w:bookmarkEnd w:id="108"/>
+    <w:bookmarkStart w:id="109" w:name="ref-scutariLearningBayesianNetworks2010"/>
     <w:p>
       <w:pPr>
         <w:pStyle w:val="Bibliography"/>
@@ -13000,13 +13426,87 @@
         <w:t xml:space="preserve">35(3).</w:t>
       </w:r>
     </w:p>
-    <w:bookmarkEnd w:id="104"/>
-    <w:bookmarkStart w:id="105" w:name="Xa77265c8ac2165d406b5e23bd8070751682eef0"/>
+    <w:bookmarkEnd w:id="109"/>
+    <w:bookmarkStart w:id="110" w:name="ref-scutariWhoLearnsBetter2019"/>
     <w:p>
       <w:pPr>
         <w:pStyle w:val="Bibliography"/>
       </w:pPr>
       <w:r>
+        <w:t xml:space="preserve">Scutari, Marco, Catharina Elisabeth Graafland, and José Manuel Gutiérrez. 2019.</w:t>
+      </w:r>
+      <w:r>
+        <w:t xml:space="preserve"> </w:t>
+      </w:r>
+      <w:r>
+        <w:t xml:space="preserve">“Who</w:t>
+      </w:r>
+      <w:r>
+        <w:t xml:space="preserve"> </w:t>
+      </w:r>
+      <w:r>
+        <w:t xml:space="preserve">Learns Better Bayesian Network Structures</w:t>
+      </w:r>
+      <w:r>
+        <w:t xml:space="preserve">:</w:t>
+      </w:r>
+      <w:r>
+        <w:t xml:space="preserve"> </w:t>
+      </w:r>
+      <w:r>
+        <w:t xml:space="preserve">Accuracy</w:t>
+      </w:r>
+      <w:r>
+        <w:t xml:space="preserve"> </w:t>
+      </w:r>
+      <w:r>
+        <w:t xml:space="preserve">and</w:t>
+      </w:r>
+      <w:r>
+        <w:t xml:space="preserve"> </w:t>
+      </w:r>
+      <w:r>
+        <w:t xml:space="preserve">Speed</w:t>
+      </w:r>
+      <w:r>
+        <w:t xml:space="preserve"> </w:t>
+      </w:r>
+      <w:r>
+        <w:t xml:space="preserve">of</w:t>
+      </w:r>
+      <w:r>
+        <w:t xml:space="preserve"> </w:t>
+      </w:r>
+      <w:r>
+        <w:t xml:space="preserve">Structure Learning Algorithms</w:t>
+      </w:r>
+      <w:r>
+        <w:t xml:space="preserve">.”</w:t>
+      </w:r>
+      <w:r>
+        <w:t xml:space="preserve"> </w:t>
+      </w:r>
+      <w:r>
+        <w:rPr>
+          <w:i/>
+          <w:iCs/>
+        </w:rPr>
+        <w:t xml:space="preserve">International Journal of Approximate Reasoning</w:t>
+      </w:r>
+      <w:r>
+        <w:t xml:space="preserve"> </w:t>
+      </w:r>
+      <w:r>
+        <w:t xml:space="preserve">115: 235–53.</w:t>
+      </w:r>
+    </w:p>
+    <w:bookmarkEnd w:id="110"/>
+    <w:bookmarkStart w:id="111" w:name="Xa77265c8ac2165d406b5e23bd8070751682eef0"/>
+    <w:p>
+      <w:pPr>
+        <w:pStyle w:val="Bibliography"/>
+      </w:pPr>
+      <w:r>
         <w:t xml:space="preserve">Song, Geoboo. 2014.</w:t>
       </w:r>
       <w:r>
@@ -13089,8 +13589,8 @@
         <w:t xml:space="preserve">34(3): 541–55.</w:t>
       </w:r>
     </w:p>
-    <w:bookmarkEnd w:id="105"/>
-    <w:bookmarkStart w:id="106" w:name="ref-sotirovCognitiveTheoryShifting2016"/>
+    <w:bookmarkEnd w:id="111"/>
+    <w:bookmarkStart w:id="112" w:name="ref-sotirovCognitiveTheoryShifting2016"/>
     <w:p>
       <w:pPr>
         <w:pStyle w:val="Bibliography"/>
@@ -13187,8 +13687,8 @@
         <w:t xml:space="preserve">49(2): 125–54.</w:t>
       </w:r>
     </w:p>
-    <w:bookmarkEnd w:id="106"/>
-    <w:bookmarkStart w:id="107" w:name="Xd80995be13b72525320e599330d3ba78efa80ab"/>
+    <w:bookmarkEnd w:id="112"/>
+    <w:bookmarkStart w:id="113" w:name="Xd80995be13b72525320e599330d3ba78efa80ab"/>
     <w:p>
       <w:pPr>
         <w:pStyle w:val="Bibliography"/>
@@ -13240,13 +13740,71 @@
         <w:t xml:space="preserve">34(3): 291–310.</w:t>
       </w:r>
     </w:p>
-    <w:bookmarkEnd w:id="107"/>
-    <w:bookmarkStart w:id="108" w:name="ref-sternNewEcologicalParadigm1995"/>
+    <w:bookmarkEnd w:id="113"/>
+    <w:bookmarkStart w:id="114" w:name="ref-spirtesCausationPredictionSearch2000"/>
     <w:p>
       <w:pPr>
         <w:pStyle w:val="Bibliography"/>
       </w:pPr>
       <w:r>
+        <w:t xml:space="preserve">Spirtes, Peter, Clark Glymour, and Richard Scheines. 2000.</w:t>
+      </w:r>
+      <w:r>
+        <w:t xml:space="preserve"> </w:t>
+      </w:r>
+      <w:r>
+        <w:rPr>
+          <w:i/>
+          <w:iCs/>
+        </w:rPr>
+        <w:t xml:space="preserve">Causation,</w:t>
+      </w:r>
+      <w:r>
+        <w:rPr>
+          <w:i/>
+          <w:iCs/>
+        </w:rPr>
+        <w:t xml:space="preserve"> </w:t>
+      </w:r>
+      <w:r>
+        <w:rPr>
+          <w:i/>
+          <w:iCs/>
+        </w:rPr>
+        <w:t xml:space="preserve">Prediction</w:t>
+      </w:r>
+      <w:r>
+        <w:rPr>
+          <w:i/>
+          <w:iCs/>
+        </w:rPr>
+        <w:t xml:space="preserve">, and</w:t>
+      </w:r>
+      <w:r>
+        <w:rPr>
+          <w:i/>
+          <w:iCs/>
+        </w:rPr>
+        <w:t xml:space="preserve"> </w:t>
+      </w:r>
+      <w:r>
+        <w:rPr>
+          <w:i/>
+          <w:iCs/>
+        </w:rPr>
+        <w:t xml:space="preserve">Search</w:t>
+      </w:r>
+      <w:r>
+        <w:t xml:space="preserve">. 2nd ed. ed. Francis Bach. Cambridge, MA, USA: MIT Press.</w:t>
+      </w:r>
+    </w:p>
+    <w:bookmarkEnd w:id="114"/>
+    <w:bookmarkStart w:id="115" w:name="ref-sternNewEcologicalParadigm1995"/>
+    <w:p>
+      <w:pPr>
+        <w:pStyle w:val="Bibliography"/>
+      </w:pPr>
+      <w:r>
         <w:t xml:space="preserve">Stern, Paul C., Thomas Dietz, and Gregory A. Guagnano. 1995.</w:t>
       </w:r>
       <w:r>
@@ -13293,8 +13851,8 @@
         <w:t xml:space="preserve">27(6): 723–43.</w:t>
       </w:r>
     </w:p>
-    <w:bookmarkEnd w:id="108"/>
-    <w:bookmarkStart w:id="109" w:name="ref-stewartMappingRacialEthnic2024"/>
+    <w:bookmarkEnd w:id="115"/>
+    <w:bookmarkStart w:id="116" w:name="ref-stewartMappingRacialEthnic2024"/>
     <w:p>
       <w:pPr>
         <w:pStyle w:val="Bibliography"/>
@@ -13355,8 +13913,8 @@
         <w:t xml:space="preserve">: 23326492241259404.</w:t>
       </w:r>
     </w:p>
-    <w:bookmarkEnd w:id="109"/>
-    <w:bookmarkStart w:id="110" w:name="ref-swedlowConstructValidityCultural2020"/>
+    <w:bookmarkEnd w:id="116"/>
+    <w:bookmarkStart w:id="117" w:name="ref-swedlowConstructValidityCultural2020"/>
     <w:p>
       <w:pPr>
         <w:pStyle w:val="Bibliography"/>
@@ -13408,8 +13966,8 @@
         <w:t xml:space="preserve">101(6): 2332–83.</w:t>
       </w:r>
     </w:p>
-    <w:bookmarkEnd w:id="110"/>
-    <w:bookmarkStart w:id="111" w:name="Xbcbd837b5b220bdd8209fd24f768be396961b6f"/>
+    <w:bookmarkEnd w:id="117"/>
+    <w:bookmarkStart w:id="118" w:name="Xbcbd837b5b220bdd8209fd24f768be396961b6f"/>
     <w:p>
       <w:pPr>
         <w:pStyle w:val="Bibliography"/>
@@ -13482,8 +14040,8 @@
         <w:t xml:space="preserve">91: 102759.</w:t>
       </w:r>
     </w:p>
-    <w:bookmarkEnd w:id="111"/>
-    <w:bookmarkStart w:id="112" w:name="ref-teslerEliteDominationPublic2018"/>
+    <w:bookmarkEnd w:id="118"/>
+    <w:bookmarkStart w:id="119" w:name="ref-teslerEliteDominationPublic2018"/>
     <w:p>
       <w:pPr>
         <w:pStyle w:val="Bibliography"/>
@@ -13544,8 +14102,8 @@
         <w:t xml:space="preserve">35(2): 306–26.</w:t>
       </w:r>
     </w:p>
-    <w:bookmarkEnd w:id="112"/>
-    <w:bookmarkStart w:id="113" w:name="ref-thompsonCulturalTheory1990"/>
+    <w:bookmarkEnd w:id="119"/>
+    <w:bookmarkStart w:id="120" w:name="ref-thompsonCulturalTheory1990"/>
     <w:p>
       <w:pPr>
         <w:pStyle w:val="Bibliography"/>
@@ -13581,8 +14139,8 @@
         <w:t xml:space="preserve">. Boulder, CO: Westview Press.</w:t>
       </w:r>
     </w:p>
-    <w:bookmarkEnd w:id="113"/>
-    <w:bookmarkStart w:id="114" w:name="ref-tumlisonCulturalValuesTrust2019"/>
+    <w:bookmarkEnd w:id="120"/>
+    <w:bookmarkStart w:id="121" w:name="ref-tumlisonCulturalValuesTrust2019"/>
     <w:p>
       <w:pPr>
         <w:pStyle w:val="Bibliography"/>
@@ -13685,8 +14243,8 @@
         <w:t xml:space="preserve">39(3): 511–34.</w:t>
       </w:r>
     </w:p>
-    <w:bookmarkEnd w:id="114"/>
-    <w:bookmarkStart w:id="115" w:name="X3334b9f423171f042b7e825186956e13a024636"/>
+    <w:bookmarkEnd w:id="121"/>
+    <w:bookmarkStart w:id="122" w:name="X3334b9f423171f042b7e825186956e13a024636"/>
     <w:p>
       <w:pPr>
         <w:pStyle w:val="Bibliography"/>
@@ -13750,8 +14308,8 @@
         <w:t xml:space="preserve">100: 104279.</w:t>
       </w:r>
     </w:p>
-    <w:bookmarkEnd w:id="115"/>
-    <w:bookmarkStart w:id="116" w:name="ref-vanderlindenGatewayBeliefModel2021"/>
+    <w:bookmarkEnd w:id="122"/>
+    <w:bookmarkStart w:id="123" w:name="ref-vanderlindenGatewayBeliefModel2021"/>
     <w:p>
       <w:pPr>
         <w:pStyle w:val="Bibliography"/>
@@ -13851,8 +14409,8 @@
         <w:t xml:space="preserve">42: 7–12.</w:t>
       </w:r>
     </w:p>
-    <w:bookmarkEnd w:id="116"/>
-    <w:bookmarkStart w:id="117" w:name="Xa1442287164574b326cb1e3a16bfd3831e4ec50"/>
+    <w:bookmarkEnd w:id="123"/>
+    <w:bookmarkStart w:id="124" w:name="Xa1442287164574b326cb1e3a16bfd3831e4ec50"/>
     <w:p>
       <w:pPr>
         <w:pStyle w:val="Bibliography"/>
@@ -13925,8 +14483,8 @@
         <w:t xml:space="preserve">70: 101435.</w:t>
       </w:r>
     </w:p>
-    <w:bookmarkEnd w:id="117"/>
-    <w:bookmarkStart w:id="118" w:name="ref-verweijClumsySolutionsComplex2006"/>
+    <w:bookmarkEnd w:id="124"/>
+    <w:bookmarkStart w:id="125" w:name="ref-verweijClumsySolutionsComplex2006"/>
     <w:p>
       <w:pPr>
         <w:pStyle w:val="Bibliography"/>
@@ -13999,8 +14557,8 @@
         <w:t xml:space="preserve">84(4): 817–43.</w:t>
       </w:r>
     </w:p>
-    <w:bookmarkEnd w:id="118"/>
-    <w:bookmarkStart w:id="119" w:name="Xb710d7d8977db263a9186d05b028690def8f336"/>
+    <w:bookmarkEnd w:id="125"/>
+    <w:bookmarkStart w:id="126" w:name="Xb710d7d8977db263a9186d05b028690def8f336"/>
     <w:p>
       <w:pPr>
         <w:pStyle w:val="Bibliography"/>
@@ -14061,8 +14619,8 @@
         <w:t xml:space="preserve">40.</w:t>
       </w:r>
     </w:p>
-    <w:bookmarkEnd w:id="119"/>
-    <w:bookmarkStart w:id="120" w:name="X0564773f222b17d7654df11e514ee26311b684c"/>
+    <w:bookmarkEnd w:id="126"/>
+    <w:bookmarkStart w:id="127" w:name="X0564773f222b17d7654df11e514ee26311b684c"/>
     <w:p>
       <w:pPr>
         <w:pStyle w:val="Bibliography"/>
@@ -14141,9 +14699,9 @@
         <w:t xml:space="preserve">63: 144–53.</w:t>
       </w:r>
     </w:p>
-    <w:bookmarkEnd w:id="120"/>
-    <w:bookmarkEnd w:id="121"/>
-    <w:bookmarkEnd w:id="122"/>
+    <w:bookmarkEnd w:id="127"/>
+    <w:bookmarkEnd w:id="128"/>
+    <w:bookmarkEnd w:id="129"/>
     <w:sectPr>
       <w:footnotePr>
         <w:numRestart w:val="eachSect"/>
@@ -14173,6 +14731,67 @@
       </w:r>
     </w:p>
   </w:footnote>
+  <w:footnote w:id="13">
+    <w:p>
+      <w:pPr>
+        <w:pStyle w:val="FootnoteText"/>
+      </w:pPr>
+      <w:r>
+        <w:rPr>
+          <w:rStyle w:val="FootnoteReference"/>
+        </w:rPr>
+        <w:footnoteRef/>
+      </w:r>
+      <w:r>
+        <w:t xml:space="preserve"> </w:t>
+      </w:r>
+      <w:r>
+        <w:t xml:space="preserve">This study was not preregistered, and no a priori power analysis was conducted. The bootstrap correlation-stability coefficients reported in the Results section, all at or above the 0.50 threshold Epskamp et al.</w:t>
+      </w:r>
+      <w:r>
+        <w:t xml:space="preserve"> </w:t>
+      </w:r>
+      <w:r>
+        <w:t xml:space="preserve">(2018)</w:t>
+      </w:r>
+      <w:r>
+        <w:t xml:space="preserve"> </w:t>
+      </w:r>
+      <w:r>
+        <w:t xml:space="preserve">recommend, serve as a post hoc check that the sample size supports stable centrality estimates. The data and analysis code are organized in a version-controlled repository, including the raw and derived survey data, all analysis scripts, and the manuscript source, with package versions pinned via</w:t>
+      </w:r>
+      <w:r>
+        <w:t xml:space="preserve"> </w:t>
+      </w:r>
+      <w:r>
+        <w:rPr>
+          <w:rStyle w:val="VerbatimChar"/>
+        </w:rPr>
+        <w:t xml:space="preserve">renv</w:t>
+      </w:r>
+      <w:r>
+        <w:t xml:space="preserve"> </w:t>
+      </w:r>
+      <w:r>
+        <w:t xml:space="preserve">in</w:t>
+      </w:r>
+      <w:r>
+        <w:t xml:space="preserve"> </w:t>
+      </w:r>
+      <w:r>
+        <w:rPr>
+          <w:rStyle w:val="VerbatimChar"/>
+        </w:rPr>
+        <w:t xml:space="preserve">R</w:t>
+      </w:r>
+      <w:r>
+        <w:t xml:space="preserve"> </w:t>
+      </w:r>
+      <w:r>
+        <w:t xml:space="preserve">to support exact reproducibility.</w:t>
+      </w:r>
+    </w:p>
+  </w:footnote>
   <w:footnote w:id="14">
     <w:p>
       <w:pPr>
@@ -14285,7 +14904,7 @@
         <w:t xml:space="preserve"> </w:t>
       </w:r>
       <w:r>
-        <w:t xml:space="preserve">(Scutari 2010)</w:t>
+        <w:t xml:space="preserve">(Briganti, Scutari, and McNally 2023; Scutari 2010)</w:t>
       </w:r>
       <w:r>
         <w:t xml:space="preserve">. Continuous variables were discretized into tertiles (or, for</w:t>

</xml_diff>

<commit_message>
Fix centrality/influence language; extend theoretical anchors to variable selection
Reworks four passages in the Introduction, Belief Systems section, and Results
that described centrality in causal-influence terms, aligning them with the
paper's established position that centrality reflects structural embeddedness,
not causal influence. Also extends the three theoretical anchors (hierarchical
account, gateway belief model, solution aversion) to explicitly justify which
beliefs were selected for the network, in both Theoretical Expectations and
Belief Measures, matching a new framing the user added to the Introduction.

Co-Authored-By: Claude Sonnet 5 <noreply@anthropic.com>
</commit_message>
<xml_diff>
--- a/manuscript/_output/climate-beliefs.docx
+++ b/manuscript/_output/climate-beliefs.docx
@@ -32,7 +32,7 @@
         <w:pStyle w:val="BodyText"/>
       </w:pPr>
       <w:r>
-        <w:t xml:space="preserve">There are several explanations for why the public remains divided on climate change, including political ideology and partisanship; cultural worldviews derived from cultural theory; environmental orientation; acceptance/rejection of the scientific consensus on climate change; and an aversion to government regulations meant to address climate change. Each explanation involves beliefs about climate change, yet these beliefs do not exist in isolation from one another. Beliefs about climate change form an interconnected belief system.</w:t>
+        <w:t xml:space="preserve">There are several explanations for why the public remains divided on climate change, including political ideology and partisanship; cultural worldviews derived from cultural theory; environmental orientation; acceptance/rejection of the scientific consensus on climate change; and an aversion to government regulations meant to address climate change. Each explanation involves beliefs about climate change, yet these beliefs do not exist in isolation from one another; rather, they form a belief system.</w:t>
       </w:r>
     </w:p>
     <w:p>
@@ -175,7 +175,7 @@
         <w:pStyle w:val="BodyText"/>
       </w:pPr>
       <w:r>
-        <w:t xml:space="preserve">In this paper, I use original survey data to examine the climate change belief system using measures of various types of beliefs not measured in previous research, including core beliefs (cultural worldviews, political ideology, partisanship, environment orientation), policy domain beliefs (views about climate change), and views on various policies to address climate change. By examining the climate change belief network, I can determine which beliefs are the most central within it. However, rather than testing competing hypotheses about which type of belief – deep core, policy core, or secondary – is most central, this paper takes an exploratory approach to mapping the structure of the climate change belief network. Prior research offers some expectations about which beliefs may take on structural importance. For example, hierarchical accounts of belief system structure point to deep core beliefs such as cultural worldviews and political identity. The</w:t>
+        <w:t xml:space="preserve">In this paper, I use original survey data to examine the climate change belief system using measures of various types of beliefs not measured in previous research, including deep core beliefs (cultural worldviews, political ideology, partisanship, environment orientation), policy core beliefs (views about climate change), and secondary beliefs (support for various policies to address climate change). By examining the climate change belief network, I can determine which beliefs are the most central within it. However, rather than testing competing hypotheses about which type of belief – deep core, policy core, or secondary – is most central, this paper takes an exploratory approach to mapping the structure of the climate change belief network. Prior research offers some expectations about which beliefs may take on structural importance. For example, hierarchical accounts of belief system structure point to deep core beliefs such as cultural worldviews and political identity. The</w:t>
       </w:r>
       <w:r>
         <w:t xml:space="preserve"> </w:t>
@@ -196,7 +196,7 @@
         <w:t xml:space="preserve">(e.g., Van Der Linden 2021)</w:t>
       </w:r>
       <w:r>
-        <w:t xml:space="preserve">, and solution-aversion accounts point to secondary beliefs and policy preferences. I use these three accounts as theoretical frameworks for interpreting which beliefs occupy structurally important positions in the network, rather than as mutually exclusive predictions to be tested. This allows the analysis to show how different kinds of beliefs are organized relative to one another.</w:t>
+        <w:t xml:space="preserve">, and solution-aversion accounts point to secondary beliefs and policy preferences. I use these three accounts as theoretical anchors for deciding which beliefs to include in the network and interpreting if they occupy structurally important positions in the network, rather than as mutually exclusive predictions to be tested. This allows the analysis to show how different kinds of beliefs are organized relative to one another.</w:t>
       </w:r>
     </w:p>
     <w:p>
@@ -204,7 +204,7 @@
         <w:pStyle w:val="BodyText"/>
       </w:pPr>
       <w:r>
-        <w:t xml:space="preserve">I examine the climate change belief system network first as an undirected network, using a Gaussian graphical model (GGM), then as a directed Bayesian network. This allows for comparisons of centrality across an undirected and a directed network, the latter offering an estimated ordering among beliefs rather than a direct test of the theoretical deep core/policy core/secondary hierarchy. Using common measures of centrality – strength, closeness, and betweenness – I find that egalitarianism (a deep core belief), support for EPA regulations (a secondary belief), and climate change risk (a policy core belief) have the highest point estimates for centrality in the GGM, though pairwise comparisons show these ranks are not always statistically distinguishable from other beliefs. Centrality also varied across measures, indicating that different types of beliefs serve different functions within the network: egalitarianism had the highest betweenness and closeness centrality, indicating it served as a bridge connecting other beliefs, while EPA regulations had the highest strength centrality, meaning it had the strongest connections (i.e., highest partial correlations) in the network. The Bayesian network, however, complicates this picture: egalitarianism does not occupy an upstream,</w:t>
+        <w:t xml:space="preserve">I examine the climate change belief system network first as an undirected network, using a Gaussian graphical model (GGM), then as a directed Bayesian network. This allows for comparisons of centrality across an undirected and a directed network, with the latter offering an estimated ordering among beliefs rather than a direct test of the theoretical deep core/policy core/secondary hierarchy. Using common measures of centrality – strength, closeness, and betweenness – I find that egalitarianism (a deep core belief), support for EPA regulations (a secondary belief), and climate change risk (a policy core belief) have the highest point estimates for centrality in the GGM, though pairwise comparisons show these ranks are not always statistically distinguishable from other beliefs. Centrality also varied across measures, indicating that different types of beliefs may serve different functions within the network. For example, egalitarianism had the highest betweenness and closeness centrality, indicating it served as a bridge connecting other beliefs, while EPA regulations had the highest strength centrality, meaning it had the strongest connections (i.e., highest partial correlations) in the network. The Bayesian network, however, complicates this picture, as egalitarianism does not occupy an upstream,</w:t>
       </w:r>
       <w:r>
         <w:t xml:space="preserve"> </w:t>
@@ -216,7 +216,15 @@
         <w:t xml:space="preserve"> </w:t>
       </w:r>
       <w:r>
-        <w:t xml:space="preserve">position in the directed network; instead, support for an international climate agreement, a secondary/policy belief, has the highest out-degree of any node. Individualism (a deep core belief) and perceived climate risk (a policy core belief), meanwhile, rank highly by both approaches. Structural importance in the climate change belief network cuts across the deep core, policy core, and secondary belief hierarchy that theory predicts, as individualism, perceived climate risk, and support for an international agreement are robustly central regardless of whether the network is modeled as undirected or directed, while egalitarianism’s apparent centrality holds only in the undirected model. These findings suggest that conceptualizing belief systems as networks opens up new theoretical and empirical understanding of how different beliefs function. A network approach complements and does not displace a hierarchical one, but comparing the two reveals which beliefs’ structural importance depends on modeling assumptions and which does not – a distinction a hierarchical approach alone cannot make.</w:t>
+        <w:t xml:space="preserve">position in the directed network; instead, support for an international climate agreement, a secondary/policy belief, has the highest out-degree of any node. Individualism (a deep core belief) and perceived climate risk (a policy core belief), meanwhile, rank highly by both approaches.</w:t>
+      </w:r>
+    </w:p>
+    <w:p>
+      <w:pPr>
+        <w:pStyle w:val="BodyText"/>
+      </w:pPr>
+      <w:r>
+        <w:t xml:space="preserve">Overall, structural importance in the climate change belief network cuts across the deep core, policy core, and secondary belief hierarchy that theory predicts, as individualism, perceived climate risk, and support for an international agreement are robustly central regardless of whether the network is modeled as undirected or directed, while egalitarianism’s apparent centrality holds only in the undirected model. These findings suggest that conceptualizing belief systems as networks opens up new theoretical and empirical understanding of how different beliefs function. A network approach complements and does not displace a hierarchical one, but comparing the two reveals which beliefs’ structural importance depends on modeling assumptions and which does not, which is a distinction a hierarchical approach alone cannot make.</w:t>
       </w:r>
     </w:p>
     <w:bookmarkEnd w:id="9"/>
@@ -320,7 +328,7 @@
         <w:t xml:space="preserve">(Nohrstedt et al. 2023; Sabatier and Jenkins-Smith 1993)</w:t>
       </w:r>
       <w:r>
-        <w:t xml:space="preserve">. Using ACF terminology, beliefs at the top of the hierarchy are known as deep core beliefs and can include political ideology, cultural worldviews, and environmental values, among others. The second tradition instead holds that belief systems are networks of interconnected beliefs, in which a belief’s importance is a function of its structural position among its horizontal connections to other beliefs rather than its place in a hierarchy</w:t>
+        <w:t xml:space="preserve">. Using ACF terminology, beliefs at the top of the hierarchy are known as deep core beliefs and can include political ideology, cultural worldviews, and environmental values, among others. The second approach, developed by psychologists, holds that belief systems are networks of interconnected beliefs, in which a belief’s importance is a function of its structural position among its horizontal connections to other beliefs rather than its place in a hierarchy</w:t>
       </w:r>
       <w:r>
         <w:t xml:space="preserve"> </w:t>
@@ -329,7 +337,7 @@
         <w:t xml:space="preserve">(Boutyline and Vaisey 2017; Brandt, Sibley, and Osborne 2019; Brandt and Sleegers 2021)</w:t>
       </w:r>
       <w:r>
-        <w:t xml:space="preserve">. Beliefs can be categorized by type (i.e., deep core, policy core, and secondary) across the two approaches, but the function of those beliefs and how they constrain other beliefs differ, with a hierarchical approach positing top-down influences and a network approach allowing influence to be determined empirically by the structure of the network.</w:t>
+        <w:t xml:space="preserve">. Beliefs can be categorized by type (i.e., deep core, policy core, and secondary) across the two approaches, but the function of those beliefs and how they constrain other beliefs differ, with a hierarchical approach positing top-down influences and a network approach instead determining a belief’s structural importance empirically from the network itself.</w:t>
       </w:r>
     </w:p>
     <w:p>
@@ -343,7 +351,184 @@
         <w:t xml:space="preserve"> </w:t>
       </w:r>
       <w:r>
-        <w:t xml:space="preserve">(Jenkins-Smith et al. 2014, 492)</w:t>
+        <w:t xml:space="preserve">(Jenkins-Smith et al. 2014)</w:t>
+      </w:r>
+      <w:r>
+        <w:t xml:space="preserve">. Additionally, deep core beliefs are central beliefs in the</w:t>
+      </w:r>
+      <w:r>
+        <w:t xml:space="preserve"> </w:t>
+      </w:r>
+      <w:r>
+        <w:t xml:space="preserve">Converse (1964)</w:t>
+      </w:r>
+      <w:r>
+        <w:t xml:space="preserve"> </w:t>
+      </w:r>
+      <w:r>
+        <w:t xml:space="preserve">sense and are, therefore, resistant to change, and they act as filters for how information about policy issues is processed</w:t>
+      </w:r>
+      <w:r>
+        <w:t xml:space="preserve"> </w:t>
+      </w:r>
+      <w:r>
+        <w:t xml:space="preserve">(Kahan 2012; Nowlin 2021)</w:t>
+      </w:r>
+      <w:r>
+        <w:t xml:space="preserve">. A network approach treats this claim as a testable, empirical question rather than an assumption built into the model. Deep core beliefs are important not because of their position atop a hierarchy but only if they occupy central or structurally important positions among a network’s nodes. Several studies have found that they do. Using the American National Election Study (ANES),</w:t>
+      </w:r>
+      <w:r>
+        <w:t xml:space="preserve"> </w:t>
+      </w:r>
+      <w:r>
+        <w:t xml:space="preserve">Boutyline and Vaisey (2017)</w:t>
+      </w:r>
+      <w:r>
+        <w:t xml:space="preserve"> </w:t>
+      </w:r>
+      <w:r>
+        <w:t xml:space="preserve">found that self-reported political ideology occupies a central role in a network of beliefs about various policy issues (abortion, environment, guns, death penalty, immigration, inequality, welfare spending), and</w:t>
+      </w:r>
+      <w:r>
+        <w:t xml:space="preserve"> </w:t>
+      </w:r>
+      <w:r>
+        <w:t xml:space="preserve">Brandt, Sibley, and Osborne (2019)</w:t>
+      </w:r>
+      <w:r>
+        <w:t xml:space="preserve"> </w:t>
+      </w:r>
+      <w:r>
+        <w:t xml:space="preserve">similarly find that symbolic beliefs based on identities (political ideology and partisanship) are more central within belief system networks than operational (issues-based) beliefs</w:t>
+      </w:r>
+      <w:r>
+        <w:t xml:space="preserve"> </w:t>
+      </w:r>
+      <w:r>
+        <w:t xml:space="preserve">(see also Fishman and Davis 2022)</w:t>
+      </w:r>
+      <w:r>
+        <w:t xml:space="preserve">. Notably, these findings come from belief networks that span several policy issues at once; however, whether ideology and partisanship play the same organizing role within a belief network built around a single issue is a separate, open question.</w:t>
+      </w:r>
+    </w:p>
+    <w:p>
+      <w:pPr>
+        <w:pStyle w:val="BodyText"/>
+      </w:pPr>
+      <w:r>
+        <w:t xml:space="preserve">While deep core beliefs have been measured in various ways, increasingly scholars are using cultural worldviews developed from cultural theory to conceptualize and measure them</w:t>
+      </w:r>
+      <w:r>
+        <w:t xml:space="preserve"> </w:t>
+      </w:r>
+      <w:r>
+        <w:t xml:space="preserve">(Hornung and Bandelow 2021; Jenkins-Smith et al. 2014; Nohrstedt et al. 2023; Ripberger et al. 2014; Sotirov and Winkel 2016)</w:t>
+      </w:r>
+      <w:r>
+        <w:t xml:space="preserve">. In brief, cultural theory posits four cultural worldviews, or cultural types, which are derived from ideas about how societal relationships should ideally be structured. The four cultural types include</w:t>
+      </w:r>
+      <w:r>
+        <w:t xml:space="preserve"> </w:t>
+      </w:r>
+      <w:r>
+        <w:rPr>
+          <w:i/>
+          <w:iCs/>
+        </w:rPr>
+        <w:t xml:space="preserve">hierarchs</w:t>
+      </w:r>
+      <w:r>
+        <w:t xml:space="preserve">, who value clear lines of authority and rules that guide individual behavior;</w:t>
+      </w:r>
+      <w:r>
+        <w:t xml:space="preserve"> </w:t>
+      </w:r>
+      <w:r>
+        <w:rPr>
+          <w:i/>
+          <w:iCs/>
+        </w:rPr>
+        <w:t xml:space="preserve">egalitarians</w:t>
+      </w:r>
+      <w:r>
+        <w:t xml:space="preserve">, who value equality and collective well-being;</w:t>
+      </w:r>
+      <w:r>
+        <w:t xml:space="preserve"> </w:t>
+      </w:r>
+      <w:r>
+        <w:rPr>
+          <w:i/>
+          <w:iCs/>
+        </w:rPr>
+        <w:t xml:space="preserve">individualists</w:t>
+      </w:r>
+      <w:r>
+        <w:t xml:space="preserve">, who value autonomy and individual choice; and</w:t>
+      </w:r>
+      <w:r>
+        <w:t xml:space="preserve"> </w:t>
+      </w:r>
+      <w:r>
+        <w:rPr>
+          <w:i/>
+          <w:iCs/>
+        </w:rPr>
+        <w:t xml:space="preserve">fatalists</w:t>
+      </w:r>
+      <w:r>
+        <w:t xml:space="preserve">, who see the world as capricious and beyond human control. An individual’s cultural worldview has been shown to inform their views on a host of specific policy issues, including national security</w:t>
+      </w:r>
+      <w:r>
+        <w:t xml:space="preserve"> </w:t>
+      </w:r>
+      <w:r>
+        <w:t xml:space="preserve">(Ripberger, Jenkins-Smith, and Herron 2011)</w:t>
+      </w:r>
+      <w:r>
+        <w:t xml:space="preserve">; gun control</w:t>
+      </w:r>
+      <w:r>
+        <w:t xml:space="preserve"> </w:t>
+      </w:r>
+      <w:r>
+        <w:t xml:space="preserve">(Kahan and Braman 2003)</w:t>
+      </w:r>
+      <w:r>
+        <w:t xml:space="preserve">; trade-offs between rights and security</w:t>
+      </w:r>
+      <w:r>
+        <w:t xml:space="preserve"> </w:t>
+      </w:r>
+      <w:r>
+        <w:t xml:space="preserve">(Jenkins-Smith and Herron 2009)</w:t>
+      </w:r>
+      <w:r>
+        <w:t xml:space="preserve">; immigration</w:t>
+      </w:r>
+      <w:r>
+        <w:t xml:space="preserve"> </w:t>
+      </w:r>
+      <w:r>
+        <w:t xml:space="preserve">(Jackson 2015)</w:t>
+      </w:r>
+      <w:r>
+        <w:t xml:space="preserve">; vaccines</w:t>
+      </w:r>
+      <w:r>
+        <w:t xml:space="preserve"> </w:t>
+      </w:r>
+      <w:r>
+        <w:t xml:space="preserve">(Song 2014)</w:t>
+      </w:r>
+      <w:r>
+        <w:t xml:space="preserve">; and climate change</w:t>
+      </w:r>
+      <w:r>
+        <w:t xml:space="preserve"> </w:t>
+      </w:r>
+      <w:r>
+        <w:t xml:space="preserve">(Jones 2011; Kahan et al. 2012; Nowlin and Rabovsky 2020)</w:t>
       </w:r>
       <w:r>
         <w:t xml:space="preserve">.</w:t>
@@ -354,61 +539,39 @@
         <w:pStyle w:val="BodyText"/>
       </w:pPr>
       <w:r>
-        <w:t xml:space="preserve">Additionally, deep core beliefs are central beliefs in the</w:t>
-      </w:r>
-      <w:r>
-        <w:t xml:space="preserve"> </w:t>
-      </w:r>
-      <w:r>
-        <w:t xml:space="preserve">Converse (1964)</w:t>
-      </w:r>
-      <w:r>
-        <w:t xml:space="preserve"> </w:t>
-      </w:r>
-      <w:r>
-        <w:t xml:space="preserve">sense and are, therefore, resistant to change, and they act as filters for how information about policy issues is processed</w:t>
-      </w:r>
-      <w:r>
-        <w:t xml:space="preserve"> </w:t>
-      </w:r>
-      <w:r>
-        <w:t xml:space="preserve">(Kahan 2012; Nowlin 2021)</w:t>
-      </w:r>
-      <w:r>
-        <w:t xml:space="preserve">. A network approach treats this claim as a testable, empirical question rather than an assumption built into the model. Deep core beliefs are important not because of their position atop a hierarchy but only if they occupy central or structurally important positions among a network’s nodes. Several studies have found that they are. Using the American National Election Study (ANES),</w:t>
-      </w:r>
-      <w:r>
-        <w:t xml:space="preserve"> </w:t>
-      </w:r>
-      <w:r>
-        <w:t xml:space="preserve">Boutyline and Vaisey (2017)</w:t>
-      </w:r>
-      <w:r>
-        <w:t xml:space="preserve"> </w:t>
-      </w:r>
-      <w:r>
-        <w:t xml:space="preserve">found that self-reported political ideology occupies a central role in a network of beliefs about various policy issues (abortion, environment, guns, death penalty, immigration, inequality, welfare spending), and</w:t>
-      </w:r>
-      <w:r>
-        <w:t xml:space="preserve"> </w:t>
-      </w:r>
-      <w:r>
-        <w:t xml:space="preserve">Brandt, Sibley, and Osborne (2019)</w:t>
-      </w:r>
-      <w:r>
-        <w:t xml:space="preserve"> </w:t>
-      </w:r>
-      <w:r>
-        <w:t xml:space="preserve">similarly find that symbolic beliefs based on identities (political ideology and partisanship) are more central within belief system networks than operational (issues-based) beliefs</w:t>
-      </w:r>
-      <w:r>
-        <w:t xml:space="preserve"> </w:t>
-      </w:r>
-      <w:r>
-        <w:t xml:space="preserve">(see also Fishman and Davis 2022)</w:t>
-      </w:r>
-      <w:r>
-        <w:t xml:space="preserve">. Notably, these findings come from belief networks that span several policy issues at once; whether ideology and partisanship play the same organizing role within a belief network built around a single issue is a separate, open question I return to in the Discussion.</w:t>
+        <w:t xml:space="preserve">Following deep core beliefs are</w:t>
+      </w:r>
+      <w:r>
+        <w:t xml:space="preserve"> </w:t>
+      </w:r>
+      <w:r>
+        <w:rPr>
+          <w:i/>
+          <w:iCs/>
+        </w:rPr>
+        <w:t xml:space="preserve">policy core</w:t>
+      </w:r>
+      <w:r>
+        <w:t xml:space="preserve"> </w:t>
+      </w:r>
+      <w:r>
+        <w:t xml:space="preserve">beliefs, which involve beliefs about particular policy issues such as immigration, national security, or climate change and which the hierarchical view holds are influenced by deep core beliefs. Finally,</w:t>
+      </w:r>
+      <w:r>
+        <w:t xml:space="preserve"> </w:t>
+      </w:r>
+      <w:r>
+        <w:rPr>
+          <w:i/>
+          <w:iCs/>
+        </w:rPr>
+        <w:t xml:space="preserve">secondary</w:t>
+      </w:r>
+      <w:r>
+        <w:t xml:space="preserve"> </w:t>
+      </w:r>
+      <w:r>
+        <w:t xml:space="preserve">beliefs are beliefs regarding policy approaches, such as a carbon tax or Environmental Protection Agency (EPA) regulations, and are influenced by both deep core and policy core beliefs. A network approach retains this same vocabulary, as deep core, policy core, and secondary beliefs remain useful descriptive categories for types of nodes, but leaves open the possibility that belief centrality does not follow the specific deep core to policy core to secondary belief ordering. Instead, a belief’s centrality is a function of its connections to other nodes regardless of its type or category.</w:t>
       </w:r>
     </w:p>
     <w:p>
@@ -416,122 +579,37 @@
         <w:pStyle w:val="BodyText"/>
       </w:pPr>
       <w:r>
-        <w:t xml:space="preserve">While deep core beliefs have been measured in various ways, increasingly scholars are using cultural worldviews developed from cultural theory to conceptualize and measure them</w:t>
-      </w:r>
-      <w:r>
-        <w:t xml:space="preserve"> </w:t>
-      </w:r>
-      <w:r>
-        <w:t xml:space="preserve">(Hornung and Bandelow 2021; Jenkins-Smith et al. 2014; Nohrstedt et al. 2023; Ripberger et al. 2014; Sotirov and Winkel 2016)</w:t>
-      </w:r>
-      <w:r>
-        <w:t xml:space="preserve">. In brief, cultural theory posits four cultural worldviews, or cultural types, which are derived from ideas about how societal relationships should ideally be structured. The four cultural types include</w:t>
-      </w:r>
-      <w:r>
-        <w:t xml:space="preserve"> </w:t>
-      </w:r>
-      <w:r>
-        <w:rPr>
-          <w:i/>
-          <w:iCs/>
-        </w:rPr>
-        <w:t xml:space="preserve">hierarchs</w:t>
-      </w:r>
-      <w:r>
-        <w:t xml:space="preserve">, who value clear lines of authority and rules that guide individual behavior;</w:t>
-      </w:r>
-      <w:r>
-        <w:t xml:space="preserve"> </w:t>
-      </w:r>
-      <w:r>
-        <w:rPr>
-          <w:i/>
-          <w:iCs/>
-        </w:rPr>
-        <w:t xml:space="preserve">egalitarians</w:t>
-      </w:r>
-      <w:r>
-        <w:t xml:space="preserve">, who value equality and collective well-being;</w:t>
-      </w:r>
-      <w:r>
-        <w:t xml:space="preserve"> </w:t>
-      </w:r>
-      <w:r>
-        <w:rPr>
-          <w:i/>
-          <w:iCs/>
-        </w:rPr>
-        <w:t xml:space="preserve">individualists</w:t>
-      </w:r>
-      <w:r>
-        <w:t xml:space="preserve">, who value autonomy and individual choice; and</w:t>
-      </w:r>
-      <w:r>
-        <w:t xml:space="preserve"> </w:t>
-      </w:r>
-      <w:r>
-        <w:rPr>
-          <w:i/>
-          <w:iCs/>
-        </w:rPr>
-        <w:t xml:space="preserve">fatalists</w:t>
-      </w:r>
-      <w:r>
-        <w:t xml:space="preserve">, who see the world as capricious and beyond human control. An individual’s cultural worldview has been shown to inform their views on a host of specific policy issues, including national security</w:t>
-      </w:r>
-      <w:r>
-        <w:t xml:space="preserve"> </w:t>
-      </w:r>
-      <w:r>
-        <w:t xml:space="preserve">(Ripberger, Jenkins-Smith, and Herron 2011)</w:t>
-      </w:r>
-      <w:r>
-        <w:t xml:space="preserve">; gun control</w:t>
-      </w:r>
-      <w:r>
-        <w:t xml:space="preserve"> </w:t>
-      </w:r>
-      <w:r>
-        <w:t xml:space="preserve">(Kahan and Braman 2003)</w:t>
-      </w:r>
-      <w:r>
-        <w:t xml:space="preserve">; trade-offs between rights and security</w:t>
-      </w:r>
-      <w:r>
-        <w:t xml:space="preserve"> </w:t>
-      </w:r>
-      <w:r>
-        <w:t xml:space="preserve">(Jenkins-Smith and Herron 2009)</w:t>
-      </w:r>
-      <w:r>
-        <w:t xml:space="preserve">; immigration</w:t>
-      </w:r>
-      <w:r>
-        <w:t xml:space="preserve"> </w:t>
-      </w:r>
-      <w:r>
-        <w:t xml:space="preserve">(Jackson 2015)</w:t>
-      </w:r>
-      <w:r>
-        <w:t xml:space="preserve">; vaccines</w:t>
-      </w:r>
-      <w:r>
-        <w:t xml:space="preserve"> </w:t>
-      </w:r>
-      <w:r>
-        <w:t xml:space="preserve">(Song 2014)</w:t>
-      </w:r>
-      <w:r>
-        <w:t xml:space="preserve">; and climate change</w:t>
-      </w:r>
-      <w:r>
-        <w:t xml:space="preserve"> </w:t>
-      </w:r>
-      <w:r>
-        <w:t xml:space="preserve">(Jones 2011; Kahan et al. 2012; Nowlin and Rabovsky 2020)</w:t>
-      </w:r>
-      <w:r>
-        <w:t xml:space="preserve">.</w:t>
+        <w:t xml:space="preserve">The hierarchical structure of beliefs includes the necessary elements of a theory of belief systems outlined by</w:t>
+      </w:r>
+      <w:r>
+        <w:t xml:space="preserve"> </w:t>
+      </w:r>
+      <w:r>
+        <w:t xml:space="preserve">Brandt and Sleegers (2021)</w:t>
+      </w:r>
+      <w:r>
+        <w:t xml:space="preserve">, as the belief system components are connected and causality runs from higher-order (deep core) to lower-order (secondary) beliefs. Yet, one issue with the hierarchical conceptualization is that the boundaries between different types of beliefs are fuzzy. For example, I treat environmental orientation as a deep core belief because it could shape beliefs about several environmental issues and policy areas (e.g., climate change, energy production, endangered species protection), but other scholars could reasonably treat it as a policy core belief instead, with</w:t>
+      </w:r>
+      <w:r>
+        <w:t xml:space="preserve"> </w:t>
+      </w:r>
+      <w:r>
+        <w:t xml:space="preserve">“the environment”</w:t>
+      </w:r>
+      <w:r>
+        <w:t xml:space="preserve"> </w:t>
+      </w:r>
+      <w:r>
+        <w:t xml:space="preserve">itself seen as a policy issue. Each belief type has also been measured in different ways, leading to different conclusions among scholars about belief systems</w:t>
+      </w:r>
+      <w:r>
+        <w:t xml:space="preserve"> </w:t>
+      </w:r>
+      <w:r>
+        <w:t xml:space="preserve">(Henry et al. 2022; Ripberger et al. 2014)</w:t>
+      </w:r>
+      <w:r>
+        <w:t xml:space="preserve">. A network approach avoids this problem by not assuming the vertical, hierarchical relationship among types of beliefs, but instead a belief’s structural importance is based on measures of centrality rather than its place in a hierarchy.</w:t>
       </w:r>
     </w:p>
     <w:p>
@@ -539,81 +617,6 @@
         <w:pStyle w:val="BodyText"/>
       </w:pPr>
       <w:r>
-        <w:t xml:space="preserve">Following deep core beliefs are</w:t>
-      </w:r>
-      <w:r>
-        <w:t xml:space="preserve"> </w:t>
-      </w:r>
-      <w:r>
-        <w:rPr>
-          <w:i/>
-          <w:iCs/>
-        </w:rPr>
-        <w:t xml:space="preserve">policy core beliefs</w:t>
-      </w:r>
-      <w:r>
-        <w:t xml:space="preserve">, which involve beliefs about particular policy issues such as immigration, national security, or climate change and which the hierarchical view holds are influenced by deep core beliefs. Finally,</w:t>
-      </w:r>
-      <w:r>
-        <w:t xml:space="preserve"> </w:t>
-      </w:r>
-      <w:r>
-        <w:rPr>
-          <w:i/>
-          <w:iCs/>
-        </w:rPr>
-        <w:t xml:space="preserve">secondary beliefs</w:t>
-      </w:r>
-      <w:r>
-        <w:t xml:space="preserve"> </w:t>
-      </w:r>
-      <w:r>
-        <w:t xml:space="preserve">are beliefs regarding policy approaches, such as a carbon tax or Environmental Protection Agency (EPA) regulations, and are influenced by both deep core and policy core beliefs. A network approach retains this same vocabulary, as deep core, policy core, and secondary beliefs remain useful descriptive categories for types of nodes, but leaves open the possibility that belief centrality does not follow the specific deep core to policy core to secondary belief ordering. Instead, a belief’s centrality is a function of its connections to other nodes regardless of its type or category.</w:t>
-      </w:r>
-    </w:p>
-    <w:p>
-      <w:pPr>
-        <w:pStyle w:val="BodyText"/>
-      </w:pPr>
-      <w:r>
-        <w:t xml:space="preserve">The hierarchical structure of beliefs includes the necessary elements of a theory of belief systems outlined by</w:t>
-      </w:r>
-      <w:r>
-        <w:t xml:space="preserve"> </w:t>
-      </w:r>
-      <w:r>
-        <w:t xml:space="preserve">Brandt and Sleegers (2021)</w:t>
-      </w:r>
-      <w:r>
-        <w:t xml:space="preserve">, as the belief system components are connected and causality runs from higher-order (deep core) to lower-order (secondary) beliefs. Yet, one issue with the hierarchical conceptualization is that the boundaries between different types of beliefs are fuzzy: I treat environmental orientation as a deep core belief because it could shape beliefs about several environmental issues and policy areas (e.g., climate change, energy production, endangered species protection), but other scholars could reasonably treat it as a policy core belief instead, with</w:t>
-      </w:r>
-      <w:r>
-        <w:t xml:space="preserve"> </w:t>
-      </w:r>
-      <w:r>
-        <w:t xml:space="preserve">“the environment”</w:t>
-      </w:r>
-      <w:r>
-        <w:t xml:space="preserve"> </w:t>
-      </w:r>
-      <w:r>
-        <w:t xml:space="preserve">itself seen as a policy issue. Each belief type has also been measured in different ways, leading to different conclusions among scholars about belief systems</w:t>
-      </w:r>
-      <w:r>
-        <w:t xml:space="preserve"> </w:t>
-      </w:r>
-      <w:r>
-        <w:t xml:space="preserve">(Henry et al. 2022; Ripberger et al. 2014)</w:t>
-      </w:r>
-      <w:r>
-        <w:t xml:space="preserve">. A network approach avoids this problem by not assuming the vertical, hierarchical relationship among types of beliefs, but instead a belief’s influence on other beliefs is based on measures of centrality rather than its place in a hierarchy.</w:t>
-      </w:r>
-    </w:p>
-    <w:p>
-      <w:pPr>
-        <w:pStyle w:val="BodyText"/>
-      </w:pPr>
-      <w:r>
         <w:t xml:space="preserve">One model of how belief system networks form begins with a single central belief that generates broader stances, which in turn stochastically generate further, more specific beliefs in a recursive process that yields a center-periphery structure</w:t>
       </w:r>
       <w:r>
@@ -623,15 +626,7 @@
         <w:t xml:space="preserve">(Boutyline and Vaisey 2017, 1378–79)</w:t>
       </w:r>
       <w:r>
-        <w:t xml:space="preserve">.</w:t>
-      </w:r>
-    </w:p>
-    <w:p>
-      <w:pPr>
-        <w:pStyle w:val="BodyText"/>
-      </w:pPr>
-      <w:r>
-        <w:t xml:space="preserve">As the belief system forms a center-periphery structure, some beliefs can begin to act as bridges, connecting beliefs in the periphery to other beliefs in the network and keeping an otherwise potentially disparate set of beliefs connected. This is similar to the filtering role a hierarchical account attributes to deep core beliefs, but defined here by a belief’s position among its connections rather than its place in a hierarchy. Multiple measures of centrality are typically used to determine the prominence of various beliefs in a belief system network</w:t>
+        <w:t xml:space="preserve">. As the belief system forms a center-periphery structure, some beliefs can begin to act as bridges, connecting beliefs in the periphery to other beliefs in the network and keeping an otherwise potentially disparate set of beliefs connected. This is similar to the filtering role a hierarchical account attributes to deep core beliefs, but defined here by a belief’s position among its connections rather than its place in a hierarchy. Multiple measures of centrality are typically used to determine the prominence of various beliefs in a belief system network</w:t>
       </w:r>
       <w:r>
         <w:t xml:space="preserve"> </w:t>
@@ -1038,7 +1033,7 @@
         <w:pStyle w:val="BodyText"/>
       </w:pPr>
       <w:r>
-        <w:t xml:space="preserve">Closeness centrality measures how close a node is to other nodes in the network; nodes with shorter average paths to others are thought to be more influential, since they can more readily affect other beliefs through a direct effect. The equation for the closeness centrality of node</w:t>
+        <w:t xml:space="preserve">Closeness centrality measures how close a node is to other nodes in the network; nodes with shorter average paths to others are more directly and readily reachable from the rest of the network. The equation for the closeness centrality of node</w:t>
       </w:r>
       <w:r>
         <w:t xml:space="preserve"> </w:t>
@@ -1582,7 +1577,7 @@
         <w:pStyle w:val="FirstParagraph"/>
       </w:pPr>
       <w:r>
-        <w:t xml:space="preserve">Previous research points to several distinct expectations about which types of beliefs should be most structurally central in a climate change belief network, though, to my knowledge, these expectations have not been examined with measures of cultural worldviews, environmental orientation, and climate policy preferences within a single network. A hierarchical view of belief systems holds that deep core beliefs – cultural worldviews, political ideology, and pro-environmental orientation – shape and constrain other beliefs, and so should likely occupy the most central positions in the network. Work on the gateway belief model instead points to perceived scientific consensus, which is theorized to serve as a causal entry point that shifts downstream climate beliefs. A third possibility, grounded in solution aversion, is that beliefs about specific policy approaches are most central, because resistance to a policy solution can influence how the underlying problem itself is perceived. The following analysis examines centrality across all three types of beliefs simultaneously, asking which beliefs, and which types of beliefs, occupy the most structurally important positions in the network, and whether that varies depending on how centrality is measured. For example, betweenness and closeness centrality, which capture a belief’s role in bridging and quickly reaching other beliefs in the network, most directly reflect the kind of constraining, foundational role a hierarchical account attributes to deep core beliefs. Strength centrality, which reflects the number and magnitude of a belief’s direct connections, more directly reflects the pattern a solution-aversion account would predict for policy preferences as both deep core and policy core are likely to be connected to preferences. In the next section, I discuss the data and measurements used to explore the climate change belief network.</w:t>
+        <w:t xml:space="preserve">Previous research points to several distinct expectations about which types of beliefs should be most structurally central in a climate change belief network, though, to my knowledge, these expectations have not been examined with measures of cultural worldviews, environmental orientation, and climate policy preferences within a single network. A hierarchical view of belief systems holds that deep core beliefs – cultural worldviews, political ideology, and pro-environmental orientation – shape and constrain other beliefs, and so should likely occupy the most central positions in the network. Work on the gateway belief model instead points to perceived scientific consensus, which is theorized to serve as a causal entry point that shifts downstream climate beliefs. A third possibility, grounded in solution aversion, is that beliefs about specific policy approaches are most central, because resistance to a policy solution can influence how the underlying problem itself is perceived. These three accounts also guided which beliefs were selected for inclusion in the network – deep core beliefs, perceived scientific consensus, and climate policy preferences – rather than functioning solely as competing predictions about centrality. The following analysis examines centrality across all three types of beliefs simultaneously, asking which beliefs, and which types of beliefs, occupy the most structurally important positions in the network, and whether that varies depending on how centrality is measured. For example, betweenness and closeness centrality, which capture a belief’s role in bridging and quickly reaching other beliefs in the network, most directly reflect the kind of constraining, foundational role a hierarchical account attributes to deep core beliefs. Strength centrality, which reflects the number and magnitude of a belief’s direct connections, more directly reflects the pattern a solution-aversion account would predict for policy preferences as both deep core and policy core are likely to be connected to preferences. In the next section, I discuss the data and measurements used to explore the climate change belief network.</w:t>
       </w:r>
     </w:p>
     <w:bookmarkEnd w:id="11"/>
@@ -1650,7 +1645,7 @@
         <w:pStyle w:val="FirstParagraph"/>
       </w:pPr>
       <w:r>
-        <w:t xml:space="preserve">Cultural theory, political ideology, partisanship, and the NEP scale were used to measure respondents’ deep core beliefs; beliefs about whether climate change is happening, its risk, and the scientific consensus measured policy core beliefs; and support for several climate policy approaches measured secondary beliefs. I describe each of the measures below.</w:t>
+        <w:t xml:space="preserve">Cultural theory, political ideology, partisanship, and the NEP scale were used to measure respondents’ deep core beliefs; beliefs about whether climate change is happening, its risk, and the scientific consensus measured policy core beliefs; and support for several climate policy approaches measured secondary beliefs. These measures were selected using the three theoretical anchors described above: cultural theory, ideology, partisanship, and the NEP scale operationalize the deep core beliefs a hierarchical account points to; perceived scientific consensus operationalizes the gateway belief model’s causal entry point; and the climate policy measures operationalize the secondary beliefs a solution-aversion account points to. I describe each of the measures below.</w:t>
       </w:r>
       <w:r>
         <w:rPr>
@@ -2840,7 +2835,7 @@
         <w:pStyle w:val="BodyText"/>
       </w:pPr>
       <w:r>
-        <w:t xml:space="preserve">Egalitarianism also has the highest closeness centrality, with 0.00558, followed by support for an international agreement (0.00516), a carbon tax (0.00507), fatalism (0.00506), and climate change risk (0.00499). Beliefs high in closeness are more closely connected to other nodes, giving them shorter paths to the rest of the network and therefore greater potential influence. As with betweenness, most of these ranks are not statistically distinguishable: only 1 of the 10 comparisons among the top five closeness nodes reached significance. Egalitarianism’s closeness centrality was significantly higher only than fatalism’s, and not significantly different from that of support for an international agreement, a carbon tax, or climate change risk. Closeness did show a higher overall rate of significant differences than the other two measures (54 of 136 pairs), suggesting closeness centrality is more reliably differentiated across beliefs even though the top-ranked cluster itself remains largely indistinguishable. Closeness also showed a stable CS coefficient of 0.75.</w:t>
+        <w:t xml:space="preserve">Egalitarianism also has the highest closeness centrality, with 0.00558, followed by support for an international agreement (0.00516), a carbon tax (0.00507), fatalism (0.00506), and climate change risk (0.00499). Beliefs high in closeness are more closely connected to other nodes, giving them shorter, more direct paths to the rest of the network. As with betweenness, most of these ranks are not statistically distinguishable: only 1 of the 10 comparisons among the top five closeness nodes reached significance. Egalitarianism’s closeness centrality was significantly higher only than fatalism’s, and not significantly different from that of support for an international agreement, a carbon tax, or climate change risk. Closeness did show a higher overall rate of significant differences than the other two measures (54 of 136 pairs), suggesting closeness centrality is more reliably differentiated across beliefs even though the top-ranked cluster itself remains largely indistinguishable. Closeness also showed a stable CS coefficient of 0.75.</w:t>
       </w:r>
     </w:p>
     <w:p>

</xml_diff>

<commit_message>
Fact-check and copyedit manuscript, finalize response letter
Fixed three substantive accuracy errors caught during a tough peer-review
pass (sample size, a misattributed Bayesian-network arc, a backwards
significance-rate claim), all verified against the underlying data. Also
fixed grammar/typos and aligned prose with nowlin-style-profile.md. Added
reviews/response-letter-final.md/.html as a clean, submission-ready
response-to-reviewers letter, distinct from the internal working skeleton.

Co-Authored-By: Claude Sonnet 5 <noreply@anthropic.com>
</commit_message>
<xml_diff>
--- a/manuscript/_output/climate-beliefs.docx
+++ b/manuscript/_output/climate-beliefs.docx
@@ -167,7 +167,7 @@
         <w:t xml:space="preserve">(Jones 2011; Nowlin and Rabovsky 2020; Ziegler 2017)</w:t>
       </w:r>
       <w:r>
-        <w:t xml:space="preserve">.</w:t>
+        <w:t xml:space="preserve">. Additionally, previous research measures only an undirected network, not a directed one.</w:t>
       </w:r>
     </w:p>
     <w:p>
@@ -216,7 +216,7 @@
         <w:t xml:space="preserve"> </w:t>
       </w:r>
       <w:r>
-        <w:t xml:space="preserve">position in the directed network; instead, support for an international climate agreement, a secondary/policy belief, has the highest out-degree of any node. Individualism (a deep core belief) and perceived climate risk (a policy core belief), meanwhile, rank highly by both approaches.</w:t>
+        <w:t xml:space="preserve">position in the directed network; instead, support for an international climate agreement, a secondary/policy belief, has the highest out-degree of any node. Individualism (a deep core belief) and perceived climate risk (a policy core belief), meanwhile, rank highly in both approaches.</w:t>
       </w:r>
     </w:p>
     <w:p>
@@ -302,7 +302,7 @@
         <w:t xml:space="preserve"> </w:t>
       </w:r>
       <w:r>
-        <w:t xml:space="preserve">argued that a theory of belief systems must contain three elements: a) the components of the belief system must be connected; b) these connections should be causal; and c) contain an accounting of the potential impacts of exogenous factors.</w:t>
+        <w:t xml:space="preserve">argued that a theory of belief systems must contain three elements – a) the components of the belief system must be connected; b) these connections should be causal; and c) the theory must account for the potential impacts of exogenous factors.</w:t>
       </w:r>
     </w:p>
     <w:p>
@@ -1291,7 +1291,7 @@
         <w:pStyle w:val="BodyText"/>
       </w:pPr>
       <w:r>
-        <w:t xml:space="preserve">Degree centrality measures the number of direct connections to a node, with more connections indicating greater prominence. Strength centrality is its weighted analogue, used when connections have a value rather than being binary: the sum of edge weights rather than the count of edges, so nodes with high strength centrality are strongly, not just widely, connected to others.</w:t>
+        <w:t xml:space="preserve">Degree centrality measures the number of direct connections to a node, with more connections indicating greater prominence. Strength centrality is its weighted analogue, used when connections have a value rather than being binary, calculated as the sum of edge weights rather than the count of edges, so nodes with high strength centrality are strongly, not just widely, connected to others.</w:t>
       </w:r>
     </w:p>
     <w:p>
@@ -1299,7 +1299,7 @@
         <w:pStyle w:val="BodyText"/>
       </w:pPr>
       <w:r>
-        <w:t xml:space="preserve">In the following analysis, I examine the network of beliefs about climate change of a quota-based sample of the US public. Next, I briefly describe several drivers of the public’s views on climate change.</w:t>
+        <w:t xml:space="preserve">In the following analysis, I examine the climate change belief network for a quota-based sample of the US public. Next, I briefly describe several drivers of the public’s views on climate change.</w:t>
       </w:r>
     </w:p>
     <w:bookmarkEnd w:id="10"/>
@@ -1317,7 +1317,7 @@
         <w:pStyle w:val="FirstParagraph"/>
       </w:pPr>
       <w:r>
-        <w:t xml:space="preserve">Even as climate scientists agree that climate change is happening, is anthropogenic, and poses significant risks, opinions are divided on each of those questions among some elites and some of the public. Several factors have been shown to influence beliefs about climate change among the public, including deep core beliefs such as partisanship, ideology, cultural worldviews, environmental attitudes, as well as policy core beliefs, including views about the scientific consensus, and secondary beliefs associated with aversions to the solutions presented to address climate change.</w:t>
+        <w:t xml:space="preserve">Even as climate scientists agree that climate change is happening, is anthropogenic, and poses significant risks, opinions are divided on each of those questions among some elites and some of the public. Several factors have been shown to influence beliefs about climate change among the public, including deep core beliefs such as partisanship, ideology, cultural worldviews, and environmental attitudes, as well as policy core beliefs, including views about the scientific consensus, and secondary beliefs associated with aversions to the solutions presented to address climate change.</w:t>
       </w:r>
     </w:p>
     <w:p>
@@ -1363,7 +1363,7 @@
         <w:t xml:space="preserve"> </w:t>
       </w:r>
       <w:r>
-        <w:t xml:space="preserve">that shape how they view the natural environment and the risks posed to it: egalitarians tend to see nature as fragile, individualists as robust, hierarchs as tolerant within carefully managed limits, and fatalists as random and unmanageable</w:t>
+        <w:t xml:space="preserve">that shape how they view the natural environment and the risks posed to it – egalitarians tend to see nature as fragile, individualists as robust, hierarchs as tolerant within carefully managed limits, and fatalists as random and unmanageable</w:t>
       </w:r>
       <w:r>
         <w:t xml:space="preserve"> </w:t>
@@ -1434,7 +1434,7 @@
         <w:t xml:space="preserve">(Dunlap et al. 2000, 427)</w:t>
       </w:r>
       <w:r>
-        <w:t xml:space="preserve">. Using the NEP scale, a pro-environmental orientation is associated with concerns about the robustness of nature and the impacts of human activities on the natural world. Previous research has found that a pro-environmental orientation, as measured by the NEP scale, is associated with views about climate change</w:t>
+        <w:t xml:space="preserve">. A pro-environmental orientation, as measured by the NEP scale, is associated with concerns about the robustness of nature and the impacts of human activities on the natural world. Previous research has found that a pro-environmental orientation, as measured by the NEP scale, is associated with views about climate change</w:t>
       </w:r>
       <w:r>
         <w:t xml:space="preserve"> </w:t>
@@ -1472,7 +1472,7 @@
         <w:t xml:space="preserve">(Goldberg et al. 2019; S. L. van der Linden et al. 2015; S. van der Linden, Leiserowitz, and Maibach 2019)</w:t>
       </w:r>
       <w:r>
-        <w:t xml:space="preserve">. Using experimental research designs, scholars have found that those exposed to a message about the scientific consensus were more likely than those not exposed to a consensus message to change their beliefs regarding climate change (i.e., it’s happening, it’s anthropogenic, and it’s a risk) as well as increase their support for public action</w:t>
+        <w:t xml:space="preserve">. Using experimental research designs, scholars have found that those exposed to a message about the scientific consensus were more likely than those not exposed to a consensus message to change their beliefs regarding climate change (i.e., it is happening, it is anthropogenic, and it is a risk) as well as increase their support for public action</w:t>
       </w:r>
       <w:r>
         <w:t xml:space="preserve"> </w:t>
@@ -1498,7 +1498,10 @@
         <w:t xml:space="preserve">(Campbell and Kay 2014)</w:t>
       </w:r>
       <w:r>
-        <w:t xml:space="preserve">: because Republicans/conservatives are generally more skeptical than Democrats/liberals of government’s ability to address societal problems, and climate discourse centers on government action, framing climate change as requiring government solutions is likely to trigger skepticism about the solution that broadens into skepticism about the underlying problem. In essence, the solution aversion hypothesis posits that secondary beliefs and/or policy preferences drive broader views of policy issues – evidenced by the finding that the debate over the Kyoto Protocol polarized views about climate change itself</w:t>
+        <w:t xml:space="preserve"> </w:t>
+      </w:r>
+      <w:r>
+        <w:t xml:space="preserve">– because Republicans/conservatives are generally more skeptical than Democrats/liberals of government’s ability to address societal problems, and climate discourse centers on government action, framing climate change as requiring government solutions is likely to trigger skepticism about the solution that broadens into skepticism about the underlying problem. In essence, the solution aversion hypothesis posits that secondary beliefs and/or policy preferences drive broader views of policy issues – evidenced by the finding that the debate over the Kyoto Protocol polarized views about climate change itself</w:t>
       </w:r>
       <w:r>
         <w:t xml:space="preserve"> </w:t>
@@ -1560,7 +1563,7 @@
         <w:t xml:space="preserve">(Lind, Morton, and Dalege 2024)</w:t>
       </w:r>
       <w:r>
-        <w:t xml:space="preserve">. While these studies provide important insights into the climate change belief system of various publics, they did not include measures of many deep core beliefs shown to be important influences of climate change beliefs, including cultural worldviews and environmental orientation.</w:t>
+        <w:t xml:space="preserve">. While these studies provide important insights into the climate change belief system of various publics, they did not include measures of many deep core beliefs shown to be important influences of climate change beliefs, including cultural worldviews and environmental orientation. Additionally, they only measure an undirected network, and do not compare results between an undirected and directed network.</w:t>
       </w:r>
     </w:p>
     <w:bookmarkStart w:id="11" w:name="theoretical-expectations"/>
@@ -1577,7 +1580,7 @@
         <w:pStyle w:val="FirstParagraph"/>
       </w:pPr>
       <w:r>
-        <w:t xml:space="preserve">Previous research points to several distinct expectations about which types of beliefs should be most structurally central in a climate change belief network, though, to my knowledge, these expectations have not been examined with measures of cultural worldviews, environmental orientation, and climate policy preferences within a single network. A hierarchical view of belief systems holds that deep core beliefs – cultural worldviews, political ideology, and pro-environmental orientation – shape and constrain other beliefs, and so should likely occupy the most central positions in the network. Work on the gateway belief model instead points to perceived scientific consensus, which is theorized to serve as a causal entry point that shifts downstream climate beliefs. A third possibility, grounded in solution aversion, is that beliefs about specific policy approaches are most central, because resistance to a policy solution can influence how the underlying problem itself is perceived. These three accounts also guided which beliefs were selected for inclusion in the network – deep core beliefs, perceived scientific consensus, and climate policy preferences – rather than functioning solely as competing predictions about centrality. The following analysis examines centrality across all three types of beliefs simultaneously, asking which beliefs, and which types of beliefs, occupy the most structurally important positions in the network, and whether that varies depending on how centrality is measured. For example, betweenness and closeness centrality, which capture a belief’s role in bridging and quickly reaching other beliefs in the network, most directly reflect the kind of constraining, foundational role a hierarchical account attributes to deep core beliefs. Strength centrality, which reflects the number and magnitude of a belief’s direct connections, more directly reflects the pattern a solution-aversion account would predict for policy preferences as both deep core and policy core are likely to be connected to preferences. In the next section, I discuss the data and measurements used to explore the climate change belief network.</w:t>
+        <w:t xml:space="preserve">Previous research points to several distinct expectations about which types of beliefs should be most structurally central in a climate change belief network, though, to my knowledge, these expectations have not been examined with measures of cultural worldviews, environmental orientation, and climate policy preferences within a single network. A hierarchical view of belief systems holds that deep core beliefs – cultural worldviews, political ideology, and pro-environmental orientation – shape and constrain other beliefs, and so should likely occupy the most central positions in the network. Work on the gateway belief model instead points to perceived scientific consensus, which has been found to be associated with downstream climate beliefs. A third possibility, grounded in solution aversion, is that beliefs about specific policy approaches are most central, because resistance to a policy solution can influence how the underlying problem itself is perceived. The following analysis examines centrality across all three types of beliefs simultaneously, asking which beliefs, and which types of beliefs, occupy the most structurally important positions in the network, and whether that varies depending on how centrality is measured. For example, betweenness and closeness centrality, which capture a belief’s role in bridging and quickly reaching other beliefs in the network, most directly reflect the kind of constraining, foundational role a hierarchical account attributes to deep core beliefs. Strength centrality, which reflects the number and magnitude of a belief’s direct connections, more directly reflects the pattern a solution-aversion account would predict for policy preferences as both deep core and policy core are likely to be connected to preferences. In the next section, I discuss the data and measurements used to explore the climate change belief network.</w:t>
       </w:r>
     </w:p>
     <w:bookmarkEnd w:id="11"/>
@@ -1596,7 +1599,7 @@
         <w:pStyle w:val="FirstParagraph"/>
       </w:pPr>
       <w:r>
-        <w:t xml:space="preserve">To examine the belief system network around climate change, I use original public survey data collected in October 2017 from a quota-based sample (age, gender, race/ethnicity, drawn from the US Census) of about 1200 US residents, obtained through Survey Sampling International (SSI, now Dynata) and administered online through Qualtrics. Respondents were asked about their views on climate change, support for climate policies, agreement with New Ecological Paradigm (NEP) statements, cultural worldview based on cultural theory, and their ideological and partisan attachments.</w:t>
+        <w:t xml:space="preserve">To examine the belief system network around climate change, I use original public survey data collected in October 2017 from a quota-based sample (age, gender, race/ethnicity, drawn from the US Census) of 1,129 US residents with complete data on the belief measures used in the network, obtained through Survey Sampling International (SSI, now Dynata) and administered online through Qualtrics. Respondents were asked about their views on climate change, support for climate policies, agreement with New Ecological Paradigm (NEP) statements, cultural worldview based on cultural theory, and their ideological and partisan attachments.</w:t>
       </w:r>
       <w:r>
         <w:rPr>
@@ -1628,7 +1631,7 @@
         <w:t xml:space="preserve">Lee et al. (2024)</w:t>
       </w:r>
       <w:r>
-        <w:t xml:space="preserve">, who find that the structure of the climate change belief network is largely consistent over time, particularly among Republicans and Democrats. It remains an open question, however, whether more recent shifts in polarization and climate discourse have altered the network’s structure, and future research should replicate this analysis with more recent data to test whether the patterns reported here are enduring.</w:t>
+        <w:t xml:space="preserve">, who found that the structure of the climate change belief network is largely consistent over time, particularly among Republicans and Democrats. It remains an open question, however, whether more recent shifts in polarization and climate discourse have altered the network’s structure, and future research should replicate this analysis with more recent data to test whether the general patterns reported here remain.</w:t>
       </w:r>
     </w:p>
     <w:bookmarkStart w:id="16" w:name="belief-measures"/>
@@ -1645,7 +1648,7 @@
         <w:pStyle w:val="FirstParagraph"/>
       </w:pPr>
       <w:r>
-        <w:t xml:space="preserve">Cultural theory, political ideology, partisanship, and the NEP scale were used to measure respondents’ deep core beliefs; beliefs about whether climate change is happening, its risk, and the scientific consensus measured policy core beliefs; and support for several climate policy approaches measured secondary beliefs. These measures were selected using the three theoretical anchors described above: cultural theory, ideology, partisanship, and the NEP scale operationalize the deep core beliefs a hierarchical account points to; perceived scientific consensus operationalizes the gateway belief model’s causal entry point; and the climate policy measures operationalize the secondary beliefs a solution-aversion account points to. I describe each of the measures below.</w:t>
+        <w:t xml:space="preserve">Cultural theory, political ideology, partisanship, and the NEP scale were used to measure respondents’ deep core beliefs; beliefs about whether climate change is happening, its risk, and the scientific consensus measured policy core beliefs; and support for several climate policy approaches measured secondary beliefs. These measures were selected using the three theoretical anchors described above, as cultural theory, ideology, partisanship, and the NEP scale operationalize the deep core beliefs a hierarchical account points to; perceived scientific consensus operationalizes the gateway belief model’s causal entry point; and the climate policy measures operationalize the secondary beliefs a solution-aversion account points to. I describe each of the measures below.</w:t>
       </w:r>
       <w:r>
         <w:rPr>
@@ -1685,7 +1688,7 @@
         <w:pStyle w:val="BodyText"/>
       </w:pPr>
       <w:r>
-        <w:t xml:space="preserve">For analysis, I combined and averaged the three statements into a 1 to 7 scale for each worldview, with higher scores indicating greater agreement with the statements associated with that cultural type. Each scale showed sufficient reliability: hierarchy (</w:t>
+        <w:t xml:space="preserve">For analysis, I combined and averaged the three statements into a 1 to 7 scale for each worldview, with higher scores indicating greater agreement with the statements associated with that cultural type. Each scale showed sufficient reliability – hierarchy (</w:t>
       </w:r>
       <w:r>
         <w:rPr>
@@ -2000,7 +2003,7 @@
         <w:pStyle w:val="BodyText"/>
       </w:pPr>
       <w:r>
-        <w:t xml:space="preserve">For the policy core belief measures related to climate change, I examined whether respondents believe that climate change is happening (yes or no), and how sure they are that it is/is not happening (0 = Not at all sure, 1 = Somewhat sure, 2 = Very sure, 3 = Extremely sure). The questions, stated below, were combined into a nine-point scale with -4 indicating that respondents are</w:t>
+        <w:t xml:space="preserve">For the policy core belief measures related to climate change, I examined whether respondents believe that climate change is happening (yes or no), and how sure they are that it is/is not happening (0 = Not at all sure, 1 = Somewhat sure, 2 = Very sure, 3 = Extremely sure). The questions, stated below, were combined into a nine-point scale ranging from -4, indicating that respondents are</w:t>
       </w:r>
       <w:r>
         <w:t xml:space="preserve"> </w:t>
@@ -2032,7 +2035,7 @@
         <w:t xml:space="preserve"> </w:t>
       </w:r>
       <w:r>
-        <w:t xml:space="preserve">happening to 4 indicating that respondents are</w:t>
+        <w:t xml:space="preserve">happening, to 4, indicating that respondents are</w:t>
       </w:r>
       <w:r>
         <w:t xml:space="preserve"> </w:t>
@@ -2091,6 +2094,9 @@
           <w:iCs/>
         </w:rPr>
         <w:t xml:space="preserve">M</w:t>
+      </w:r>
+      <w:r>
+        <w:t xml:space="preserve"> </w:t>
       </w:r>
       <w:r>
         <w:t xml:space="preserve">= 2.37, and a</w:t>
@@ -2404,7 +2410,7 @@
         <w:t xml:space="preserve">(Epskamp et al. 2012; Epskamp and Fried 2023)</w:t>
       </w:r>
       <w:r>
-        <w:t xml:space="preserve">, calculating betweenness, closeness, and strength centrality through a bootstrapping procedure using 1000 resamples, which yields the estimated centrality and 95% confidence interval for each measure</w:t>
+        <w:t xml:space="preserve">, calculating betweenness, closeness, and strength centrality through a bootstrapping procedure using 1,000 resamples, which provides the estimated centrality and 95% confidence interval for each measure</w:t>
       </w:r>
       <w:r>
         <w:t xml:space="preserve"> </w:t>
@@ -2421,7 +2427,7 @@
         <w:pStyle w:val="BodyText"/>
       </w:pPr>
       <w:r>
-        <w:t xml:space="preserve">The GGM is an undirected model: it estimates whether two beliefs are conditionally related but not the direction of that relationship, the standard approach in exploratory belief-network research where strong a priori commitments about causal precedence are typically unavailable</w:t>
+        <w:t xml:space="preserve">The GGM is an undirected model. It estimates whether two beliefs are conditionally related but not the direction of that relationship, which is the standard approach in exploratory belief-network research where there typically are not strong prior expectations regarding belief causality</w:t>
       </w:r>
       <w:r>
         <w:t xml:space="preserve"> </w:t>
@@ -2451,7 +2457,7 @@
         <w:t xml:space="preserve">(Koller and Friedman 2010; Pearl 2014)</w:t>
       </w:r>
       <w:r>
-        <w:t xml:space="preserve">, offering a way to assess whether a belief occupies an upstream position relative to others – the pattern a hierarchical account would predict for deep core beliefs in particular. I learn the network structure using hill-climbing, tabu search, and constraint-based (PC) algorithms, each optimized via BIC or conditional independence testing</w:t>
+        <w:t xml:space="preserve">, offering a way to assess whether a belief occupies an upstream position relative to others, which is the pattern a hierarchical account would predict for deep core beliefs in particular. I learn the network structure using hill-climbing, tabu search, and constraint-based (PC) algorithms, each optimized via BIC or conditional independence testing</w:t>
       </w:r>
       <w:r>
         <w:t xml:space="preserve"> </w:t>
@@ -2691,7 +2697,7 @@
         </w:r>
       </w:hyperlink>
       <w:r>
-        <w:t xml:space="preserve">, the cultural worldview, political belief, and policy preference measures each cluster together (with the exception of nuclear energy), and the NEP scale clusters with the policy core measures; deep core beliefs are associated with climate beliefs, and both are associated with support for climate policies, as expected. The strongest associations are between partisanship and ideology, between the belief that climate change is happening and both scientific-consensus beliefs and risk perceptions, among the policy measures (particularly renewable energy and geoengineering), and among the cultural worldviews (hierarchy with individualism, egalitarianism with fatalism). After visualizing the network, I next examine various centrality measures within it; results from the bootstrap procedure, including 95% confidence intervals, are shown in</w:t>
+        <w:t xml:space="preserve">, the cultural worldview, political belief, and policy preference measures each cluster together (with the exception of nuclear energy), and the NEP scale clusters with the policy core measures; deep core beliefs are associated with climate beliefs, and both are associated with support for climate policies. The strongest associations are between partisanship and ideology, between the belief that climate change is happening and both scientific-consensus beliefs and risk perceptions, among the policy measures (particularly renewable energy and geoengineering), and among the cultural worldviews (hierarchy with individualism, egalitarianism with fatalism). I next examine the various centrality measures, and the results from the bootstrap procedure, including 95% confidence intervals, are shown in</w:t>
       </w:r>
       <w:r>
         <w:t xml:space="preserve"> </w:t>
@@ -2806,7 +2812,7 @@
         </w:r>
       </w:hyperlink>
       <w:r>
-        <w:t xml:space="preserve">, egalitarianism has the highest point estimate, with 61.89, followed by climate change risk perceptions (41.19), fatalism (40.11), individualism (35.62), and support for an international agreement (23.67). Nodes high in betweenness sit on the shortest path between other nodes in the network and act as a bridge between beliefs, so egalitarianism works to connect beliefs in the network. To assess whether these point estimates reflect statistically reliable rank differences, I conducted pairwise bootstrap difference tests for all 136 possible node pairs on each centrality measure</w:t>
+        <w:t xml:space="preserve">, egalitarianism has the highest point estimate, with 61.89, followed by climate change risk perceptions (41.19), fatalism (40.11), individualism (35.62), and support for an international agreement (23.67). Nodes high in betweenness sit on the shortest paths between other nodes in the network and act as a bridge between beliefs, so egalitarianism works to connect beliefs in the network. To assess whether these point estimates are significantly different, I conducted pairwise bootstrap difference tests for all 136 possible node pairs on each centrality measure</w:t>
       </w:r>
       <w:r>
         <w:t xml:space="preserve"> </w:t>
@@ -2815,7 +2821,7 @@
         <w:t xml:space="preserve">(see Epskamp and Fried 2023)</w:t>
       </w:r>
       <w:r>
-        <w:t xml:space="preserve">. For betweenness, only 31 of the 136 comparisons were significant overall, and none of the 10 comparisons among these five top-ranked nodes reached significance. Egalitarianism’s rank as most central on betweenness is therefore a point estimate rather than a statistically significant difference from climate change risk, fatalism, individualism, or support for an international agreement. A case-dropping bootstrap further shows betweenness has a correlation stability (CS) coefficient of 0.52, meeting the 0.50 threshold Epskamp et al.</w:t>
+        <w:t xml:space="preserve">. For betweenness, only 31 of the 136 comparisons were significant overall, and none of the 10 comparisons among these five top-ranked nodes reached significance. A case-dropping bootstrap further shows betweenness has a correlation stability (CS) coefficient of 0.52, meeting the 0.50 threshold Epskamp et al.</w:t>
       </w:r>
       <w:r>
         <w:t xml:space="preserve"> </w:t>
@@ -2835,7 +2841,7 @@
         <w:pStyle w:val="BodyText"/>
       </w:pPr>
       <w:r>
-        <w:t xml:space="preserve">Egalitarianism also has the highest closeness centrality, with 0.00558, followed by support for an international agreement (0.00516), a carbon tax (0.00507), fatalism (0.00506), and climate change risk (0.00499). Beliefs high in closeness are more closely connected to other nodes, giving them shorter, more direct paths to the rest of the network. As with betweenness, most of these ranks are not statistically distinguishable: only 1 of the 10 comparisons among the top five closeness nodes reached significance. Egalitarianism’s closeness centrality was significantly higher only than fatalism’s, and not significantly different from that of support for an international agreement, a carbon tax, or climate change risk. Closeness did show a higher overall rate of significant differences than the other two measures (54 of 136 pairs), suggesting closeness centrality is more reliably differentiated across beliefs even though the top-ranked cluster itself remains largely indistinguishable. Closeness also showed a stable CS coefficient of 0.75.</w:t>
+        <w:t xml:space="preserve">Egalitarianism also has the highest closeness centrality, with 0.00558, followed by support for an international agreement (0.00516), a carbon tax (0.00507), fatalism (0.00506), and climate change risk (0.00499). Beliefs high in closeness are more closely connected to other nodes, giving them shorter, more direct paths to the rest of the network. As with betweenness, most of these ranks are not significantly different, as only 1 of the 10 comparisons among the top five closeness nodes reached significance. Egalitarianism’s closeness centrality was significantly higher only than fatalism’s, and not significantly different from that of support for an international agreement, a carbon tax, or climate change risk. Closeness did show a higher overall rate of significant differences than betweenness, though a lower rate than strength (54 of 136 pairs for closeness, compared to 31 of 136 for betweenness and 82 of 136 for strength, reported below), suggesting closeness centrality is more reliably differentiated across beliefs than betweenness is, though still less so than strength. Closeness also showed a stable CS coefficient of 0.75.</w:t>
       </w:r>
     </w:p>
     <w:p>
@@ -2895,7 +2901,7 @@
         <w:t xml:space="preserve"> </w:t>
       </w:r>
       <w:r>
-        <w:t xml:space="preserve">= 0.099). Support for an international agreement was likewise most strongly correlated with the other policy support measures, including EPA regulations (0.28), a carbon tax (0.216), cap-and-trade (0.172), and geoengineering (0.138), as well as climate change risk (0.127) and egalitarianism (0.104). Climate change risk, in turn, was most highly correlated with the other policy core beliefs, including whether climate change is happening and whether there is a scientific consensus on it. These rankings should also be read cautiously as 82 of 136 pairwise comparisons were significant for strength overall, but only 1 of 10 comparisons among the top five nodes reached significance. The strength ranking of EPA regulations, climate change risk, and support for an international agreement should be read with the same caution. Strength’s CS coefficient is 0.75, also exceeding the 0.50 stability threshold. The reported network is robust more broadly: re-estimating across a range of EBIC tuning values (gamma = 0 to 1) shows non-zero edges ranging from 79 to 105, but the node with the highest point-estimated strength, betweenness, and closeness centrality is unchanged at every value tested, and a cross-validation-selected network (the</w:t>
+        <w:t xml:space="preserve">= 0.099). Support for an international agreement was likewise most strongly correlated with the other policy support measures, including EPA regulations (0.28), a carbon tax (0.216), cap-and-trade (0.172), and geoengineering (0.138), as well as climate change risk (0.127) and egalitarianism (0.104). Climate change risk perception was most highly correlated with the other policy core beliefs, including whether climate change is happening and whether there is a scientific consensus. These rankings should also be read cautiously as 82 of 136 pairwise comparisons were significant for strength overall, but only 1 of 10 comparisons among the top five nodes reached significance. The strength ranking of EPA regulations, climate change risk, and support for an international agreement should be read with the same caution. Strength’s CS coefficient is 0.75, also exceeding the 0.50 stability threshold. The reported network is robust more broadly, as re-estimating across a range of EBIC tuning values (gamma = 0 to 1) shows non-zero edges ranging from 79 to 105, but the node with the highest point-estimated strength, betweenness, and closeness centrality is unchanged at every value tested, and a cross-validation-selected network (the</w:t>
       </w:r>
       <w:r>
         <w:t xml:space="preserve"> </w:t>
@@ -3062,7 +3068,7 @@
         <w:t xml:space="preserve"> </w:t>
       </w:r>
       <w:r>
-        <w:t xml:space="preserve">shows that the network seems to move downward in layers rather than outward from a single node. This is an ordering estimated from arc direction, not a claim about the deep core/policy core/secondary hierarchy described above; however, this estimated layering places several secondary beliefs above deep core beliefs, inverting rather than confirming that theoretical hierarchy. Of note, other secondary beliefs, including support for a carbon tax, cap-and-trade, EPA regulations, renewable energy, and geoengineering sit just below support for an international agreement. Several of the secondary beliefs are in turn upstream of climate change risk, which sends arcs to four other nodes, including political ideology and the belief that climate change is happening. Egalitarianism, by contrast, occupies a comparatively peripheral position in the Bayesian network, as it receives a single arc, from EPA regulations, and sends a single arc, to fatalism. Perceived scientific consensus sits at the bottom of the graph as well, receiving arcs from climate change risk and the belief that climate change is happening but sending none of its own, a result similar to its low centrality in the undirected GGM.</w:t>
+        <w:t xml:space="preserve">shows that the network seems to move downward in layers rather than outward from a single node. This is an ordering estimated from arc direction, not strong evidence of a belief system hierarchy; however, this estimated layering does place several secondary beliefs above deep core beliefs. Of note, other secondary beliefs, including support for a carbon tax, cap-and-trade, EPA regulations, renewable energy, and geoengineering, sit just below support for an international agreement. Several of the secondary beliefs are in turn upstream of climate change risk, which sends arcs to four other nodes, including political ideology and the belief that climate change is happening. Egalitarianism, by contrast, occupies a comparatively peripheral position in the Bayesian network, as it receives a single arc, from cap-and-trade, and sends a single arc, to fatalism. Perceived scientific consensus sits at the bottom of the graph as well, receiving arcs from climate change risk and the belief that climate change is happening but sending none of its own, a result similar to its low centrality in the undirected GGM.</w:t>
       </w:r>
     </w:p>
     <w:p>
@@ -3108,7 +3114,7 @@
         <w:t xml:space="preserve">risk</w:t>
       </w:r>
       <w:r>
-        <w:t xml:space="preserve">) also rank highly on both GGM centrality and BN out-degree/Markov blanket size, indicating that their structural importance is likely not an artifact of either model. Egalitarianism, by contrast, had the highest betweenness and closeness centrality in the GGM, yet it ranks well outside the top nodes on every BN measure. Ideology and partisanship rank low on nearly every measure in both models as well: ideology’s highest GGM rank is 7th (on betweenness and strength), and partisanship never rises above 13th on any GGM measure, while partisanship also has the smallest Markov blanket and no outgoing arcs in the BN.</w:t>
+        <w:t xml:space="preserve">) also rank highly on both GGM centrality and BN out-degree/Markov blanket size, indicating that their structural importance is likely not an artifact of either model. Egalitarianism, by contrast, had the highest betweenness and closeness centrality in the GGM, yet it ranks well outside the top nodes on every BN measure. Ideology and partisanship rank low on nearly every measure in both models as well, as ideology’s highest GGM rank is 7th (on betweenness and strength), and partisanship never rises above 13th on any GGM measure, while partisanship also has among the smallest Markov blankets and no outgoing arcs in the BN.</w:t>
       </w:r>
     </w:p>
     <w:tbl>
@@ -5104,7 +5110,7 @@
         <w:pStyle w:val="BodyText"/>
       </w:pPr>
       <w:r>
-        <w:t xml:space="preserve">Examining climate beliefs as a network allows an understanding of which beliefs are structurally important, rather than as a way to test specific hypotheses. The results showed that individualism, support for an international agreement, and perceived climate risk each occupy central positions on at least one measure of centrality across the undirected and directed networks. This pattern is broadly consistent with theoretical accounts that emphasize deep core beliefs and policy-specific solution aversion as organizing features of belief systems. At the same time, the pairwise comparisons show that many of these point-estimate differences are not statistically distinguishable from one another. For example, egalitarianism’s betweenness centrality is not significantly different from that of individualism, fatalism, perceived risk, or support for an international agreement. Structural importance in the climate change belief network is therefore likely concentrated among a cluster of beliefs spanning multiple theoretical categories, rather than residing in any single belief or type of belief. The cluster of beliefs that are central in both the GGM and the Bayesian network includes individualism (</w:t>
+        <w:t xml:space="preserve">Examining climate beliefs as a network allows an understanding of which beliefs are structurally important, rather than as a way to test specific hypotheses. The results showed that individualism, support for an international agreement, and perceived climate risk each occupy central positions on at least one measure of centrality across the undirected and directed networks. This pattern is broadly consistent with theoretical accounts that emphasize deep core beliefs and policy-specific solution aversion as organizing features of belief systems. At the same time, the pairwise comparisons show that many of these point-estimate differences are not statistically different from one another. For example, egalitarianism’s betweenness centrality is not distinct from that of individualism, fatalism, perceived risk, or support for an international agreement. Structural importance in the climate change belief network is therefore likely concentrated among a cluster of beliefs spanning multiple theoretical categories, rather than residing in any single belief or type of belief. The cluster of beliefs that are central in both the GGM and the Bayesian network includes individualism (</w:t>
       </w:r>
       <w:r>
         <w:rPr>
@@ -5139,7 +5145,7 @@
         <w:pStyle w:val="BodyText"/>
       </w:pPr>
       <w:r>
-        <w:t xml:space="preserve">The results of the GGM also showed that centrality differed across measures, with egalitarianism ranking highest on betweenness and closeness, and EPA regulations ranking highest on strength, with climate risk and support for an international agreement close behind on both. Taken on its own, this is consistent with a hierarchical account for egalitarianism, a deep core belief acting as a bridge that connects and constrains other beliefs – but the strength-centrality prominence of secondary beliefs like EPA regulations and support for an international agreement does not fit a hierarchical account, which would place such beliefs on the periphery, and instead fits a solution-aversion account, in which opposition to policy solutions shapes perceptions of the underlying problem</w:t>
+        <w:t xml:space="preserve">The results of the GGM also showed that centrality differed across measures, with egalitarianism ranking highest on betweenness and closeness, and EPA regulations ranking highest on strength. Climate risk and support for an international agreement were close behind on both. Taken on its own, this is consistent with a hierarchical account for egalitarianism, a deep core belief acting as a bridge that connects and constrains other beliefs. However, the strength-centrality prominence of secondary beliefs like EPA regulations and support for an international agreement does not fit a hierarchical account, which would place such beliefs on the periphery, and instead fits a solution-aversion account, in which opposition to policy solutions shapes perceptions of the underlying problem</w:t>
       </w:r>
       <w:r>
         <w:t xml:space="preserve"> </w:t>
@@ -5148,7 +5154,7 @@
         <w:t xml:space="preserve">(Campbell and Kay 2014)</w:t>
       </w:r>
       <w:r>
-        <w:t xml:space="preserve">. The Bayesian network complicates the egalitarianism reading further and only partly corroborates the solution-aversion reading. In the BN, egalitarianism has neither a high out-degree nor a large Markov blanket, so it does not occupy an upstream position; its GGM betweenness centrality more likely reflects its role bridging the cluster of cultural worldview items than the directional, constraining role a hierarchical account attributes to deep core beliefs. A stronger challenge to a hierarchical reading comes from support for an international climate agreement, a secondary/policy-level belief with the highest out-degree of any node and, tied with perceived climate risk, the largest Markov blanket – a more upstream estimated position than every deep core and policy core belief, including egalitarianism. EPA regulations’ own directed-network position, by contrast, is comparatively modest (out-degree = 2, Markov blanket size = 4), so its GGM strength-centrality prominence is more evident in the undirected than the directed model, and a hierarchical account offers no obvious explanation for why a specific climate policy preference would occupy the most upstream position in the directed network. At the same time, individualism and perceived climate risk are prominent by both approaches, so the evidence does not simply favor a network account over a hierarchical one; whether a given belief’s position is consistent with a hierarchical account appears to depend on the specific belief and the specific model used to estimate it, not on a general property of hierarchical versus network structure. Future research should use panel data or explicit causal-identification designs to test whether these estimated positions reflect actual causal precedence, and to clarify when a directed or undirected framework is more appropriate.</w:t>
+        <w:t xml:space="preserve">. The Bayesian network complicates the egalitarianism reading further and only partly corroborates the solution-aversion reading. In the BN, egalitarianism has neither a high out-degree nor a large Markov blanket, so it does not occupy an upstream position. Its GGM betweenness centrality more likely reflects its role bridging the cluster of cultural worldview items than the directional, constraining role a hierarchical account attributes to deep core beliefs. A stronger challenge to a hierarchical structure comes from support for an international climate agreement, a secondary belief with the highest out-degree of any node and, tied with perceived climate risk, the largest Markov blanket. EPA regulations’ own directed-network position, by contrast, is comparatively modest (out-degree = 2, Markov blanket size = 4), so its GGM strength-centrality prominence is more evident in the undirected than the directed model, and it is not clear how a hierarchical account would explain why a specific climate policy preference would occupy the most upstream position in the directed network. At the same time, individualism and perceived climate risk are prominent by both approaches, so the evidence does not simply favor a network account over a hierarchical one. Whether a given belief’s position is consistent with a hierarchical account appears to depend on the specific belief and the specific model used to estimate it, not on a general property of hierarchical versus network structure. Future research should use panel data or explicit causal-identification designs to test whether these estimated positions reflect actual causal precedence, and to clarify when a directed or undirected framework is more appropriate.</w:t>
       </w:r>
     </w:p>
     <w:p>
@@ -5156,7 +5162,7 @@
         <w:pStyle w:val="BodyText"/>
       </w:pPr>
       <w:r>
-        <w:t xml:space="preserve">As noted earlier, this analysis examined a belief network built around a single issue, climate change – a scope choice with implications for deep core beliefs specifically. Prior belief network research spanning multiple policy issues has found ideology and partisanship to be highly central</w:t>
+        <w:t xml:space="preserve">This analysis examined a belief network built around a single issue, climate change, which may have implications for the structural importance of deep core beliefs. Prior belief network research spanning multiple policy issues has found ideology and partisanship to be highly central</w:t>
       </w:r>
       <w:r>
         <w:t xml:space="preserve"> </w:t>
@@ -5165,7 +5171,7 @@
         <w:t xml:space="preserve">(Boutyline and Vaisey 2017; Brandt, Sibley, and Osborne 2019)</w:t>
       </w:r>
       <w:r>
-        <w:t xml:space="preserve">, but as reported above, neither ranks among the most central beliefs on any measure here, likely because a single issue gives these deep core beliefs less organizing work to do than issue-specific beliefs can do instead. This pattern is not uniform across every deep core belief, however: individualism, and to a lesser extent egalitarianism, remain prominently central despite the single-issue scope, so which deep core belief is doing the organizing – a cultural worldview versus a political identity – may matter as much as how many issues a network spans. This also suggests a hierarchical account may be better suited to multi-issue belief systems than to single-issue ones like this one, though that remains an empirical question for future research.</w:t>
+        <w:t xml:space="preserve">, but as reported above, neither ranks among the most central beliefs on any measure here. These results may reflect the fact that deep core beliefs provide organization across multiple issues rather than within single issues. However, the ideology/partisanship finding is not uniform across every deep core belief, as individualism, and to a lesser extent egalitarianism, remain prominently central despite the single-issue scope. Therefore, which deep core belief is doing the organizing – a cultural worldview versus a political identity – may matter as much as how many issues a network spans. This also suggests a hierarchical account may be better suited to multi-issue belief systems than to a single-issue one like this one, though that remains an empirical question for future research.</w:t>
       </w:r>
     </w:p>
     <w:p>
@@ -5173,7 +5179,7 @@
         <w:pStyle w:val="BodyText"/>
       </w:pPr>
       <w:r>
-        <w:t xml:space="preserve">Another theoretical anchor used in this paper was the gateway belief model, where agreement with the scientific consensus about climate change informs other climate beliefs. However, neither type of network indicated structural importance for the consensus belief. The implication of this finding deserves a careful interpretation. The gateway belief model is a causal, interventional framework. It is typically tested using experimental or longitudinal designs that trace how exposure to a consensus message shifts later beliefs</w:t>
+        <w:t xml:space="preserve">Another theoretical anchor used in this paper was the gateway belief model, where agreement with the scientific consensus about climate change informs other climate beliefs. However, neither type of network indicated structural importance for the consensus belief. Yet, this finding does not mean that beliefs about the scientific consensus are unimportant. The gateway belief model is a causal, interventional framework. It is typically tested using experimental or longitudinal designs that trace how exposure to a consensus message shifts other beliefs</w:t>
       </w:r>
       <w:r>
         <w:t xml:space="preserve"> </w:t>
@@ -5203,7 +5209,7 @@
         <w:t xml:space="preserve">(Göbel et al. 2026)</w:t>
       </w:r>
       <w:r>
-        <w:t xml:space="preserve">. The low centrality of scientific consensus in the network analysis, then, does not contradict the gateway belief model. It is likely, instead, that consensus beliefs are not structurally embedded at the core of the broader climate belief system, even though they can still function as effective causal mechanisms under targeted informational interventions. This conclusion is reinforced by the Bayesian network, where perceived scientific consensus sits at the bottom of the estimated graph, sending no arcs of its own and receiving arcs only from climate risk and the belief that climate change is happening, which is similar to the peripheral position it occupies in the undirected model. Future research should combine network and experimental approaches to better understand the structural and causal accounts of the gateway belief model.</w:t>
+        <w:t xml:space="preserve">. The low centrality of scientific consensus in the network analysis does not contradict the gateway belief model. It is likely that consensus beliefs are not structurally embedded at the core of the broader climate belief system, even though they can still function as effective causal mechanisms under targeted informational interventions. The positioning of the consensus belief is reinforced by the Bayesian network, where perceived scientific consensus sits at the bottom of the estimated graph, sending no arcs of its own and receiving arcs only from climate risk and the belief that climate change is happening. One implication of this finding is that consensus messaging campaigns may be better understood as targeted causal interventions than as efforts to shift a structurally central belief. Future research should combine network and experimental approaches to better understand the structural and causal accounts of the gateway belief model.</w:t>
       </w:r>
     </w:p>
     <w:p>
@@ -5240,15 +5246,7 @@
         <w:pStyle w:val="BodyText"/>
       </w:pPr>
       <w:r>
-        <w:t xml:space="preserve">These findings speak to scholars, most notably those doing policy process research, who have largely relied on a hierarchical conception of belief systems with deep core beliefs constraining policy core and secondary beliefs. The results here suggest a network approach offers analytic leverage the hierarchical framework alone may not capture: structural importance in the climate change belief network does not track the deep core/policy core/secondary ordering a hierarchical account predicts, with individualism, perceived climate risk, and support for an international agreement robustly central regardless of whether the network is modeled as undirected or directed, and support for an international agreement occupying the most upstream position of any node in the directed network. Rather than replacing the hierarchical approach, these results suggest policy process scholars would benefit from treating belief systems as networks alongside it, particularly when the goal is to identify which beliefs are most structurally consequential rather than assuming that answer from belief type alone – with the caveat, noted above, that hierarchy may still be the more apt starting point for the multi-issue belief systems much of policy process research traditionally examines. Doing so also means pairing undirected and directed operationalizations, since the directed model missed egalitarianism’s bridging role, while the undirected model has no way to express the kind of upstream, directional position support for an international agreement holds in the directed model.</w:t>
-      </w:r>
-    </w:p>
-    <w:p>
-      <w:pPr>
-        <w:pStyle w:val="BodyText"/>
-      </w:pPr>
-      <w:r>
-        <w:t xml:space="preserve">For climate communication and public opinion research, the finding that perceived scientific consensus is not structurally central, together with the reframing of the gateway belief model discussed above, suggests that consensus messaging campaigns may be better understood as targeted causal interventions than as efforts to shift a structurally central belief. This distinction could have direct implications for how such campaigns are designed and evaluated.</w:t>
+        <w:t xml:space="preserve">Overall, these findings speak to scholars, most notably those doing policy process research, who have largely relied on a hierarchical conception of belief systems with deep core beliefs constraining policy core and secondary beliefs. The results here suggest a network approach offers analytic leverage the hierarchical framework alone may not capture. As noted, the structural importance in the climate change belief network does not track the deep core/policy core/secondary ordering a hierarchical account predicts, with individualism, perceived climate risk, and support for an international agreement robustly central regardless of whether the network is modeled as undirected or directed. Additionally, support for an international agreement occupied the most upstream position of any node in the directed network. Rather than replacing the hierarchical approach, these results suggest scholars would benefit from treating belief systems as networks alongside it, particularly when the goal is to identify which beliefs are most structurally consequential rather than assuming that answer from belief type alone. Doing so also means pairing undirected and directed operationalizations, since the directed model missed egalitarianism’s bridging role, while the undirected model has no way to express the kind of upstream, directional position support for an international agreement holds in the directed model.</w:t>
       </w:r>
     </w:p>
     <w:p>
@@ -13461,7 +13459,7 @@
         <w:t xml:space="preserve"> </w:t>
       </w:r>
       <w:r>
-        <w:t xml:space="preserve">This study was not preregistered, and no a priori power analysis was conducted. The bootstrap correlation-stability coefficients reported in the Results section, all at or above the 0.50 threshold Epskamp et al.</w:t>
+        <w:t xml:space="preserve">This study was not preregistered, and no a priori power analysis was conducted. The bootstrap correlation-stability coefficients are all at or above the 0.50 threshold Epskamp et al.</w:t>
       </w:r>
       <w:r>
         <w:t xml:space="preserve"> </w:t>
@@ -13473,7 +13471,7 @@
         <w:t xml:space="preserve"> </w:t>
       </w:r>
       <w:r>
-        <w:t xml:space="preserve">recommend, serve as a post hoc check that the sample size supports stable centrality estimates. The data and analysis code are organized in a version-controlled GitHub repository (hidden until publication), including the survey data, all analysis scripts, and the manuscript source, with package versions pinned via</w:t>
+        <w:t xml:space="preserve">recommend, which serves as a post hoc check that the sample size supports stable centrality estimates. The data and analysis code are organized in a version-controlled GitHub repository (available upon publication), including the survey data, all analysis scripts, and the manuscript source, with package versions pinned via</w:t>
       </w:r>
       <w:r>
         <w:t xml:space="preserve"> </w:t>

</xml_diff>